<commit_message>
added recording from mic, transcribing from voice to text
</commit_message>
<xml_diff>
--- a/README.md.docx
+++ b/README.md.docx
@@ -4,6 +4,9 @@
   <w:body>
     <w:p>
       <w:r>
+        <w:rPr>
+          <w:noProof/>
+        </w:rPr>
         <w:drawing>
           <wp:inline distT="0" distB="0" distL="0" distR="0" wp14:anchorId="7D6B6A45" wp14:editId="1CD8C9B0">
             <wp:extent cx="5544324" cy="5391902"/>
@@ -20,7 +23,7 @@
                     <pic:cNvPicPr/>
                   </pic:nvPicPr>
                   <pic:blipFill>
-                    <a:blip r:embed="rId4"/>
+                    <a:blip r:embed="rId5"/>
                     <a:stretch>
                       <a:fillRect/>
                     </a:stretch>
@@ -41,6 +44,4162 @@
         </w:drawing>
       </w:r>
     </w:p>
+    <w:p/>
+    <w:p>
+      <w:r>
+        <w:rPr>
+          <w:b/>
+          <w:bCs/>
+        </w:rPr>
+        <w:t>Create Google Calendar agent</w:t>
+      </w:r>
+      <w:r>
+        <w:t xml:space="preserve">: </w:t>
+      </w:r>
+    </w:p>
+    <w:p>
+      <w:r>
+        <w:t>This agent</w:t>
+      </w:r>
+      <w:r>
+        <w:t xml:space="preserve"> will </w:t>
+      </w:r>
+      <w:r>
+        <w:t xml:space="preserve">do: </w:t>
+      </w:r>
+    </w:p>
+    <w:p>
+      <w:pPr>
+        <w:pStyle w:val="ListParagraph"/>
+        <w:numPr>
+          <w:ilvl w:val="0"/>
+          <w:numId w:val="1"/>
+        </w:numPr>
+      </w:pPr>
+      <w:r>
+        <w:t>B</w:t>
+      </w:r>
+      <w:r>
+        <w:t>ring the event</w:t>
+      </w:r>
+      <w:r>
+        <w:t xml:space="preserve"> – any current and future events (a week ahead)</w:t>
+      </w:r>
+    </w:p>
+    <w:p>
+      <w:pPr>
+        <w:pStyle w:val="ListParagraph"/>
+        <w:numPr>
+          <w:ilvl w:val="0"/>
+          <w:numId w:val="1"/>
+        </w:numPr>
+      </w:pPr>
+      <w:r>
+        <w:t>R</w:t>
+      </w:r>
+      <w:r>
+        <w:t>ead the event content</w:t>
+      </w:r>
+      <w:r>
+        <w:t xml:space="preserve"> +</w:t>
+      </w:r>
+      <w:r>
+        <w:t xml:space="preserve"> summarize it</w:t>
+      </w:r>
+    </w:p>
+    <w:p>
+      <w:pPr>
+        <w:pStyle w:val="ListParagraph"/>
+        <w:numPr>
+          <w:ilvl w:val="0"/>
+          <w:numId w:val="1"/>
+        </w:numPr>
+      </w:pPr>
+      <w:r>
+        <w:t xml:space="preserve">Send </w:t>
+      </w:r>
+      <w:r>
+        <w:t>event</w:t>
+      </w:r>
+      <w:r>
+        <w:t xml:space="preserve"> name, data, </w:t>
+      </w:r>
+      <w:r>
+        <w:t xml:space="preserve">content </w:t>
+      </w:r>
+      <w:r>
+        <w:t xml:space="preserve">as </w:t>
+      </w:r>
+      <w:proofErr w:type="spellStart"/>
+      <w:r>
+        <w:t>whatsapp</w:t>
+      </w:r>
+      <w:proofErr w:type="spellEnd"/>
+      <w:r>
+        <w:t xml:space="preserve"> message to </w:t>
+      </w:r>
+      <w:proofErr w:type="spellStart"/>
+      <w:r>
+        <w:t>whatsapp</w:t>
+      </w:r>
+      <w:proofErr w:type="spellEnd"/>
+      <w:r>
+        <w:t xml:space="preserve"> app (to </w:t>
+      </w:r>
+      <w:proofErr w:type="spellStart"/>
+      <w:r>
+        <w:t>Twillio</w:t>
+      </w:r>
+      <w:proofErr w:type="spellEnd"/>
+      <w:r>
+        <w:t xml:space="preserve"> content)</w:t>
+      </w:r>
+    </w:p>
+    <w:p/>
+    <w:p>
+      <w:r>
+        <w:t xml:space="preserve">Prior to all this we need to do: </w:t>
+      </w:r>
+    </w:p>
+    <w:p>
+      <w:pPr>
+        <w:pStyle w:val="ListParagraph"/>
+        <w:numPr>
+          <w:ilvl w:val="0"/>
+          <w:numId w:val="2"/>
+        </w:numPr>
+      </w:pPr>
+      <w:r>
+        <w:rPr>
+          <w:b/>
+          <w:bCs/>
+          <w:color w:val="3333FF"/>
+        </w:rPr>
+        <w:t xml:space="preserve">Step 1: </w:t>
+      </w:r>
+      <w:r>
+        <w:rPr>
+          <w:b/>
+          <w:bCs/>
+          <w:color w:val="3333FF"/>
+        </w:rPr>
+        <w:t>Register my app</w:t>
+      </w:r>
+      <w:r>
+        <w:rPr>
+          <w:b/>
+          <w:bCs/>
+          <w:color w:val="3333FF"/>
+        </w:rPr>
+        <w:t xml:space="preserve"> (project)</w:t>
+      </w:r>
+      <w:r>
+        <w:rPr>
+          <w:b/>
+          <w:bCs/>
+          <w:color w:val="3333FF"/>
+        </w:rPr>
+        <w:t xml:space="preserve"> at Google Cloud</w:t>
+      </w:r>
+      <w:r>
+        <w:rPr>
+          <w:color w:val="3333FF"/>
+        </w:rPr>
+        <w:t xml:space="preserve"> </w:t>
+      </w:r>
+      <w:r>
+        <w:t xml:space="preserve">– register my application </w:t>
+      </w:r>
+      <w:r>
+        <w:t xml:space="preserve">(project) </w:t>
+      </w:r>
+      <w:r>
+        <w:t>at the Google Cloud so Google Cloud will know my app and will give it an access to Google Calendar</w:t>
+      </w:r>
+    </w:p>
+    <w:p>
+      <w:pPr>
+        <w:pStyle w:val="ListParagraph"/>
+        <w:numPr>
+          <w:ilvl w:val="1"/>
+          <w:numId w:val="2"/>
+        </w:numPr>
+      </w:pPr>
+      <w:r>
+        <w:lastRenderedPageBreak/>
+        <w:t>Go to</w:t>
+      </w:r>
+      <w:r>
+        <w:t xml:space="preserve"> link: </w:t>
+      </w:r>
+      <w:hyperlink r:id="rId6" w:history="1">
+        <w:r>
+          <w:rPr>
+            <w:rStyle w:val="Hyperlink"/>
+            <w:color w:val="3333FF"/>
+          </w:rPr>
+          <w:t>https://console.cloud.google.com/welcome/new</w:t>
+        </w:r>
+      </w:hyperlink>
+      <w:r>
+        <w:rPr>
+          <w:color w:val="3333FF"/>
+        </w:rPr>
+        <w:br/>
+      </w:r>
+    </w:p>
+    <w:p>
+      <w:pPr>
+        <w:pStyle w:val="ListParagraph"/>
+        <w:ind w:left="1440"/>
+      </w:pPr>
+      <w:r>
+        <w:rPr>
+          <w:noProof/>
+        </w:rPr>
+        <w:drawing>
+          <wp:inline distT="0" distB="0" distL="0" distR="0" wp14:anchorId="582D14DC" wp14:editId="54860F17">
+            <wp:extent cx="2581635" cy="266737"/>
+            <wp:effectExtent l="0" t="0" r="9525" b="0"/>
+            <wp:docPr id="1085687155" name="Picture 1"/>
+            <wp:cNvGraphicFramePr>
+              <a:graphicFrameLocks xmlns:a="http://schemas.openxmlformats.org/drawingml/2006/main" noChangeAspect="1"/>
+            </wp:cNvGraphicFramePr>
+            <a:graphic xmlns:a="http://schemas.openxmlformats.org/drawingml/2006/main">
+              <a:graphicData uri="http://schemas.openxmlformats.org/drawingml/2006/picture">
+                <pic:pic xmlns:pic="http://schemas.openxmlformats.org/drawingml/2006/picture">
+                  <pic:nvPicPr>
+                    <pic:cNvPr id="1085687155" name=""/>
+                    <pic:cNvPicPr/>
+                  </pic:nvPicPr>
+                  <pic:blipFill>
+                    <a:blip r:embed="rId7"/>
+                    <a:stretch>
+                      <a:fillRect/>
+                    </a:stretch>
+                  </pic:blipFill>
+                  <pic:spPr>
+                    <a:xfrm>
+                      <a:off x="0" y="0"/>
+                      <a:ext cx="2581635" cy="266737"/>
+                    </a:xfrm>
+                    <a:prstGeom prst="rect">
+                      <a:avLst/>
+                    </a:prstGeom>
+                  </pic:spPr>
+                </pic:pic>
+              </a:graphicData>
+            </a:graphic>
+          </wp:inline>
+        </w:drawing>
+      </w:r>
+    </w:p>
+    <w:p>
+      <w:pPr>
+        <w:pStyle w:val="ListParagraph"/>
+      </w:pPr>
+    </w:p>
+    <w:p>
+      <w:pPr>
+        <w:pStyle w:val="ListParagraph"/>
+        <w:numPr>
+          <w:ilvl w:val="1"/>
+          <w:numId w:val="2"/>
+        </w:numPr>
+      </w:pPr>
+      <w:r>
+        <w:t>Click on</w:t>
+      </w:r>
+      <w:r>
+        <w:t xml:space="preserve"> button:</w:t>
+      </w:r>
+      <w:r>
+        <w:t xml:space="preserve"> </w:t>
+      </w:r>
+      <w:r>
+        <w:rPr>
+          <w:color w:val="3333FF"/>
+        </w:rPr>
+        <w:t>“</w:t>
+      </w:r>
+      <w:r>
+        <w:rPr>
+          <w:color w:val="3333FF"/>
+        </w:rPr>
+        <w:t>Select a project”</w:t>
+      </w:r>
+      <w:r>
+        <w:rPr>
+          <w:color w:val="3333FF"/>
+        </w:rPr>
+        <w:br/>
+      </w:r>
+      <w:r>
+        <w:rPr>
+          <w:noProof/>
+          <w:color w:val="3333FF"/>
+        </w:rPr>
+        <w:drawing>
+          <wp:inline distT="0" distB="0" distL="0" distR="0" wp14:anchorId="375886F1" wp14:editId="5A3D8AA4">
+            <wp:extent cx="3105583" cy="495369"/>
+            <wp:effectExtent l="0" t="0" r="0" b="0"/>
+            <wp:docPr id="1677006345" name="Picture 1"/>
+            <wp:cNvGraphicFramePr>
+              <a:graphicFrameLocks xmlns:a="http://schemas.openxmlformats.org/drawingml/2006/main" noChangeAspect="1"/>
+            </wp:cNvGraphicFramePr>
+            <a:graphic xmlns:a="http://schemas.openxmlformats.org/drawingml/2006/main">
+              <a:graphicData uri="http://schemas.openxmlformats.org/drawingml/2006/picture">
+                <pic:pic xmlns:pic="http://schemas.openxmlformats.org/drawingml/2006/picture">
+                  <pic:nvPicPr>
+                    <pic:cNvPr id="1677006345" name=""/>
+                    <pic:cNvPicPr/>
+                  </pic:nvPicPr>
+                  <pic:blipFill>
+                    <a:blip r:embed="rId8"/>
+                    <a:stretch>
+                      <a:fillRect/>
+                    </a:stretch>
+                  </pic:blipFill>
+                  <pic:spPr>
+                    <a:xfrm>
+                      <a:off x="0" y="0"/>
+                      <a:ext cx="3105583" cy="495369"/>
+                    </a:xfrm>
+                    <a:prstGeom prst="rect">
+                      <a:avLst/>
+                    </a:prstGeom>
+                  </pic:spPr>
+                </pic:pic>
+              </a:graphicData>
+            </a:graphic>
+          </wp:inline>
+        </w:drawing>
+      </w:r>
+      <w:r>
+        <w:rPr>
+          <w:color w:val="3333FF"/>
+        </w:rPr>
+        <w:br/>
+      </w:r>
+    </w:p>
+    <w:p>
+      <w:pPr>
+        <w:pStyle w:val="ListParagraph"/>
+        <w:numPr>
+          <w:ilvl w:val="1"/>
+          <w:numId w:val="2"/>
+        </w:numPr>
+      </w:pPr>
+      <w:r>
+        <w:t xml:space="preserve">Click on </w:t>
+      </w:r>
+      <w:r>
+        <w:rPr>
+          <w:color w:val="3333FF"/>
+        </w:rPr>
+        <w:t xml:space="preserve">“New project” </w:t>
+      </w:r>
+    </w:p>
+    <w:p>
+      <w:r>
+        <w:rPr>
+          <w:noProof/>
+        </w:rPr>
+        <w:drawing>
+          <wp:inline distT="0" distB="0" distL="0" distR="0" wp14:anchorId="0DDC18CE" wp14:editId="187A6366">
+            <wp:extent cx="5102860" cy="1372870"/>
+            <wp:effectExtent l="0" t="0" r="2540" b="0"/>
+            <wp:docPr id="421799780" name="Picture 1"/>
+            <wp:cNvGraphicFramePr>
+              <a:graphicFrameLocks xmlns:a="http://schemas.openxmlformats.org/drawingml/2006/main" noChangeAspect="1"/>
+            </wp:cNvGraphicFramePr>
+            <a:graphic xmlns:a="http://schemas.openxmlformats.org/drawingml/2006/main">
+              <a:graphicData uri="http://schemas.openxmlformats.org/drawingml/2006/picture">
+                <pic:pic xmlns:pic="http://schemas.openxmlformats.org/drawingml/2006/picture">
+                  <pic:nvPicPr>
+                    <pic:cNvPr id="421799780" name=""/>
+                    <pic:cNvPicPr/>
+                  </pic:nvPicPr>
+                  <pic:blipFill>
+                    <a:blip r:embed="rId9"/>
+                    <a:stretch>
+                      <a:fillRect/>
+                    </a:stretch>
+                  </pic:blipFill>
+                  <pic:spPr>
+                    <a:xfrm>
+                      <a:off x="0" y="0"/>
+                      <a:ext cx="5102860" cy="1372870"/>
+                    </a:xfrm>
+                    <a:prstGeom prst="rect">
+                      <a:avLst/>
+                    </a:prstGeom>
+                  </pic:spPr>
+                </pic:pic>
+              </a:graphicData>
+            </a:graphic>
+          </wp:inline>
+        </w:drawing>
+      </w:r>
+    </w:p>
+    <w:p>
+      <w:pPr>
+        <w:pStyle w:val="ListParagraph"/>
+        <w:numPr>
+          <w:ilvl w:val="1"/>
+          <w:numId w:val="2"/>
+        </w:numPr>
+      </w:pPr>
+      <w:r>
+        <w:t xml:space="preserve">Give it a name: </w:t>
+      </w:r>
+      <w:proofErr w:type="spellStart"/>
+      <w:r>
+        <w:rPr>
+          <w:b/>
+          <w:bCs/>
+          <w:color w:val="3333FF"/>
+        </w:rPr>
+        <w:t>CalendarChecker</w:t>
+      </w:r>
+      <w:proofErr w:type="spellEnd"/>
+    </w:p>
+    <w:p>
+      <w:pPr>
+        <w:pStyle w:val="ListParagraph"/>
+        <w:numPr>
+          <w:ilvl w:val="1"/>
+          <w:numId w:val="2"/>
+        </w:numPr>
+      </w:pPr>
+      <w:r>
+        <w:t>Click on button</w:t>
+      </w:r>
+      <w:r>
+        <w:rPr>
+          <w:color w:val="3333FF"/>
+        </w:rPr>
+        <w:t xml:space="preserve"> “Create” </w:t>
+      </w:r>
+    </w:p>
+    <w:p>
+      <w:pPr>
+        <w:pStyle w:val="ListParagraph"/>
+        <w:ind w:left="1440"/>
+      </w:pPr>
+      <w:r>
+        <w:rPr>
+          <w:noProof/>
+        </w:rPr>
+        <w:drawing>
+          <wp:inline distT="0" distB="0" distL="0" distR="0" wp14:anchorId="6EACDA4E" wp14:editId="783FC922">
+            <wp:extent cx="3867690" cy="1352739"/>
+            <wp:effectExtent l="0" t="0" r="0" b="0"/>
+            <wp:docPr id="197255748" name="Picture 1"/>
+            <wp:cNvGraphicFramePr>
+              <a:graphicFrameLocks xmlns:a="http://schemas.openxmlformats.org/drawingml/2006/main" noChangeAspect="1"/>
+            </wp:cNvGraphicFramePr>
+            <a:graphic xmlns:a="http://schemas.openxmlformats.org/drawingml/2006/main">
+              <a:graphicData uri="http://schemas.openxmlformats.org/drawingml/2006/picture">
+                <pic:pic xmlns:pic="http://schemas.openxmlformats.org/drawingml/2006/picture">
+                  <pic:nvPicPr>
+                    <pic:cNvPr id="197255748" name=""/>
+                    <pic:cNvPicPr/>
+                  </pic:nvPicPr>
+                  <pic:blipFill>
+                    <a:blip r:embed="rId10"/>
+                    <a:stretch>
+                      <a:fillRect/>
+                    </a:stretch>
+                  </pic:blipFill>
+                  <pic:spPr>
+                    <a:xfrm>
+                      <a:off x="0" y="0"/>
+                      <a:ext cx="3867690" cy="1352739"/>
+                    </a:xfrm>
+                    <a:prstGeom prst="rect">
+                      <a:avLst/>
+                    </a:prstGeom>
+                  </pic:spPr>
+                </pic:pic>
+              </a:graphicData>
+            </a:graphic>
+          </wp:inline>
+        </w:drawing>
+      </w:r>
+    </w:p>
+    <w:p>
+      <w:pPr>
+        <w:pStyle w:val="ListParagraph"/>
+        <w:ind w:left="1440"/>
+      </w:pPr>
+    </w:p>
+    <w:p>
+      <w:pPr>
+        <w:pStyle w:val="ListParagraph"/>
+        <w:numPr>
+          <w:ilvl w:val="1"/>
+          <w:numId w:val="2"/>
+        </w:numPr>
+      </w:pPr>
+      <w:r>
+        <w:t xml:space="preserve">Click on button: </w:t>
+      </w:r>
+      <w:r>
+        <w:rPr>
+          <w:color w:val="3333FF"/>
+        </w:rPr>
+        <w:t xml:space="preserve">“Select Project”  </w:t>
+      </w:r>
+    </w:p>
+    <w:p>
+      <w:pPr>
+        <w:pStyle w:val="ListParagraph"/>
+      </w:pPr>
+      <w:r>
+        <w:rPr>
+          <w:noProof/>
+        </w:rPr>
+        <w:drawing>
+          <wp:inline distT="0" distB="0" distL="0" distR="0" wp14:anchorId="3DA7A8E8" wp14:editId="3118D313">
+            <wp:extent cx="5731510" cy="2874010"/>
+            <wp:effectExtent l="0" t="0" r="2540" b="2540"/>
+            <wp:docPr id="965196133" name="Picture 1"/>
+            <wp:cNvGraphicFramePr>
+              <a:graphicFrameLocks xmlns:a="http://schemas.openxmlformats.org/drawingml/2006/main" noChangeAspect="1"/>
+            </wp:cNvGraphicFramePr>
+            <a:graphic xmlns:a="http://schemas.openxmlformats.org/drawingml/2006/main">
+              <a:graphicData uri="http://schemas.openxmlformats.org/drawingml/2006/picture">
+                <pic:pic xmlns:pic="http://schemas.openxmlformats.org/drawingml/2006/picture">
+                  <pic:nvPicPr>
+                    <pic:cNvPr id="965196133" name=""/>
+                    <pic:cNvPicPr/>
+                  </pic:nvPicPr>
+                  <pic:blipFill>
+                    <a:blip r:embed="rId11"/>
+                    <a:stretch>
+                      <a:fillRect/>
+                    </a:stretch>
+                  </pic:blipFill>
+                  <pic:spPr>
+                    <a:xfrm>
+                      <a:off x="0" y="0"/>
+                      <a:ext cx="5731510" cy="2874010"/>
+                    </a:xfrm>
+                    <a:prstGeom prst="rect">
+                      <a:avLst/>
+                    </a:prstGeom>
+                  </pic:spPr>
+                </pic:pic>
+              </a:graphicData>
+            </a:graphic>
+          </wp:inline>
+        </w:drawing>
+      </w:r>
+    </w:p>
+    <w:p>
+      <w:pPr>
+        <w:pStyle w:val="ListParagraph"/>
+      </w:pPr>
+      <w:r>
+        <w:rPr>
+          <w:noProof/>
+        </w:rPr>
+        <w:lastRenderedPageBreak/>
+        <w:drawing>
+          <wp:inline distT="0" distB="0" distL="0" distR="0" wp14:anchorId="26D2B805" wp14:editId="7CEA4DB0">
+            <wp:extent cx="3620005" cy="1019317"/>
+            <wp:effectExtent l="0" t="0" r="0" b="9525"/>
+            <wp:docPr id="417806852" name="Picture 1"/>
+            <wp:cNvGraphicFramePr>
+              <a:graphicFrameLocks xmlns:a="http://schemas.openxmlformats.org/drawingml/2006/main" noChangeAspect="1"/>
+            </wp:cNvGraphicFramePr>
+            <a:graphic xmlns:a="http://schemas.openxmlformats.org/drawingml/2006/main">
+              <a:graphicData uri="http://schemas.openxmlformats.org/drawingml/2006/picture">
+                <pic:pic xmlns:pic="http://schemas.openxmlformats.org/drawingml/2006/picture">
+                  <pic:nvPicPr>
+                    <pic:cNvPr id="417806852" name=""/>
+                    <pic:cNvPicPr/>
+                  </pic:nvPicPr>
+                  <pic:blipFill>
+                    <a:blip r:embed="rId12"/>
+                    <a:stretch>
+                      <a:fillRect/>
+                    </a:stretch>
+                  </pic:blipFill>
+                  <pic:spPr>
+                    <a:xfrm>
+                      <a:off x="0" y="0"/>
+                      <a:ext cx="3620005" cy="1019317"/>
+                    </a:xfrm>
+                    <a:prstGeom prst="rect">
+                      <a:avLst/>
+                    </a:prstGeom>
+                  </pic:spPr>
+                </pic:pic>
+              </a:graphicData>
+            </a:graphic>
+          </wp:inline>
+        </w:drawing>
+      </w:r>
+    </w:p>
+    <w:p>
+      <w:r>
+        <w:tab/>
+      </w:r>
+      <w:proofErr w:type="gramStart"/>
+      <w:r>
+        <w:t>Registration  -</w:t>
+      </w:r>
+      <w:proofErr w:type="gramEnd"/>
+      <w:r>
+        <w:t xml:space="preserve"> Done!</w:t>
+      </w:r>
+    </w:p>
+    <w:p/>
+    <w:p>
+      <w:pPr>
+        <w:pStyle w:val="ListParagraph"/>
+        <w:numPr>
+          <w:ilvl w:val="0"/>
+          <w:numId w:val="2"/>
+        </w:numPr>
+      </w:pPr>
+      <w:r>
+        <w:rPr>
+          <w:b/>
+          <w:bCs/>
+          <w:color w:val="3333FF"/>
+        </w:rPr>
+        <w:t xml:space="preserve">Step – 2:  </w:t>
+      </w:r>
+      <w:r>
+        <w:rPr>
+          <w:b/>
+          <w:bCs/>
+          <w:color w:val="3333FF"/>
+        </w:rPr>
+        <w:t xml:space="preserve">Enable Google Calendar API for our application </w:t>
+      </w:r>
+      <w:r>
+        <w:t xml:space="preserve">(project </w:t>
+      </w:r>
+      <w:proofErr w:type="spellStart"/>
+      <w:r>
+        <w:t>CalendarChecker</w:t>
+      </w:r>
+      <w:proofErr w:type="spellEnd"/>
+      <w:r>
+        <w:t xml:space="preserve">) that we just registered </w:t>
+      </w:r>
+    </w:p>
+    <w:p>
+      <w:pPr>
+        <w:pStyle w:val="ListParagraph"/>
+      </w:pPr>
+    </w:p>
+    <w:p>
+      <w:pPr>
+        <w:pStyle w:val="ListParagraph"/>
+        <w:numPr>
+          <w:ilvl w:val="1"/>
+          <w:numId w:val="2"/>
+        </w:numPr>
+      </w:pPr>
+      <w:r>
+        <w:t>Find the APIs</w:t>
+      </w:r>
+      <w:r>
+        <w:t xml:space="preserve"> </w:t>
+      </w:r>
+    </w:p>
+    <w:p>
+      <w:pPr>
+        <w:pStyle w:val="ListParagraph"/>
+        <w:ind w:left="1440"/>
+      </w:pPr>
+      <w:r>
+        <w:rPr>
+          <w:noProof/>
+        </w:rPr>
+        <w:drawing>
+          <wp:inline distT="0" distB="0" distL="0" distR="0" wp14:anchorId="3D6DBC91" wp14:editId="32A2BD43">
+            <wp:extent cx="2310457" cy="3599078"/>
+            <wp:effectExtent l="0" t="0" r="0" b="1905"/>
+            <wp:docPr id="51576871" name="Picture 1"/>
+            <wp:cNvGraphicFramePr>
+              <a:graphicFrameLocks xmlns:a="http://schemas.openxmlformats.org/drawingml/2006/main" noChangeAspect="1"/>
+            </wp:cNvGraphicFramePr>
+            <a:graphic xmlns:a="http://schemas.openxmlformats.org/drawingml/2006/main">
+              <a:graphicData uri="http://schemas.openxmlformats.org/drawingml/2006/picture">
+                <pic:pic xmlns:pic="http://schemas.openxmlformats.org/drawingml/2006/picture">
+                  <pic:nvPicPr>
+                    <pic:cNvPr id="51576871" name=""/>
+                    <pic:cNvPicPr/>
+                  </pic:nvPicPr>
+                  <pic:blipFill>
+                    <a:blip r:embed="rId13"/>
+                    <a:stretch>
+                      <a:fillRect/>
+                    </a:stretch>
+                  </pic:blipFill>
+                  <pic:spPr>
+                    <a:xfrm>
+                      <a:off x="0" y="0"/>
+                      <a:ext cx="2315175" cy="3606428"/>
+                    </a:xfrm>
+                    <a:prstGeom prst="rect">
+                      <a:avLst/>
+                    </a:prstGeom>
+                  </pic:spPr>
+                </pic:pic>
+              </a:graphicData>
+            </a:graphic>
+          </wp:inline>
+        </w:drawing>
+      </w:r>
+      <w:r>
+        <w:br/>
+      </w:r>
+    </w:p>
+    <w:p>
+      <w:pPr>
+        <w:pStyle w:val="ListParagraph"/>
+        <w:numPr>
+          <w:ilvl w:val="1"/>
+          <w:numId w:val="2"/>
+        </w:numPr>
+      </w:pPr>
+      <w:r>
+        <w:rPr>
+          <w:noProof/>
+        </w:rPr>
+        <w:drawing>
+          <wp:anchor distT="0" distB="0" distL="114300" distR="114300" simplePos="0" relativeHeight="251658240" behindDoc="0" locked="0" layoutInCell="1" allowOverlap="1" wp14:anchorId="683B7EE6" wp14:editId="3C6F7F88">
+            <wp:simplePos x="0" y="0"/>
+            <wp:positionH relativeFrom="margin">
+              <wp:align>right</wp:align>
+            </wp:positionH>
+            <wp:positionV relativeFrom="paragraph">
+              <wp:posOffset>384784</wp:posOffset>
+            </wp:positionV>
+            <wp:extent cx="5731510" cy="1289050"/>
+            <wp:effectExtent l="0" t="0" r="2540" b="6350"/>
+            <wp:wrapSquare wrapText="bothSides"/>
+            <wp:docPr id="357648548" name="Picture 1"/>
+            <wp:cNvGraphicFramePr>
+              <a:graphicFrameLocks xmlns:a="http://schemas.openxmlformats.org/drawingml/2006/main" noChangeAspect="1"/>
+            </wp:cNvGraphicFramePr>
+            <a:graphic xmlns:a="http://schemas.openxmlformats.org/drawingml/2006/main">
+              <a:graphicData uri="http://schemas.openxmlformats.org/drawingml/2006/picture">
+                <pic:pic xmlns:pic="http://schemas.openxmlformats.org/drawingml/2006/picture">
+                  <pic:nvPicPr>
+                    <pic:cNvPr id="357648548" name=""/>
+                    <pic:cNvPicPr/>
+                  </pic:nvPicPr>
+                  <pic:blipFill>
+                    <a:blip r:embed="rId14">
+                      <a:extLst>
+                        <a:ext uri="{28A0092B-C50C-407E-A947-70E740481C1C}">
+                          <a14:useLocalDpi xmlns:a14="http://schemas.microsoft.com/office/drawing/2010/main" val="0"/>
+                        </a:ext>
+                      </a:extLst>
+                    </a:blip>
+                    <a:stretch>
+                      <a:fillRect/>
+                    </a:stretch>
+                  </pic:blipFill>
+                  <pic:spPr>
+                    <a:xfrm>
+                      <a:off x="0" y="0"/>
+                      <a:ext cx="5731510" cy="1289050"/>
+                    </a:xfrm>
+                    <a:prstGeom prst="rect">
+                      <a:avLst/>
+                    </a:prstGeom>
+                  </pic:spPr>
+                </pic:pic>
+              </a:graphicData>
+            </a:graphic>
+          </wp:anchor>
+        </w:drawing>
+      </w:r>
+      <w:r>
+        <w:t xml:space="preserve">Click on button: “Search”, write Calendar. Find: </w:t>
+      </w:r>
+      <w:r>
+        <w:rPr>
+          <w:b/>
+          <w:bCs/>
+          <w:color w:val="3333FF"/>
+        </w:rPr>
+        <w:t>“Google Calendar API”</w:t>
+      </w:r>
+    </w:p>
+    <w:p>
+      <w:pPr>
+        <w:pStyle w:val="ListParagraph"/>
+        <w:ind w:left="1440"/>
+      </w:pPr>
+    </w:p>
+    <w:p>
+      <w:pPr>
+        <w:pStyle w:val="ListParagraph"/>
+        <w:numPr>
+          <w:ilvl w:val="1"/>
+          <w:numId w:val="2"/>
+        </w:numPr>
+      </w:pPr>
+      <w:r>
+        <w:t xml:space="preserve">Click on: </w:t>
+      </w:r>
+      <w:r>
+        <w:rPr>
+          <w:b/>
+          <w:bCs/>
+          <w:color w:val="3333FF"/>
+        </w:rPr>
+        <w:t>Enable</w:t>
+      </w:r>
+    </w:p>
+    <w:p>
+      <w:pPr>
+        <w:pStyle w:val="ListParagraph"/>
+      </w:pPr>
+      <w:r>
+        <w:lastRenderedPageBreak/>
+        <w:br/>
+      </w:r>
+      <w:r>
+        <w:br/>
+      </w:r>
+      <w:r>
+        <w:rPr>
+          <w:noProof/>
+        </w:rPr>
+        <w:drawing>
+          <wp:inline distT="0" distB="0" distL="0" distR="0" wp14:anchorId="16C27829" wp14:editId="3D888726">
+            <wp:extent cx="2296973" cy="1461710"/>
+            <wp:effectExtent l="0" t="0" r="8255" b="5715"/>
+            <wp:docPr id="59945817" name="Picture 1"/>
+            <wp:cNvGraphicFramePr>
+              <a:graphicFrameLocks xmlns:a="http://schemas.openxmlformats.org/drawingml/2006/main" noChangeAspect="1"/>
+            </wp:cNvGraphicFramePr>
+            <a:graphic xmlns:a="http://schemas.openxmlformats.org/drawingml/2006/main">
+              <a:graphicData uri="http://schemas.openxmlformats.org/drawingml/2006/picture">
+                <pic:pic xmlns:pic="http://schemas.openxmlformats.org/drawingml/2006/picture">
+                  <pic:nvPicPr>
+                    <pic:cNvPr id="59945817" name=""/>
+                    <pic:cNvPicPr/>
+                  </pic:nvPicPr>
+                  <pic:blipFill>
+                    <a:blip r:embed="rId15"/>
+                    <a:stretch>
+                      <a:fillRect/>
+                    </a:stretch>
+                  </pic:blipFill>
+                  <pic:spPr>
+                    <a:xfrm>
+                      <a:off x="0" y="0"/>
+                      <a:ext cx="2312418" cy="1471539"/>
+                    </a:xfrm>
+                    <a:prstGeom prst="rect">
+                      <a:avLst/>
+                    </a:prstGeom>
+                  </pic:spPr>
+                </pic:pic>
+              </a:graphicData>
+            </a:graphic>
+          </wp:inline>
+        </w:drawing>
+      </w:r>
+      <w:r>
+        <w:br/>
+      </w:r>
+    </w:p>
+    <w:p>
+      <w:pPr>
+        <w:pStyle w:val="ListParagraph"/>
+        <w:numPr>
+          <w:ilvl w:val="1"/>
+          <w:numId w:val="2"/>
+        </w:numPr>
+      </w:pPr>
+      <w:r>
+        <w:rPr>
+          <w:noProof/>
+        </w:rPr>
+        <w:drawing>
+          <wp:anchor distT="0" distB="0" distL="114300" distR="114300" simplePos="0" relativeHeight="251659264" behindDoc="0" locked="0" layoutInCell="1" allowOverlap="1" wp14:anchorId="5452C633" wp14:editId="04986B8D">
+            <wp:simplePos x="0" y="0"/>
+            <wp:positionH relativeFrom="margin">
+              <wp:align>right</wp:align>
+            </wp:positionH>
+            <wp:positionV relativeFrom="paragraph">
+              <wp:posOffset>299873</wp:posOffset>
+            </wp:positionV>
+            <wp:extent cx="5731510" cy="2231390"/>
+            <wp:effectExtent l="0" t="0" r="2540" b="0"/>
+            <wp:wrapSquare wrapText="bothSides"/>
+            <wp:docPr id="8044075" name="Picture 1"/>
+            <wp:cNvGraphicFramePr>
+              <a:graphicFrameLocks xmlns:a="http://schemas.openxmlformats.org/drawingml/2006/main" noChangeAspect="1"/>
+            </wp:cNvGraphicFramePr>
+            <a:graphic xmlns:a="http://schemas.openxmlformats.org/drawingml/2006/main">
+              <a:graphicData uri="http://schemas.openxmlformats.org/drawingml/2006/picture">
+                <pic:pic xmlns:pic="http://schemas.openxmlformats.org/drawingml/2006/picture">
+                  <pic:nvPicPr>
+                    <pic:cNvPr id="8044075" name=""/>
+                    <pic:cNvPicPr/>
+                  </pic:nvPicPr>
+                  <pic:blipFill>
+                    <a:blip r:embed="rId16">
+                      <a:extLst>
+                        <a:ext uri="{28A0092B-C50C-407E-A947-70E740481C1C}">
+                          <a14:useLocalDpi xmlns:a14="http://schemas.microsoft.com/office/drawing/2010/main" val="0"/>
+                        </a:ext>
+                      </a:extLst>
+                    </a:blip>
+                    <a:stretch>
+                      <a:fillRect/>
+                    </a:stretch>
+                  </pic:blipFill>
+                  <pic:spPr>
+                    <a:xfrm>
+                      <a:off x="0" y="0"/>
+                      <a:ext cx="5731510" cy="2231390"/>
+                    </a:xfrm>
+                    <a:prstGeom prst="rect">
+                      <a:avLst/>
+                    </a:prstGeom>
+                  </pic:spPr>
+                </pic:pic>
+              </a:graphicData>
+            </a:graphic>
+          </wp:anchor>
+        </w:drawing>
+      </w:r>
+      <w:r>
+        <w:t xml:space="preserve">Enabling of the Google Calendar API – </w:t>
+      </w:r>
+      <w:proofErr w:type="gramStart"/>
+      <w:r>
+        <w:t>Done !!</w:t>
+      </w:r>
+      <w:proofErr w:type="gramEnd"/>
+    </w:p>
+    <w:p>
+      <w:pPr>
+        <w:pStyle w:val="ListParagraph"/>
+        <w:ind w:left="1440"/>
+      </w:pPr>
+    </w:p>
+    <w:p>
+      <w:pPr>
+        <w:ind w:left="1080"/>
+      </w:pPr>
+    </w:p>
+    <w:p>
+      <w:pPr>
+        <w:pStyle w:val="ListParagraph"/>
+        <w:ind w:left="1440"/>
+      </w:pPr>
+    </w:p>
+    <w:p>
+      <w:pPr>
+        <w:pStyle w:val="ListParagraph"/>
+        <w:numPr>
+          <w:ilvl w:val="0"/>
+          <w:numId w:val="2"/>
+        </w:numPr>
+      </w:pPr>
+      <w:r>
+        <w:rPr>
+          <w:b/>
+          <w:bCs/>
+          <w:color w:val="3333FF"/>
+        </w:rPr>
+        <w:t>Step 3: Create the Credentials</w:t>
+      </w:r>
+      <w:r>
+        <w:rPr>
+          <w:color w:val="3333FF"/>
+        </w:rPr>
+        <w:t>:</w:t>
+      </w:r>
+      <w:r>
+        <w:t xml:space="preserve"> </w:t>
+      </w:r>
+    </w:p>
+    <w:p>
+      <w:pPr>
+        <w:pStyle w:val="ListParagraph"/>
+      </w:pPr>
+      <w:r>
+        <w:t>My</w:t>
+      </w:r>
+      <w:r>
+        <w:t xml:space="preserve"> Python code needs a </w:t>
+      </w:r>
+      <w:r>
+        <w:rPr>
+          <w:b/>
+          <w:bCs/>
+          <w:color w:val="3333FF"/>
+        </w:rPr>
+        <w:t>key</w:t>
+      </w:r>
+      <w:r>
+        <w:rPr>
+          <w:color w:val="3333FF"/>
+        </w:rPr>
+        <w:t xml:space="preserve"> </w:t>
+      </w:r>
+      <w:r>
+        <w:t xml:space="preserve">to prove to Google it is authorized to access </w:t>
+      </w:r>
+      <w:r>
+        <w:rPr>
+          <w:b/>
+          <w:bCs/>
+        </w:rPr>
+        <w:t>My Google Calendar</w:t>
+      </w:r>
+    </w:p>
+    <w:p>
+      <w:pPr>
+        <w:pStyle w:val="ListParagraph"/>
+        <w:numPr>
+          <w:ilvl w:val="1"/>
+          <w:numId w:val="2"/>
+        </w:numPr>
+      </w:pPr>
+      <w:r>
+        <w:t xml:space="preserve">Go to Credentials: </w:t>
+      </w:r>
+    </w:p>
+    <w:p>
+      <w:pPr>
+        <w:pStyle w:val="ListParagraph"/>
+        <w:ind w:left="1440"/>
+      </w:pPr>
+      <w:r>
+        <w:rPr>
+          <w:noProof/>
+        </w:rPr>
+        <w:drawing>
+          <wp:inline distT="0" distB="0" distL="0" distR="0" wp14:anchorId="0626BAAC" wp14:editId="16D41B2C">
+            <wp:extent cx="4210638" cy="1047896"/>
+            <wp:effectExtent l="0" t="0" r="0" b="0"/>
+            <wp:docPr id="793446071" name="Picture 1"/>
+            <wp:cNvGraphicFramePr>
+              <a:graphicFrameLocks xmlns:a="http://schemas.openxmlformats.org/drawingml/2006/main" noChangeAspect="1"/>
+            </wp:cNvGraphicFramePr>
+            <a:graphic xmlns:a="http://schemas.openxmlformats.org/drawingml/2006/main">
+              <a:graphicData uri="http://schemas.openxmlformats.org/drawingml/2006/picture">
+                <pic:pic xmlns:pic="http://schemas.openxmlformats.org/drawingml/2006/picture">
+                  <pic:nvPicPr>
+                    <pic:cNvPr id="793446071" name=""/>
+                    <pic:cNvPicPr/>
+                  </pic:nvPicPr>
+                  <pic:blipFill>
+                    <a:blip r:embed="rId17"/>
+                    <a:stretch>
+                      <a:fillRect/>
+                    </a:stretch>
+                  </pic:blipFill>
+                  <pic:spPr>
+                    <a:xfrm>
+                      <a:off x="0" y="0"/>
+                      <a:ext cx="4210638" cy="1047896"/>
+                    </a:xfrm>
+                    <a:prstGeom prst="rect">
+                      <a:avLst/>
+                    </a:prstGeom>
+                  </pic:spPr>
+                </pic:pic>
+              </a:graphicData>
+            </a:graphic>
+          </wp:inline>
+        </w:drawing>
+      </w:r>
+    </w:p>
+    <w:p>
+      <w:pPr>
+        <w:pStyle w:val="ListParagraph"/>
+        <w:ind w:left="1440"/>
+      </w:pPr>
+    </w:p>
+    <w:p>
+      <w:pPr>
+        <w:pStyle w:val="ListParagraph"/>
+        <w:numPr>
+          <w:ilvl w:val="1"/>
+          <w:numId w:val="2"/>
+        </w:numPr>
+      </w:pPr>
+      <w:r>
+        <w:t xml:space="preserve">Click on the “+ Create credentials” </w:t>
+      </w:r>
+    </w:p>
+    <w:p>
+      <w:pPr>
+        <w:pStyle w:val="ListParagraph"/>
+        <w:ind w:left="1440"/>
+      </w:pPr>
+      <w:r>
+        <w:rPr>
+          <w:noProof/>
+        </w:rPr>
+        <w:lastRenderedPageBreak/>
+        <w:drawing>
+          <wp:anchor distT="0" distB="0" distL="114300" distR="114300" simplePos="0" relativeHeight="251660288" behindDoc="0" locked="0" layoutInCell="1" allowOverlap="1" wp14:anchorId="1461DDA2" wp14:editId="67285552">
+            <wp:simplePos x="0" y="0"/>
+            <wp:positionH relativeFrom="margin">
+              <wp:align>right</wp:align>
+            </wp:positionH>
+            <wp:positionV relativeFrom="paragraph">
+              <wp:posOffset>0</wp:posOffset>
+            </wp:positionV>
+            <wp:extent cx="5668166" cy="1505160"/>
+            <wp:effectExtent l="0" t="0" r="8890" b="0"/>
+            <wp:wrapSquare wrapText="bothSides"/>
+            <wp:docPr id="351573065" name="Picture 1"/>
+            <wp:cNvGraphicFramePr>
+              <a:graphicFrameLocks xmlns:a="http://schemas.openxmlformats.org/drawingml/2006/main" noChangeAspect="1"/>
+            </wp:cNvGraphicFramePr>
+            <a:graphic xmlns:a="http://schemas.openxmlformats.org/drawingml/2006/main">
+              <a:graphicData uri="http://schemas.openxmlformats.org/drawingml/2006/picture">
+                <pic:pic xmlns:pic="http://schemas.openxmlformats.org/drawingml/2006/picture">
+                  <pic:nvPicPr>
+                    <pic:cNvPr id="351573065" name=""/>
+                    <pic:cNvPicPr/>
+                  </pic:nvPicPr>
+                  <pic:blipFill>
+                    <a:blip r:embed="rId18">
+                      <a:extLst>
+                        <a:ext uri="{28A0092B-C50C-407E-A947-70E740481C1C}">
+                          <a14:useLocalDpi xmlns:a14="http://schemas.microsoft.com/office/drawing/2010/main" val="0"/>
+                        </a:ext>
+                      </a:extLst>
+                    </a:blip>
+                    <a:stretch>
+                      <a:fillRect/>
+                    </a:stretch>
+                  </pic:blipFill>
+                  <pic:spPr>
+                    <a:xfrm>
+                      <a:off x="0" y="0"/>
+                      <a:ext cx="5668166" cy="1505160"/>
+                    </a:xfrm>
+                    <a:prstGeom prst="rect">
+                      <a:avLst/>
+                    </a:prstGeom>
+                  </pic:spPr>
+                </pic:pic>
+              </a:graphicData>
+            </a:graphic>
+            <wp14:sizeRelH relativeFrom="margin">
+              <wp14:pctWidth>0</wp14:pctWidth>
+            </wp14:sizeRelH>
+            <wp14:sizeRelV relativeFrom="margin">
+              <wp14:pctHeight>0</wp14:pctHeight>
+            </wp14:sizeRelV>
+          </wp:anchor>
+        </w:drawing>
+      </w:r>
+    </w:p>
+    <w:p>
+      <w:pPr>
+        <w:pStyle w:val="ListParagraph"/>
+        <w:numPr>
+          <w:ilvl w:val="1"/>
+          <w:numId w:val="2"/>
+        </w:numPr>
+      </w:pPr>
+      <w:r>
+        <w:t xml:space="preserve">Select: OAuth client ID: </w:t>
+      </w:r>
+    </w:p>
+    <w:p>
+      <w:pPr>
+        <w:pStyle w:val="ListParagraph"/>
+        <w:ind w:left="1080"/>
+      </w:pPr>
+      <w:r>
+        <w:rPr>
+          <w:noProof/>
+        </w:rPr>
+        <w:drawing>
+          <wp:inline distT="0" distB="0" distL="0" distR="0" wp14:anchorId="448CD39F" wp14:editId="4D71BBD4">
+            <wp:extent cx="2435961" cy="1404974"/>
+            <wp:effectExtent l="0" t="0" r="2540" b="5080"/>
+            <wp:docPr id="1669868537" name="Picture 1"/>
+            <wp:cNvGraphicFramePr>
+              <a:graphicFrameLocks xmlns:a="http://schemas.openxmlformats.org/drawingml/2006/main" noChangeAspect="1"/>
+            </wp:cNvGraphicFramePr>
+            <a:graphic xmlns:a="http://schemas.openxmlformats.org/drawingml/2006/main">
+              <a:graphicData uri="http://schemas.openxmlformats.org/drawingml/2006/picture">
+                <pic:pic xmlns:pic="http://schemas.openxmlformats.org/drawingml/2006/picture">
+                  <pic:nvPicPr>
+                    <pic:cNvPr id="1669868537" name=""/>
+                    <pic:cNvPicPr/>
+                  </pic:nvPicPr>
+                  <pic:blipFill>
+                    <a:blip r:embed="rId19"/>
+                    <a:stretch>
+                      <a:fillRect/>
+                    </a:stretch>
+                  </pic:blipFill>
+                  <pic:spPr>
+                    <a:xfrm>
+                      <a:off x="0" y="0"/>
+                      <a:ext cx="2450936" cy="1413611"/>
+                    </a:xfrm>
+                    <a:prstGeom prst="rect">
+                      <a:avLst/>
+                    </a:prstGeom>
+                  </pic:spPr>
+                </pic:pic>
+              </a:graphicData>
+            </a:graphic>
+          </wp:inline>
+        </w:drawing>
+      </w:r>
+    </w:p>
+    <w:p>
+      <w:pPr>
+        <w:pStyle w:val="ListParagraph"/>
+        <w:ind w:left="1440"/>
+      </w:pPr>
+    </w:p>
+    <w:p>
+      <w:pPr>
+        <w:pStyle w:val="ListParagraph"/>
+        <w:ind w:left="1440"/>
+      </w:pPr>
+    </w:p>
+    <w:p>
+      <w:pPr>
+        <w:rPr>
+          <w:b/>
+          <w:bCs/>
+          <w:color w:val="0066FF"/>
+        </w:rPr>
+      </w:pPr>
+      <w:r>
+        <w:rPr>
+          <w:b/>
+          <w:bCs/>
+          <w:color w:val="0066FF"/>
+        </w:rPr>
+        <w:t xml:space="preserve">Creating a tool that will work with Google Calendar </w:t>
+      </w:r>
+    </w:p>
+    <w:p>
+      <w:pPr>
+        <w:rPr>
+          <w:color w:val="000000" w:themeColor="text1"/>
+        </w:rPr>
+      </w:pPr>
+      <w:proofErr w:type="spellStart"/>
+      <w:r>
+        <w:rPr>
+          <w:color w:val="000000" w:themeColor="text1"/>
+        </w:rPr>
+        <w:t>CalendarChecker</w:t>
+      </w:r>
+      <w:proofErr w:type="spellEnd"/>
+      <w:r>
+        <w:rPr>
+          <w:color w:val="000000" w:themeColor="text1"/>
+        </w:rPr>
+        <w:t xml:space="preserve"> tool will do the next: </w:t>
+      </w:r>
+    </w:p>
+    <w:p>
+      <w:pPr>
+        <w:rPr>
+          <w:b/>
+          <w:bCs/>
+          <w:color w:val="0066FF"/>
+        </w:rPr>
+      </w:pPr>
+      <w:r>
+        <w:rPr>
+          <w:b/>
+          <w:bCs/>
+          <w:color w:val="0066FF"/>
+        </w:rPr>
+        <w:drawing>
+          <wp:inline distT="0" distB="0" distL="0" distR="0" wp14:anchorId="5DFD69AC" wp14:editId="5DCBCBEA">
+            <wp:extent cx="5068007" cy="2286319"/>
+            <wp:effectExtent l="0" t="0" r="0" b="0"/>
+            <wp:docPr id="1415195803" name="Picture 1"/>
+            <wp:cNvGraphicFramePr>
+              <a:graphicFrameLocks xmlns:a="http://schemas.openxmlformats.org/drawingml/2006/main" noChangeAspect="1"/>
+            </wp:cNvGraphicFramePr>
+            <a:graphic xmlns:a="http://schemas.openxmlformats.org/drawingml/2006/main">
+              <a:graphicData uri="http://schemas.openxmlformats.org/drawingml/2006/picture">
+                <pic:pic xmlns:pic="http://schemas.openxmlformats.org/drawingml/2006/picture">
+                  <pic:nvPicPr>
+                    <pic:cNvPr id="1415195803" name=""/>
+                    <pic:cNvPicPr/>
+                  </pic:nvPicPr>
+                  <pic:blipFill>
+                    <a:blip r:embed="rId20"/>
+                    <a:stretch>
+                      <a:fillRect/>
+                    </a:stretch>
+                  </pic:blipFill>
+                  <pic:spPr>
+                    <a:xfrm>
+                      <a:off x="0" y="0"/>
+                      <a:ext cx="5068007" cy="2286319"/>
+                    </a:xfrm>
+                    <a:prstGeom prst="rect">
+                      <a:avLst/>
+                    </a:prstGeom>
+                  </pic:spPr>
+                </pic:pic>
+              </a:graphicData>
+            </a:graphic>
+          </wp:inline>
+        </w:drawing>
+      </w:r>
+    </w:p>
+    <w:p>
+      <w:pPr>
+        <w:rPr>
+          <w:b/>
+          <w:bCs/>
+          <w:color w:val="0066FF"/>
+        </w:rPr>
+      </w:pPr>
+    </w:p>
+    <w:p>
+      <w:pPr>
+        <w:pStyle w:val="ListParagraph"/>
+        <w:numPr>
+          <w:ilvl w:val="0"/>
+          <w:numId w:val="5"/>
+        </w:numPr>
+        <w:rPr>
+          <w:b/>
+          <w:bCs/>
+          <w:color w:val="0066FF"/>
+        </w:rPr>
+      </w:pPr>
+      <w:r>
+        <w:rPr>
+          <w:b/>
+          <w:bCs/>
+          <w:color w:val="0066FF"/>
+        </w:rPr>
+        <w:t xml:space="preserve">Step 1: </w:t>
+      </w:r>
+      <w:r>
+        <w:rPr>
+          <w:b/>
+          <w:bCs/>
+          <w:color w:val="0066FF"/>
+        </w:rPr>
+        <w:t xml:space="preserve">Bring </w:t>
+      </w:r>
+      <w:proofErr w:type="spellStart"/>
+      <w:r>
+        <w:rPr>
+          <w:b/>
+          <w:bCs/>
+          <w:color w:val="0066FF"/>
+        </w:rPr>
+        <w:t>Gimini</w:t>
+      </w:r>
+      <w:proofErr w:type="spellEnd"/>
+      <w:r>
+        <w:rPr>
+          <w:b/>
+          <w:bCs/>
+          <w:color w:val="0066FF"/>
+        </w:rPr>
+        <w:t xml:space="preserve"> (Google) AI capabilities</w:t>
+      </w:r>
+      <w:r>
+        <w:rPr>
+          <w:b/>
+          <w:bCs/>
+          <w:color w:val="0066FF"/>
+        </w:rPr>
+        <w:t>:</w:t>
+      </w:r>
+    </w:p>
+    <w:p>
+      <w:pPr>
+        <w:pStyle w:val="ListParagraph"/>
+        <w:numPr>
+          <w:ilvl w:val="1"/>
+          <w:numId w:val="5"/>
+        </w:numPr>
+        <w:rPr>
+          <w:b/>
+          <w:bCs/>
+          <w:color w:val="0066FF"/>
+        </w:rPr>
+      </w:pPr>
+      <w:r>
+        <w:t>Go to AI Studio, register with my Google account, get API key:</w:t>
+      </w:r>
+    </w:p>
+    <w:p>
+      <w:pPr>
+        <w:pStyle w:val="ListParagraph"/>
+        <w:rPr>
+          <w:b/>
+          <w:bCs/>
+          <w:color w:val="0066FF"/>
+        </w:rPr>
+      </w:pPr>
+    </w:p>
+    <w:p>
+      <w:pPr>
+        <w:pStyle w:val="ListParagraph"/>
+        <w:rPr>
+          <w:b/>
+          <w:bCs/>
+          <w:color w:val="0066FF"/>
+        </w:rPr>
+      </w:pPr>
+    </w:p>
+    <w:p>
+      <w:pPr>
+        <w:pStyle w:val="ListParagraph"/>
+        <w:rPr>
+          <w:b/>
+          <w:bCs/>
+          <w:color w:val="0066FF"/>
+        </w:rPr>
+      </w:pPr>
+    </w:p>
+    <w:p>
+      <w:pPr>
+        <w:pStyle w:val="ListParagraph"/>
+        <w:rPr>
+          <w:b/>
+          <w:bCs/>
+          <w:color w:val="0066FF"/>
+        </w:rPr>
+      </w:pPr>
+    </w:p>
+    <w:p>
+      <w:pPr>
+        <w:pStyle w:val="ListParagraph"/>
+        <w:rPr>
+          <w:b/>
+          <w:bCs/>
+          <w:color w:val="0066FF"/>
+        </w:rPr>
+      </w:pPr>
+    </w:p>
+    <w:p>
+      <w:pPr>
+        <w:pStyle w:val="ListParagraph"/>
+        <w:rPr>
+          <w:b/>
+          <w:bCs/>
+          <w:color w:val="0066FF"/>
+        </w:rPr>
+      </w:pPr>
+    </w:p>
+    <w:p>
+      <w:pPr>
+        <w:pStyle w:val="ListParagraph"/>
+        <w:ind w:left="1440"/>
+      </w:pPr>
+      <w:r>
+        <w:drawing>
+          <wp:anchor distT="0" distB="0" distL="114300" distR="114300" simplePos="0" relativeHeight="251661312" behindDoc="0" locked="0" layoutInCell="1" allowOverlap="1" wp14:anchorId="679251D6" wp14:editId="03892D03">
+            <wp:simplePos x="0" y="0"/>
+            <wp:positionH relativeFrom="column">
+              <wp:posOffset>188291</wp:posOffset>
+            </wp:positionH>
+            <wp:positionV relativeFrom="paragraph">
+              <wp:posOffset>311951</wp:posOffset>
+            </wp:positionV>
+            <wp:extent cx="5731510" cy="4054475"/>
+            <wp:effectExtent l="0" t="0" r="2540" b="3175"/>
+            <wp:wrapSquare wrapText="bothSides"/>
+            <wp:docPr id="2077553334" name="Picture 1"/>
+            <wp:cNvGraphicFramePr>
+              <a:graphicFrameLocks xmlns:a="http://schemas.openxmlformats.org/drawingml/2006/main" noChangeAspect="1"/>
+            </wp:cNvGraphicFramePr>
+            <a:graphic xmlns:a="http://schemas.openxmlformats.org/drawingml/2006/main">
+              <a:graphicData uri="http://schemas.openxmlformats.org/drawingml/2006/picture">
+                <pic:pic xmlns:pic="http://schemas.openxmlformats.org/drawingml/2006/picture">
+                  <pic:nvPicPr>
+                    <pic:cNvPr id="2077553334" name=""/>
+                    <pic:cNvPicPr/>
+                  </pic:nvPicPr>
+                  <pic:blipFill>
+                    <a:blip r:embed="rId21">
+                      <a:extLst>
+                        <a:ext uri="{28A0092B-C50C-407E-A947-70E740481C1C}">
+                          <a14:useLocalDpi xmlns:a14="http://schemas.microsoft.com/office/drawing/2010/main" val="0"/>
+                        </a:ext>
+                      </a:extLst>
+                    </a:blip>
+                    <a:stretch>
+                      <a:fillRect/>
+                    </a:stretch>
+                  </pic:blipFill>
+                  <pic:spPr>
+                    <a:xfrm>
+                      <a:off x="0" y="0"/>
+                      <a:ext cx="5731510" cy="4054475"/>
+                    </a:xfrm>
+                    <a:prstGeom prst="rect">
+                      <a:avLst/>
+                    </a:prstGeom>
+                  </pic:spPr>
+                </pic:pic>
+              </a:graphicData>
+            </a:graphic>
+          </wp:anchor>
+        </w:drawing>
+      </w:r>
+    </w:p>
+    <w:p>
+      <w:pPr>
+        <w:pStyle w:val="ListParagraph"/>
+        <w:ind w:left="1080"/>
+      </w:pPr>
+    </w:p>
+    <w:p>
+      <w:pPr>
+        <w:pStyle w:val="ListParagraph"/>
+        <w:numPr>
+          <w:ilvl w:val="0"/>
+          <w:numId w:val="3"/>
+        </w:numPr>
+      </w:pPr>
+      <w:r>
+        <w:drawing>
+          <wp:anchor distT="0" distB="0" distL="114300" distR="114300" simplePos="0" relativeHeight="251662336" behindDoc="0" locked="0" layoutInCell="1" allowOverlap="1" wp14:anchorId="22848BCF" wp14:editId="0242B9D2">
+            <wp:simplePos x="0" y="0"/>
+            <wp:positionH relativeFrom="column">
+              <wp:posOffset>166977</wp:posOffset>
+            </wp:positionH>
+            <wp:positionV relativeFrom="paragraph">
+              <wp:posOffset>301543</wp:posOffset>
+            </wp:positionV>
+            <wp:extent cx="5341620" cy="2397760"/>
+            <wp:effectExtent l="0" t="0" r="0" b="2540"/>
+            <wp:wrapSquare wrapText="bothSides"/>
+            <wp:docPr id="1478323958" name="Picture 1"/>
+            <wp:cNvGraphicFramePr>
+              <a:graphicFrameLocks xmlns:a="http://schemas.openxmlformats.org/drawingml/2006/main" noChangeAspect="1"/>
+            </wp:cNvGraphicFramePr>
+            <a:graphic xmlns:a="http://schemas.openxmlformats.org/drawingml/2006/main">
+              <a:graphicData uri="http://schemas.openxmlformats.org/drawingml/2006/picture">
+                <pic:pic xmlns:pic="http://schemas.openxmlformats.org/drawingml/2006/picture">
+                  <pic:nvPicPr>
+                    <pic:cNvPr id="1478323958" name=""/>
+                    <pic:cNvPicPr/>
+                  </pic:nvPicPr>
+                  <pic:blipFill>
+                    <a:blip r:embed="rId22">
+                      <a:extLst>
+                        <a:ext uri="{28A0092B-C50C-407E-A947-70E740481C1C}">
+                          <a14:useLocalDpi xmlns:a14="http://schemas.microsoft.com/office/drawing/2010/main" val="0"/>
+                        </a:ext>
+                      </a:extLst>
+                    </a:blip>
+                    <a:stretch>
+                      <a:fillRect/>
+                    </a:stretch>
+                  </pic:blipFill>
+                  <pic:spPr>
+                    <a:xfrm>
+                      <a:off x="0" y="0"/>
+                      <a:ext cx="5341620" cy="2397760"/>
+                    </a:xfrm>
+                    <a:prstGeom prst="rect">
+                      <a:avLst/>
+                    </a:prstGeom>
+                  </pic:spPr>
+                </pic:pic>
+              </a:graphicData>
+            </a:graphic>
+            <wp14:sizeRelH relativeFrom="margin">
+              <wp14:pctWidth>0</wp14:pctWidth>
+            </wp14:sizeRelH>
+            <wp14:sizeRelV relativeFrom="margin">
+              <wp14:pctHeight>0</wp14:pctHeight>
+            </wp14:sizeRelV>
+          </wp:anchor>
+        </w:drawing>
+      </w:r>
+      <w:r>
+        <w:t xml:space="preserve">Why can’t I use the credentials I created to use Google Calendar? </w:t>
+      </w:r>
+    </w:p>
+    <w:p>
+      <w:pPr>
+        <w:pStyle w:val="ListParagraph"/>
+        <w:ind w:left="1080"/>
+      </w:pPr>
+    </w:p>
+    <w:p>
+      <w:pPr>
+        <w:pStyle w:val="ListParagraph"/>
+        <w:ind w:left="1080"/>
+      </w:pPr>
+      <w:r>
+        <w:t>Simple explanation</w:t>
+      </w:r>
+      <w:r>
+        <w:t>:</w:t>
+      </w:r>
+    </w:p>
+    <w:p>
+      <w:pPr>
+        <w:pStyle w:val="ListParagraph"/>
+        <w:ind w:left="1080"/>
+      </w:pPr>
+    </w:p>
+    <w:p>
+      <w:pPr>
+        <w:pStyle w:val="ListParagraph"/>
+        <w:ind w:left="1080"/>
+      </w:pPr>
+      <w:r>
+        <w:t xml:space="preserve">To use </w:t>
+      </w:r>
+      <w:r>
+        <w:rPr>
+          <w:b/>
+          <w:bCs/>
+        </w:rPr>
+        <w:t>my calendar</w:t>
+      </w:r>
+      <w:r>
+        <w:t xml:space="preserve"> – </w:t>
+      </w:r>
+      <w:r>
+        <w:rPr>
+          <w:b/>
+          <w:bCs/>
+        </w:rPr>
+        <w:t>requires special credentials + authentication</w:t>
+      </w:r>
+      <w:r>
+        <w:t xml:space="preserve"> as it is an access to my private domain – like keys to my house. </w:t>
+      </w:r>
+    </w:p>
+    <w:p>
+      <w:pPr>
+        <w:pStyle w:val="ListParagraph"/>
+        <w:ind w:left="1080"/>
+      </w:pPr>
+      <w:r>
+        <w:lastRenderedPageBreak/>
+        <w:t xml:space="preserve">While to use </w:t>
+      </w:r>
+      <w:proofErr w:type="spellStart"/>
+      <w:r>
+        <w:t>Gimini</w:t>
+      </w:r>
+      <w:proofErr w:type="spellEnd"/>
+      <w:r>
+        <w:t xml:space="preserve"> AI tool capabilities I need </w:t>
+      </w:r>
+      <w:r>
+        <w:rPr>
+          <w:b/>
+          <w:bCs/>
+        </w:rPr>
+        <w:t>more simple</w:t>
+      </w:r>
+      <w:r>
+        <w:t xml:space="preserve"> access therefore I need keys. </w:t>
+      </w:r>
+    </w:p>
+    <w:p>
+      <w:pPr>
+        <w:pStyle w:val="ListParagraph"/>
+        <w:ind w:left="1080"/>
+      </w:pPr>
+      <w:r>
+        <w:t>Keys for my Google Calendar tool doesn’t work for Google Gemini AI tool.</w:t>
+      </w:r>
+    </w:p>
+    <w:p>
+      <w:pPr>
+        <w:pStyle w:val="ListParagraph"/>
+        <w:ind w:left="1080"/>
+      </w:pPr>
+    </w:p>
+    <w:p>
+      <w:pPr>
+        <w:pStyle w:val="ListParagraph"/>
+        <w:ind w:left="1440"/>
+      </w:pPr>
+    </w:p>
+    <w:p>
+      <w:pPr>
+        <w:pStyle w:val="ListParagraph"/>
+        <w:numPr>
+          <w:ilvl w:val="0"/>
+          <w:numId w:val="7"/>
+        </w:numPr>
+      </w:pPr>
+      <w:r>
+        <w:drawing>
+          <wp:anchor distT="0" distB="0" distL="114300" distR="114300" simplePos="0" relativeHeight="251663360" behindDoc="0" locked="0" layoutInCell="1" allowOverlap="1" wp14:anchorId="0AF36B1F" wp14:editId="6F77C592">
+            <wp:simplePos x="0" y="0"/>
+            <wp:positionH relativeFrom="column">
+              <wp:posOffset>387074</wp:posOffset>
+            </wp:positionH>
+            <wp:positionV relativeFrom="paragraph">
+              <wp:posOffset>336440</wp:posOffset>
+            </wp:positionV>
+            <wp:extent cx="5731510" cy="890905"/>
+            <wp:effectExtent l="0" t="0" r="2540" b="4445"/>
+            <wp:wrapSquare wrapText="bothSides"/>
+            <wp:docPr id="1716449761" name="Picture 1"/>
+            <wp:cNvGraphicFramePr>
+              <a:graphicFrameLocks xmlns:a="http://schemas.openxmlformats.org/drawingml/2006/main" noChangeAspect="1"/>
+            </wp:cNvGraphicFramePr>
+            <a:graphic xmlns:a="http://schemas.openxmlformats.org/drawingml/2006/main">
+              <a:graphicData uri="http://schemas.openxmlformats.org/drawingml/2006/picture">
+                <pic:pic xmlns:pic="http://schemas.openxmlformats.org/drawingml/2006/picture">
+                  <pic:nvPicPr>
+                    <pic:cNvPr id="1716449761" name=""/>
+                    <pic:cNvPicPr/>
+                  </pic:nvPicPr>
+                  <pic:blipFill>
+                    <a:blip r:embed="rId23" cstate="print">
+                      <a:extLst>
+                        <a:ext uri="{28A0092B-C50C-407E-A947-70E740481C1C}">
+                          <a14:useLocalDpi xmlns:a14="http://schemas.microsoft.com/office/drawing/2010/main" val="0"/>
+                        </a:ext>
+                      </a:extLst>
+                    </a:blip>
+                    <a:stretch>
+                      <a:fillRect/>
+                    </a:stretch>
+                  </pic:blipFill>
+                  <pic:spPr>
+                    <a:xfrm>
+                      <a:off x="0" y="0"/>
+                      <a:ext cx="5731510" cy="890905"/>
+                    </a:xfrm>
+                    <a:prstGeom prst="rect">
+                      <a:avLst/>
+                    </a:prstGeom>
+                  </pic:spPr>
+                </pic:pic>
+              </a:graphicData>
+            </a:graphic>
+          </wp:anchor>
+        </w:drawing>
+      </w:r>
+      <w:r>
+        <w:t>I</w:t>
+      </w:r>
+      <w:r>
+        <w:t xml:space="preserve">mport the project: </w:t>
+      </w:r>
+      <w:proofErr w:type="spellStart"/>
+      <w:r>
+        <w:rPr>
+          <w:b/>
+          <w:bCs/>
+          <w:color w:val="0066FF"/>
+        </w:rPr>
+        <w:t>CalendarChecker</w:t>
+      </w:r>
+      <w:proofErr w:type="spellEnd"/>
+    </w:p>
+    <w:p>
+      <w:pPr>
+        <w:pStyle w:val="ListParagraph"/>
+        <w:ind w:left="1440"/>
+      </w:pPr>
+    </w:p>
+    <w:p>
+      <w:pPr>
+        <w:pStyle w:val="ListParagraph"/>
+        <w:numPr>
+          <w:ilvl w:val="0"/>
+          <w:numId w:val="7"/>
+        </w:numPr>
+      </w:pPr>
+      <w:r>
+        <w:t xml:space="preserve">Click on button </w:t>
+      </w:r>
+      <w:r>
+        <w:rPr>
+          <w:b/>
+          <w:bCs/>
+          <w:color w:val="0066FF"/>
+        </w:rPr>
+        <w:t>“Create API key”</w:t>
+      </w:r>
+      <w:r>
+        <w:t>:</w:t>
+      </w:r>
+    </w:p>
+    <w:p>
+      <w:pPr>
+        <w:pStyle w:val="ListParagraph"/>
+        <w:ind w:left="1440"/>
+      </w:pPr>
+    </w:p>
+    <w:p>
+      <w:pPr>
+        <w:pStyle w:val="ListParagraph"/>
+      </w:pPr>
+      <w:r>
+        <w:drawing>
+          <wp:inline distT="0" distB="0" distL="0" distR="0" wp14:anchorId="1B3697D3" wp14:editId="0AAE6401">
+            <wp:extent cx="2864397" cy="2186608"/>
+            <wp:effectExtent l="0" t="0" r="0" b="4445"/>
+            <wp:docPr id="1614734202" name="Picture 1"/>
+            <wp:cNvGraphicFramePr>
+              <a:graphicFrameLocks xmlns:a="http://schemas.openxmlformats.org/drawingml/2006/main" noChangeAspect="1"/>
+            </wp:cNvGraphicFramePr>
+            <a:graphic xmlns:a="http://schemas.openxmlformats.org/drawingml/2006/main">
+              <a:graphicData uri="http://schemas.openxmlformats.org/drawingml/2006/picture">
+                <pic:pic xmlns:pic="http://schemas.openxmlformats.org/drawingml/2006/picture">
+                  <pic:nvPicPr>
+                    <pic:cNvPr id="1614734202" name=""/>
+                    <pic:cNvPicPr/>
+                  </pic:nvPicPr>
+                  <pic:blipFill>
+                    <a:blip r:embed="rId24"/>
+                    <a:stretch>
+                      <a:fillRect/>
+                    </a:stretch>
+                  </pic:blipFill>
+                  <pic:spPr>
+                    <a:xfrm>
+                      <a:off x="0" y="0"/>
+                      <a:ext cx="2878791" cy="2197596"/>
+                    </a:xfrm>
+                    <a:prstGeom prst="rect">
+                      <a:avLst/>
+                    </a:prstGeom>
+                  </pic:spPr>
+                </pic:pic>
+              </a:graphicData>
+            </a:graphic>
+          </wp:inline>
+        </w:drawing>
+      </w:r>
+    </w:p>
+    <w:p>
+      <w:pPr>
+        <w:pStyle w:val="ListParagraph"/>
+        <w:rPr>
+          <w:b/>
+          <w:bCs/>
+          <w:color w:val="0066FF"/>
+        </w:rPr>
+      </w:pPr>
+      <w:r>
+        <w:t xml:space="preserve">Click on button: </w:t>
+      </w:r>
+      <w:r>
+        <w:rPr>
+          <w:b/>
+          <w:bCs/>
+          <w:color w:val="0066FF"/>
+        </w:rPr>
+        <w:t>Copy key</w:t>
+      </w:r>
+    </w:p>
+    <w:p>
+      <w:pPr>
+        <w:pStyle w:val="ListParagraph"/>
+      </w:pPr>
+      <w:r>
+        <w:drawing>
+          <wp:anchor distT="0" distB="0" distL="114300" distR="114300" simplePos="0" relativeHeight="251664384" behindDoc="0" locked="0" layoutInCell="1" allowOverlap="1" wp14:anchorId="19B393E8" wp14:editId="403940CD">
+            <wp:simplePos x="0" y="0"/>
+            <wp:positionH relativeFrom="margin">
+              <wp:align>left</wp:align>
+            </wp:positionH>
+            <wp:positionV relativeFrom="paragraph">
+              <wp:posOffset>221615</wp:posOffset>
+            </wp:positionV>
+            <wp:extent cx="6193790" cy="1732915"/>
+            <wp:effectExtent l="0" t="0" r="0" b="635"/>
+            <wp:wrapSquare wrapText="bothSides"/>
+            <wp:docPr id="1791652703" name="Picture 1"/>
+            <wp:cNvGraphicFramePr>
+              <a:graphicFrameLocks xmlns:a="http://schemas.openxmlformats.org/drawingml/2006/main" noChangeAspect="1"/>
+            </wp:cNvGraphicFramePr>
+            <a:graphic xmlns:a="http://schemas.openxmlformats.org/drawingml/2006/main">
+              <a:graphicData uri="http://schemas.openxmlformats.org/drawingml/2006/picture">
+                <pic:pic xmlns:pic="http://schemas.openxmlformats.org/drawingml/2006/picture">
+                  <pic:nvPicPr>
+                    <pic:cNvPr id="1791652703" name=""/>
+                    <pic:cNvPicPr/>
+                  </pic:nvPicPr>
+                  <pic:blipFill>
+                    <a:blip r:embed="rId25">
+                      <a:extLst>
+                        <a:ext uri="{28A0092B-C50C-407E-A947-70E740481C1C}">
+                          <a14:useLocalDpi xmlns:a14="http://schemas.microsoft.com/office/drawing/2010/main" val="0"/>
+                        </a:ext>
+                      </a:extLst>
+                    </a:blip>
+                    <a:stretch>
+                      <a:fillRect/>
+                    </a:stretch>
+                  </pic:blipFill>
+                  <pic:spPr>
+                    <a:xfrm>
+                      <a:off x="0" y="0"/>
+                      <a:ext cx="6193790" cy="1732915"/>
+                    </a:xfrm>
+                    <a:prstGeom prst="rect">
+                      <a:avLst/>
+                    </a:prstGeom>
+                  </pic:spPr>
+                </pic:pic>
+              </a:graphicData>
+            </a:graphic>
+            <wp14:sizeRelH relativeFrom="margin">
+              <wp14:pctWidth>0</wp14:pctWidth>
+            </wp14:sizeRelH>
+            <wp14:sizeRelV relativeFrom="margin">
+              <wp14:pctHeight>0</wp14:pctHeight>
+            </wp14:sizeRelV>
+          </wp:anchor>
+        </w:drawing>
+      </w:r>
+      <w:r>
+        <w:t xml:space="preserve">Add it to </w:t>
+      </w:r>
+      <w:r>
+        <w:rPr>
+          <w:b/>
+          <w:bCs/>
+          <w:color w:val="0066FF"/>
+        </w:rPr>
+        <w:t>.env</w:t>
+      </w:r>
+      <w:r>
+        <w:rPr>
+          <w:color w:val="0066FF"/>
+        </w:rPr>
+        <w:t xml:space="preserve"> </w:t>
+      </w:r>
+      <w:r>
+        <w:t xml:space="preserve">file: </w:t>
+      </w:r>
+    </w:p>
+    <w:p>
+      <w:pPr>
+        <w:pStyle w:val="ListParagraph"/>
+      </w:pPr>
+    </w:p>
+    <w:p>
+      <w:pPr>
+        <w:pStyle w:val="ListParagraph"/>
+        <w:ind w:left="360"/>
+      </w:pPr>
+    </w:p>
+    <w:p>
+      <w:pPr>
+        <w:pStyle w:val="ListParagraph"/>
+        <w:numPr>
+          <w:ilvl w:val="0"/>
+          <w:numId w:val="5"/>
+        </w:numPr>
+        <w:rPr>
+          <w:b/>
+          <w:bCs/>
+          <w:color w:val="0066FF"/>
+        </w:rPr>
+      </w:pPr>
+      <w:r>
+        <w:rPr>
+          <w:b/>
+          <w:bCs/>
+          <w:color w:val="0066FF"/>
+        </w:rPr>
+        <w:t xml:space="preserve">Step 2: In PyCharm install and import 3 libraries: </w:t>
+      </w:r>
+    </w:p>
+    <w:p>
+      <w:pPr>
+        <w:pStyle w:val="ListParagraph"/>
+        <w:numPr>
+          <w:ilvl w:val="1"/>
+          <w:numId w:val="5"/>
+        </w:numPr>
+        <w:rPr>
+          <w:color w:val="000000" w:themeColor="text1"/>
+        </w:rPr>
+      </w:pPr>
+      <w:r>
+        <w:rPr>
+          <w:b/>
+          <w:bCs/>
+          <w:color w:val="000000" w:themeColor="text1"/>
+        </w:rPr>
+        <w:t>Google Calendar</w:t>
+      </w:r>
+      <w:r>
+        <w:rPr>
+          <w:color w:val="000000" w:themeColor="text1"/>
+        </w:rPr>
+        <w:t xml:space="preserve"> library</w:t>
+      </w:r>
+    </w:p>
+    <w:p>
+      <w:pPr>
+        <w:ind w:left="1080"/>
+        <w:rPr>
+          <w:rFonts w:ascii="Courier New" w:hAnsi="Courier New" w:cs="Courier New"/>
+          <w:color w:val="000000" w:themeColor="text1"/>
+        </w:rPr>
+      </w:pPr>
+      <w:r>
+        <w:rPr>
+          <w:rFonts w:ascii="Courier New" w:hAnsi="Courier New" w:cs="Courier New"/>
+          <w:color w:val="000000" w:themeColor="text1"/>
+        </w:rPr>
+        <w:t>pip install google-</w:t>
+      </w:r>
+      <w:proofErr w:type="spellStart"/>
+      <w:r>
+        <w:rPr>
+          <w:rFonts w:ascii="Courier New" w:hAnsi="Courier New" w:cs="Courier New"/>
+          <w:color w:val="000000" w:themeColor="text1"/>
+        </w:rPr>
+        <w:t>api</w:t>
+      </w:r>
+      <w:proofErr w:type="spellEnd"/>
+      <w:r>
+        <w:rPr>
+          <w:rFonts w:ascii="Courier New" w:hAnsi="Courier New" w:cs="Courier New"/>
+          <w:color w:val="000000" w:themeColor="text1"/>
+        </w:rPr>
+        <w:t>-python-client google-auth-httplib2 google-auth-</w:t>
+      </w:r>
+      <w:proofErr w:type="spellStart"/>
+      <w:r>
+        <w:rPr>
+          <w:rFonts w:ascii="Courier New" w:hAnsi="Courier New" w:cs="Courier New"/>
+          <w:color w:val="000000" w:themeColor="text1"/>
+        </w:rPr>
+        <w:t>oauthlib</w:t>
+      </w:r>
+      <w:proofErr w:type="spellEnd"/>
+    </w:p>
+    <w:p>
+      <w:pPr>
+        <w:pStyle w:val="ListParagraph"/>
+        <w:numPr>
+          <w:ilvl w:val="1"/>
+          <w:numId w:val="5"/>
+        </w:numPr>
+        <w:rPr>
+          <w:color w:val="000000" w:themeColor="text1"/>
+        </w:rPr>
+      </w:pPr>
+      <w:r>
+        <w:rPr>
+          <w:b/>
+          <w:bCs/>
+          <w:color w:val="000000" w:themeColor="text1"/>
+        </w:rPr>
+        <w:lastRenderedPageBreak/>
+        <w:t>Gemini AI</w:t>
+      </w:r>
+      <w:r>
+        <w:rPr>
+          <w:color w:val="000000" w:themeColor="text1"/>
+        </w:rPr>
+        <w:t xml:space="preserve"> library</w:t>
+      </w:r>
+    </w:p>
+    <w:p>
+      <w:pPr>
+        <w:ind w:left="1080"/>
+        <w:rPr>
+          <w:rFonts w:ascii="Courier New" w:hAnsi="Courier New" w:cs="Courier New"/>
+          <w:color w:val="000000" w:themeColor="text1"/>
+        </w:rPr>
+      </w:pPr>
+      <w:r>
+        <w:rPr>
+          <w:rFonts w:ascii="Courier New" w:hAnsi="Courier New" w:cs="Courier New"/>
+          <w:color w:val="000000" w:themeColor="text1"/>
+        </w:rPr>
+        <w:t>pip install google-</w:t>
+      </w:r>
+      <w:proofErr w:type="spellStart"/>
+      <w:r>
+        <w:rPr>
+          <w:rFonts w:ascii="Courier New" w:hAnsi="Courier New" w:cs="Courier New"/>
+          <w:color w:val="000000" w:themeColor="text1"/>
+        </w:rPr>
+        <w:t>generativeai</w:t>
+      </w:r>
+      <w:proofErr w:type="spellEnd"/>
+    </w:p>
+    <w:p>
+      <w:pPr>
+        <w:ind w:left="1080"/>
+        <w:rPr>
+          <w:rFonts w:ascii="Courier New" w:hAnsi="Courier New" w:cs="Courier New"/>
+          <w:color w:val="000000" w:themeColor="text1"/>
+        </w:rPr>
+      </w:pPr>
+    </w:p>
+    <w:p>
+      <w:pPr>
+        <w:pStyle w:val="ListParagraph"/>
+        <w:numPr>
+          <w:ilvl w:val="1"/>
+          <w:numId w:val="5"/>
+        </w:numPr>
+        <w:rPr>
+          <w:color w:val="000000" w:themeColor="text1"/>
+        </w:rPr>
+      </w:pPr>
+      <w:r>
+        <w:rPr>
+          <w:b/>
+          <w:bCs/>
+          <w:color w:val="000000" w:themeColor="text1"/>
+        </w:rPr>
+        <w:t>Speech recognition</w:t>
+      </w:r>
+      <w:r>
+        <w:rPr>
+          <w:color w:val="000000" w:themeColor="text1"/>
+        </w:rPr>
+        <w:t xml:space="preserve"> library</w:t>
+      </w:r>
+      <w:r>
+        <w:rPr>
+          <w:color w:val="000000" w:themeColor="text1"/>
+        </w:rPr>
+        <w:t xml:space="preserve">: </w:t>
+      </w:r>
+    </w:p>
+    <w:p>
+      <w:pPr>
+        <w:ind w:left="1080"/>
+        <w:rPr>
+          <w:rFonts w:ascii="Courier New" w:hAnsi="Courier New" w:cs="Courier New"/>
+          <w:color w:val="000000" w:themeColor="text1"/>
+        </w:rPr>
+      </w:pPr>
+      <w:r>
+        <w:drawing>
+          <wp:anchor distT="0" distB="0" distL="114300" distR="114300" simplePos="0" relativeHeight="251665408" behindDoc="0" locked="0" layoutInCell="1" allowOverlap="1" wp14:anchorId="5ED8D73B" wp14:editId="24443984">
+            <wp:simplePos x="0" y="0"/>
+            <wp:positionH relativeFrom="column">
+              <wp:posOffset>269599</wp:posOffset>
+            </wp:positionH>
+            <wp:positionV relativeFrom="paragraph">
+              <wp:posOffset>390387</wp:posOffset>
+            </wp:positionV>
+            <wp:extent cx="5731510" cy="5031740"/>
+            <wp:effectExtent l="0" t="0" r="2540" b="0"/>
+            <wp:wrapSquare wrapText="bothSides"/>
+            <wp:docPr id="221226986" name="Picture 1"/>
+            <wp:cNvGraphicFramePr>
+              <a:graphicFrameLocks xmlns:a="http://schemas.openxmlformats.org/drawingml/2006/main" noChangeAspect="1"/>
+            </wp:cNvGraphicFramePr>
+            <a:graphic xmlns:a="http://schemas.openxmlformats.org/drawingml/2006/main">
+              <a:graphicData uri="http://schemas.openxmlformats.org/drawingml/2006/picture">
+                <pic:pic xmlns:pic="http://schemas.openxmlformats.org/drawingml/2006/picture">
+                  <pic:nvPicPr>
+                    <pic:cNvPr id="221226986" name=""/>
+                    <pic:cNvPicPr/>
+                  </pic:nvPicPr>
+                  <pic:blipFill>
+                    <a:blip r:embed="rId26">
+                      <a:extLst>
+                        <a:ext uri="{28A0092B-C50C-407E-A947-70E740481C1C}">
+                          <a14:useLocalDpi xmlns:a14="http://schemas.microsoft.com/office/drawing/2010/main" val="0"/>
+                        </a:ext>
+                      </a:extLst>
+                    </a:blip>
+                    <a:stretch>
+                      <a:fillRect/>
+                    </a:stretch>
+                  </pic:blipFill>
+                  <pic:spPr>
+                    <a:xfrm>
+                      <a:off x="0" y="0"/>
+                      <a:ext cx="5731510" cy="5031740"/>
+                    </a:xfrm>
+                    <a:prstGeom prst="rect">
+                      <a:avLst/>
+                    </a:prstGeom>
+                  </pic:spPr>
+                </pic:pic>
+              </a:graphicData>
+            </a:graphic>
+          </wp:anchor>
+        </w:drawing>
+      </w:r>
+      <w:r>
+        <w:t xml:space="preserve"> </w:t>
+      </w:r>
+      <w:r>
+        <w:rPr>
+          <w:rFonts w:ascii="Courier New" w:hAnsi="Courier New" w:cs="Courier New"/>
+          <w:color w:val="000000" w:themeColor="text1"/>
+        </w:rPr>
+        <w:t xml:space="preserve">pip install </w:t>
+      </w:r>
+      <w:proofErr w:type="spellStart"/>
+      <w:r>
+        <w:rPr>
+          <w:rFonts w:ascii="Courier New" w:hAnsi="Courier New" w:cs="Courier New"/>
+          <w:color w:val="000000" w:themeColor="text1"/>
+        </w:rPr>
+        <w:t>openai</w:t>
+      </w:r>
+      <w:proofErr w:type="spellEnd"/>
+      <w:r>
+        <w:rPr>
+          <w:rFonts w:ascii="Courier New" w:hAnsi="Courier New" w:cs="Courier New"/>
+          <w:color w:val="000000" w:themeColor="text1"/>
+        </w:rPr>
+        <w:t>-whisper</w:t>
+      </w:r>
+    </w:p>
+    <w:p>
+      <w:pPr>
+        <w:ind w:left="1080"/>
+        <w:rPr>
+          <w:color w:val="000000" w:themeColor="text1"/>
+        </w:rPr>
+      </w:pPr>
+    </w:p>
+    <w:p>
+      <w:pPr>
+        <w:pStyle w:val="ListParagraph"/>
+        <w:numPr>
+          <w:ilvl w:val="0"/>
+          <w:numId w:val="5"/>
+        </w:numPr>
+        <w:rPr>
+          <w:color w:val="000000" w:themeColor="text1"/>
+        </w:rPr>
+      </w:pPr>
+      <w:r>
+        <w:rPr>
+          <w:b/>
+          <w:bCs/>
+          <w:color w:val="000000" w:themeColor="text1"/>
+        </w:rPr>
+        <w:t>Connect app to Google Calendar</w:t>
+      </w:r>
+      <w:r>
+        <w:rPr>
+          <w:color w:val="000000" w:themeColor="text1"/>
+        </w:rPr>
+        <w:t xml:space="preserve">, by adding the code that supplies </w:t>
+      </w:r>
+      <w:proofErr w:type="spellStart"/>
+      <w:r>
+        <w:rPr>
+          <w:b/>
+          <w:bCs/>
+          <w:color w:val="000000" w:themeColor="text1"/>
+        </w:rPr>
+        <w:t>credentials.json</w:t>
+      </w:r>
+      <w:proofErr w:type="spellEnd"/>
+      <w:r>
+        <w:rPr>
+          <w:color w:val="000000" w:themeColor="text1"/>
+        </w:rPr>
+        <w:t xml:space="preserve"> file and should get tole </w:t>
+      </w:r>
+      <w:proofErr w:type="spellStart"/>
+      <w:proofErr w:type="gramStart"/>
+      <w:r>
+        <w:rPr>
+          <w:b/>
+          <w:bCs/>
+          <w:color w:val="000000" w:themeColor="text1"/>
+        </w:rPr>
+        <w:t>token.json</w:t>
+      </w:r>
+      <w:proofErr w:type="spellEnd"/>
+      <w:proofErr w:type="gramEnd"/>
+    </w:p>
+    <w:p>
+      <w:pPr>
+        <w:ind w:left="360"/>
+        <w:rPr>
+          <w:color w:val="000000" w:themeColor="text1"/>
+        </w:rPr>
+      </w:pPr>
+      <w:r>
+        <w:rPr>
+          <w:color w:val="000000" w:themeColor="text1"/>
+        </w:rPr>
+        <w:t xml:space="preserve">I ran: </w:t>
+      </w:r>
+    </w:p>
+    <w:p>
+      <w:pPr>
+        <w:ind w:left="360"/>
+        <w:rPr>
+          <w:color w:val="000000" w:themeColor="text1"/>
+        </w:rPr>
+      </w:pPr>
+      <w:r>
+        <w:rPr>
+          <w:rFonts w:ascii="Courier New" w:hAnsi="Courier New" w:cs="Courier New"/>
+          <w:color w:val="000000" w:themeColor="text1"/>
+        </w:rPr>
+        <w:t xml:space="preserve">python -m </w:t>
+      </w:r>
+      <w:proofErr w:type="spellStart"/>
+      <w:r>
+        <w:rPr>
+          <w:rFonts w:ascii="Courier New" w:hAnsi="Courier New" w:cs="Courier New"/>
+          <w:color w:val="000000" w:themeColor="text1"/>
+        </w:rPr>
+        <w:t>src.calendar_checker</w:t>
+      </w:r>
+      <w:proofErr w:type="spellEnd"/>
+      <w:r>
+        <w:rPr>
+          <w:color w:val="000000" w:themeColor="text1"/>
+        </w:rPr>
+        <w:t xml:space="preserve"> </w:t>
+      </w:r>
+    </w:p>
+    <w:p>
+      <w:pPr>
+        <w:ind w:left="360"/>
+        <w:rPr>
+          <w:color w:val="000000" w:themeColor="text1"/>
+        </w:rPr>
+      </w:pPr>
+      <w:r>
+        <w:rPr>
+          <w:color w:val="000000" w:themeColor="text1"/>
+        </w:rPr>
+        <w:t xml:space="preserve">The output: </w:t>
+      </w:r>
+    </w:p>
+    <w:p>
+      <w:pPr>
+        <w:ind w:left="360"/>
+        <w:rPr>
+          <w:color w:val="000000" w:themeColor="text1"/>
+        </w:rPr>
+      </w:pPr>
+      <w:r>
+        <w:rPr>
+          <w:color w:val="000000" w:themeColor="text1"/>
+        </w:rPr>
+        <w:t xml:space="preserve">I was asked to click on the URL and to allow access (this should be done 1 time only) </w:t>
+      </w:r>
+    </w:p>
+    <w:p>
+      <w:pPr>
+        <w:ind w:left="360"/>
+        <w:rPr>
+          <w:color w:val="000000" w:themeColor="text1"/>
+        </w:rPr>
+      </w:pPr>
+      <w:r>
+        <w:rPr>
+          <w:color w:val="000000" w:themeColor="text1"/>
+        </w:rPr>
+        <w:lastRenderedPageBreak/>
+        <w:t xml:space="preserve">The URL is: </w:t>
+      </w:r>
+    </w:p>
+    <w:p>
+      <w:pPr>
+        <w:ind w:left="360"/>
+        <w:rPr>
+          <w:color w:val="000000" w:themeColor="text1"/>
+        </w:rPr>
+      </w:pPr>
+      <w:hyperlink r:id="rId27" w:history="1">
+        <w:r>
+          <w:rPr>
+            <w:rStyle w:val="Hyperlink"/>
+          </w:rPr>
+          <w:t>https://accounts.google.com/o/oauth2/auth?response_type=code&amp;client_id=315561661093-8418vmie4lu58tae940d7poqembjo4nv.apps.googleusercontent.com&amp;redirect_uri=http%3A%2F%2Flocalhost%3A61179%2F&amp;scope=https%3A%2F%2Fwww.googleapis.com%2Fauth%2Fcalendar.events&amp;state=7ehAF0afZJKy2j2dgJAYhtPLj7ZBmx&amp;code_challenge=gkmmjbOlDUR_ra-6EXyv04-UFOIJ7lgXAK-Tya7LP_g&amp;code_challenge_method=S256&amp;access_type=offline</w:t>
+        </w:r>
+      </w:hyperlink>
+    </w:p>
+    <w:p>
+      <w:pPr>
+        <w:ind w:left="360"/>
+        <w:rPr>
+          <w:color w:val="000000" w:themeColor="text1"/>
+        </w:rPr>
+      </w:pPr>
+    </w:p>
+    <w:p>
+      <w:pPr>
+        <w:ind w:left="360"/>
+        <w:rPr>
+          <w:color w:val="000000" w:themeColor="text1"/>
+        </w:rPr>
+      </w:pPr>
+      <w:r>
+        <w:rPr>
+          <w:color w:val="000000" w:themeColor="text1"/>
+        </w:rPr>
+        <w:t xml:space="preserve">I clicked but the registration / allowance failed. This is the error details: </w:t>
+      </w:r>
+    </w:p>
+    <w:p>
+      <w:pPr>
+        <w:ind w:left="360"/>
+        <w:rPr>
+          <w:rFonts w:ascii="Courier New" w:hAnsi="Courier New" w:cs="Courier New"/>
+          <w:color w:val="000000" w:themeColor="text1"/>
+          <w:sz w:val="16"/>
+          <w:szCs w:val="16"/>
+        </w:rPr>
+      </w:pPr>
+      <w:r>
+        <w:rPr>
+          <w:rFonts w:ascii="Courier New" w:hAnsi="Courier New" w:cs="Courier New"/>
+          <w:b/>
+          <w:bCs/>
+          <w:color w:val="000000" w:themeColor="text1"/>
+          <w:sz w:val="16"/>
+          <w:szCs w:val="16"/>
+        </w:rPr>
+        <w:t xml:space="preserve">Error 403: </w:t>
+      </w:r>
+      <w:proofErr w:type="spellStart"/>
+      <w:r>
+        <w:rPr>
+          <w:rFonts w:ascii="Courier New" w:hAnsi="Courier New" w:cs="Courier New"/>
+          <w:b/>
+          <w:bCs/>
+          <w:color w:val="000000" w:themeColor="text1"/>
+          <w:sz w:val="16"/>
+          <w:szCs w:val="16"/>
+        </w:rPr>
+        <w:t>access_denied</w:t>
+      </w:r>
+      <w:proofErr w:type="spellEnd"/>
+      <w:r>
+        <w:rPr>
+          <w:rFonts w:ascii="Courier New" w:hAnsi="Courier New" w:cs="Courier New"/>
+          <w:color w:val="000000" w:themeColor="text1"/>
+          <w:sz w:val="16"/>
+          <w:szCs w:val="16"/>
+        </w:rPr>
+        <w:t xml:space="preserve"> Request details: </w:t>
+      </w:r>
+      <w:proofErr w:type="spellStart"/>
+      <w:r>
+        <w:rPr>
+          <w:rFonts w:ascii="Courier New" w:hAnsi="Courier New" w:cs="Courier New"/>
+          <w:color w:val="000000" w:themeColor="text1"/>
+          <w:sz w:val="16"/>
+          <w:szCs w:val="16"/>
+        </w:rPr>
+        <w:t>access_type</w:t>
+      </w:r>
+      <w:proofErr w:type="spellEnd"/>
+      <w:r>
+        <w:rPr>
+          <w:rFonts w:ascii="Courier New" w:hAnsi="Courier New" w:cs="Courier New"/>
+          <w:color w:val="000000" w:themeColor="text1"/>
+          <w:sz w:val="16"/>
+          <w:szCs w:val="16"/>
+        </w:rPr>
+        <w:t>=</w:t>
+      </w:r>
+      <w:r>
+        <w:rPr>
+          <w:rFonts w:ascii="Courier New" w:hAnsi="Courier New" w:cs="Courier New"/>
+          <w:b/>
+          <w:bCs/>
+          <w:color w:val="000000" w:themeColor="text1"/>
+          <w:sz w:val="16"/>
+          <w:szCs w:val="16"/>
+        </w:rPr>
+        <w:t>offline</w:t>
+      </w:r>
+      <w:r>
+        <w:rPr>
+          <w:rFonts w:ascii="Courier New" w:hAnsi="Courier New" w:cs="Courier New"/>
+          <w:color w:val="000000" w:themeColor="text1"/>
+          <w:sz w:val="16"/>
+          <w:szCs w:val="16"/>
+        </w:rPr>
+        <w:t xml:space="preserve"> scope=</w:t>
+      </w:r>
+      <w:hyperlink r:id="rId28" w:tgtFrame="_blank" w:history="1">
+        <w:r>
+          <w:rPr>
+            <w:rStyle w:val="Hyperlink"/>
+            <w:rFonts w:ascii="Courier New" w:hAnsi="Courier New" w:cs="Courier New"/>
+            <w:sz w:val="16"/>
+            <w:szCs w:val="16"/>
+          </w:rPr>
+          <w:t>https://www.googleapis.com/auth/calendar.events</w:t>
+        </w:r>
+      </w:hyperlink>
+      <w:r>
+        <w:rPr>
+          <w:rFonts w:ascii="Courier New" w:hAnsi="Courier New" w:cs="Courier New"/>
+          <w:color w:val="000000" w:themeColor="text1"/>
+          <w:sz w:val="16"/>
+          <w:szCs w:val="16"/>
+        </w:rPr>
+        <w:t xml:space="preserve"> </w:t>
+      </w:r>
+      <w:proofErr w:type="spellStart"/>
+      <w:r>
+        <w:rPr>
+          <w:rFonts w:ascii="Courier New" w:hAnsi="Courier New" w:cs="Courier New"/>
+          <w:color w:val="000000" w:themeColor="text1"/>
+          <w:sz w:val="16"/>
+          <w:szCs w:val="16"/>
+        </w:rPr>
+        <w:t>response_type</w:t>
+      </w:r>
+      <w:proofErr w:type="spellEnd"/>
+      <w:r>
+        <w:rPr>
+          <w:rFonts w:ascii="Courier New" w:hAnsi="Courier New" w:cs="Courier New"/>
+          <w:color w:val="000000" w:themeColor="text1"/>
+          <w:sz w:val="16"/>
+          <w:szCs w:val="16"/>
+        </w:rPr>
+        <w:t xml:space="preserve">=code </w:t>
+      </w:r>
+      <w:proofErr w:type="spellStart"/>
+      <w:r>
+        <w:rPr>
+          <w:rFonts w:ascii="Courier New" w:hAnsi="Courier New" w:cs="Courier New"/>
+          <w:color w:val="000000" w:themeColor="text1"/>
+          <w:sz w:val="16"/>
+          <w:szCs w:val="16"/>
+        </w:rPr>
+        <w:t>redirect_uri</w:t>
+      </w:r>
+      <w:proofErr w:type="spellEnd"/>
+      <w:r>
+        <w:rPr>
+          <w:rFonts w:ascii="Courier New" w:hAnsi="Courier New" w:cs="Courier New"/>
+          <w:color w:val="000000" w:themeColor="text1"/>
+          <w:sz w:val="16"/>
+          <w:szCs w:val="16"/>
+        </w:rPr>
+        <w:t>=</w:t>
+      </w:r>
+      <w:hyperlink r:id="rId29" w:tgtFrame="_blank" w:history="1">
+        <w:r>
+          <w:rPr>
+            <w:rStyle w:val="Hyperlink"/>
+            <w:rFonts w:ascii="Courier New" w:hAnsi="Courier New" w:cs="Courier New"/>
+            <w:sz w:val="16"/>
+            <w:szCs w:val="16"/>
+          </w:rPr>
+          <w:t>http://localhost:61179/</w:t>
+        </w:r>
+      </w:hyperlink>
+      <w:r>
+        <w:rPr>
+          <w:rFonts w:ascii="Courier New" w:hAnsi="Courier New" w:cs="Courier New"/>
+          <w:color w:val="000000" w:themeColor="text1"/>
+          <w:sz w:val="16"/>
+          <w:szCs w:val="16"/>
+        </w:rPr>
+        <w:t xml:space="preserve"> state=7ehAF0afZJKy2j2dgJAYhtPLj7ZBmx </w:t>
+      </w:r>
+      <w:proofErr w:type="spellStart"/>
+      <w:r>
+        <w:rPr>
+          <w:rFonts w:ascii="Courier New" w:hAnsi="Courier New" w:cs="Courier New"/>
+          <w:color w:val="000000" w:themeColor="text1"/>
+          <w:sz w:val="16"/>
+          <w:szCs w:val="16"/>
+        </w:rPr>
+        <w:t>code_challenge_method</w:t>
+      </w:r>
+      <w:proofErr w:type="spellEnd"/>
+      <w:r>
+        <w:rPr>
+          <w:rFonts w:ascii="Courier New" w:hAnsi="Courier New" w:cs="Courier New"/>
+          <w:color w:val="000000" w:themeColor="text1"/>
+          <w:sz w:val="16"/>
+          <w:szCs w:val="16"/>
+        </w:rPr>
+        <w:t xml:space="preserve">=S256 </w:t>
+      </w:r>
+      <w:proofErr w:type="spellStart"/>
+      <w:r>
+        <w:rPr>
+          <w:rFonts w:ascii="Courier New" w:hAnsi="Courier New" w:cs="Courier New"/>
+          <w:color w:val="000000" w:themeColor="text1"/>
+          <w:sz w:val="16"/>
+          <w:szCs w:val="16"/>
+        </w:rPr>
+        <w:t>flowName</w:t>
+      </w:r>
+      <w:proofErr w:type="spellEnd"/>
+      <w:r>
+        <w:rPr>
+          <w:rFonts w:ascii="Courier New" w:hAnsi="Courier New" w:cs="Courier New"/>
+          <w:color w:val="000000" w:themeColor="text1"/>
+          <w:sz w:val="16"/>
+          <w:szCs w:val="16"/>
+        </w:rPr>
+        <w:t>=</w:t>
+      </w:r>
+      <w:proofErr w:type="spellStart"/>
+      <w:r>
+        <w:rPr>
+          <w:rFonts w:ascii="Courier New" w:hAnsi="Courier New" w:cs="Courier New"/>
+          <w:color w:val="000000" w:themeColor="text1"/>
+          <w:sz w:val="16"/>
+          <w:szCs w:val="16"/>
+        </w:rPr>
+        <w:t>GeneralOAuthFlow</w:t>
+      </w:r>
+      <w:proofErr w:type="spellEnd"/>
+      <w:r>
+        <w:rPr>
+          <w:rFonts w:ascii="Courier New" w:hAnsi="Courier New" w:cs="Courier New"/>
+          <w:color w:val="000000" w:themeColor="text1"/>
+          <w:sz w:val="16"/>
+          <w:szCs w:val="16"/>
+        </w:rPr>
+        <w:t xml:space="preserve"> client_id=315561661093-8418vmie4lu58tae940d7poqembjo4nv.apps.googleusercontent.com </w:t>
+      </w:r>
+      <w:proofErr w:type="spellStart"/>
+      <w:r>
+        <w:rPr>
+          <w:rFonts w:ascii="Courier New" w:hAnsi="Courier New" w:cs="Courier New"/>
+          <w:color w:val="000000" w:themeColor="text1"/>
+          <w:sz w:val="16"/>
+          <w:szCs w:val="16"/>
+        </w:rPr>
+        <w:t>code_challenge</w:t>
+      </w:r>
+      <w:proofErr w:type="spellEnd"/>
+      <w:r>
+        <w:rPr>
+          <w:rFonts w:ascii="Courier New" w:hAnsi="Courier New" w:cs="Courier New"/>
+          <w:color w:val="000000" w:themeColor="text1"/>
+          <w:sz w:val="16"/>
+          <w:szCs w:val="16"/>
+        </w:rPr>
+        <w:t>=gkmmjbOlDUR_ra-6EXyv04-UFOIJ7lgXAK-Tya7LP_g [Related developer documentation](</w:t>
+      </w:r>
+      <w:hyperlink r:id="rId30" w:anchor="projects-used-in-dev-test-stage" w:tgtFrame="_blank" w:history="1">
+        <w:r>
+          <w:rPr>
+            <w:rStyle w:val="Hyperlink"/>
+            <w:rFonts w:ascii="Courier New" w:hAnsi="Courier New" w:cs="Courier New"/>
+            <w:sz w:val="16"/>
+            <w:szCs w:val="16"/>
+          </w:rPr>
+          <w:t>https://developers.google.com/identity/protocols/oauth2/production-readiness/brand-verification?hl=en#projects-used-in-dev-test-stage</w:t>
+        </w:r>
+      </w:hyperlink>
+      <w:r>
+        <w:rPr>
+          <w:rFonts w:ascii="Courier New" w:hAnsi="Courier New" w:cs="Courier New"/>
+          <w:color w:val="000000" w:themeColor="text1"/>
+          <w:sz w:val="16"/>
+          <w:szCs w:val="16"/>
+        </w:rPr>
+        <w:t>)</w:t>
+      </w:r>
+    </w:p>
+    <w:p>
+      <w:pPr>
+        <w:ind w:left="360"/>
+        <w:rPr>
+          <w:rFonts w:ascii="Courier New" w:hAnsi="Courier New" w:cs="Courier New"/>
+          <w:color w:val="000000" w:themeColor="text1"/>
+          <w:sz w:val="16"/>
+          <w:szCs w:val="16"/>
+        </w:rPr>
+      </w:pPr>
+    </w:p>
+    <w:p>
+      <w:pPr>
+        <w:ind w:left="360"/>
+        <w:rPr>
+          <w:rFonts w:asciiTheme="majorBidi" w:hAnsiTheme="majorBidi" w:cstheme="majorBidi"/>
+          <w:color w:val="000000" w:themeColor="text1"/>
+          <w:lang w:val="en-IL"/>
+        </w:rPr>
+      </w:pPr>
+      <w:r>
+        <w:rPr>
+          <w:rFonts w:asciiTheme="majorBidi" w:hAnsiTheme="majorBidi" w:cstheme="majorBidi"/>
+          <w:color w:val="000000" w:themeColor="text1"/>
+          <w:lang w:val="en-IL"/>
+        </w:rPr>
+        <w:t>This is a common error for new Google Cloud projects!</w:t>
+      </w:r>
+      <w:r>
+        <w:rPr>
+          <w:rFonts w:asciiTheme="majorBidi" w:hAnsiTheme="majorBidi" w:cstheme="majorBidi"/>
+          <w:color w:val="000000" w:themeColor="text1"/>
+          <w:lang w:val="en-IL"/>
+        </w:rPr>
+        <w:br/>
+      </w:r>
+      <w:r>
+        <w:rPr>
+          <w:rFonts w:asciiTheme="majorBidi" w:hAnsiTheme="majorBidi" w:cstheme="majorBidi"/>
+          <w:color w:val="000000" w:themeColor="text1"/>
+          <w:lang w:val="en-IL"/>
+        </w:rPr>
+        <w:t xml:space="preserve">The reason is your app is in </w:t>
+      </w:r>
+      <w:r>
+        <w:rPr>
+          <w:rFonts w:asciiTheme="majorBidi" w:hAnsiTheme="majorBidi" w:cstheme="majorBidi"/>
+          <w:b/>
+          <w:bCs/>
+          <w:color w:val="000000" w:themeColor="text1"/>
+          <w:lang w:val="en-IL"/>
+        </w:rPr>
+        <w:t>"Testing"</w:t>
+      </w:r>
+      <w:r>
+        <w:rPr>
+          <w:rFonts w:asciiTheme="majorBidi" w:hAnsiTheme="majorBidi" w:cstheme="majorBidi"/>
+          <w:color w:val="000000" w:themeColor="text1"/>
+          <w:lang w:val="en-IL"/>
+        </w:rPr>
+        <w:t xml:space="preserve"> </w:t>
+      </w:r>
+      <w:proofErr w:type="gramStart"/>
+      <w:r>
+        <w:rPr>
+          <w:rFonts w:asciiTheme="majorBidi" w:hAnsiTheme="majorBidi" w:cstheme="majorBidi"/>
+          <w:color w:val="000000" w:themeColor="text1"/>
+          <w:lang w:val="en-IL"/>
+        </w:rPr>
+        <w:t>mode</w:t>
+      </w:r>
+      <w:proofErr w:type="gramEnd"/>
+      <w:r>
+        <w:rPr>
+          <w:rFonts w:asciiTheme="majorBidi" w:hAnsiTheme="majorBidi" w:cstheme="majorBidi"/>
+          <w:color w:val="000000" w:themeColor="text1"/>
+          <w:lang w:val="en-IL"/>
+        </w:rPr>
+        <w:t xml:space="preserve"> and your Google account is not added as a test user.</w:t>
+      </w:r>
+    </w:p>
+    <w:p>
+      <w:pPr>
+        <w:ind w:left="360"/>
+        <w:rPr>
+          <w:rFonts w:asciiTheme="majorBidi" w:hAnsiTheme="majorBidi" w:cstheme="majorBidi"/>
+          <w:color w:val="000000" w:themeColor="text1"/>
+          <w:lang w:val="en-IL"/>
+        </w:rPr>
+      </w:pPr>
+      <w:r>
+        <w:rPr>
+          <w:rFonts w:asciiTheme="majorBidi" w:hAnsiTheme="majorBidi" w:cstheme="majorBidi"/>
+          <w:color w:val="000000" w:themeColor="text1"/>
+          <w:lang w:val="en-IL"/>
+        </w:rPr>
+        <w:t xml:space="preserve">To fix it do: </w:t>
+      </w:r>
+    </w:p>
+    <w:p>
+      <w:pPr>
+        <w:ind w:left="360"/>
+        <w:rPr>
+          <w:rFonts w:asciiTheme="majorBidi" w:hAnsiTheme="majorBidi" w:cstheme="majorBidi"/>
+          <w:color w:val="000000" w:themeColor="text1"/>
+          <w:lang w:val="en-IL"/>
+        </w:rPr>
+      </w:pPr>
+      <w:r>
+        <w:rPr>
+          <w:rFonts w:asciiTheme="majorBidi" w:hAnsiTheme="majorBidi" w:cstheme="majorBidi"/>
+          <w:color w:val="000000" w:themeColor="text1"/>
+          <w:lang w:val="en-IL"/>
+        </w:rPr>
+        <w:drawing>
+          <wp:inline distT="0" distB="0" distL="0" distR="0" wp14:anchorId="23C4D7B6" wp14:editId="48980C03">
+            <wp:extent cx="3561606" cy="1666693"/>
+            <wp:effectExtent l="0" t="0" r="1270" b="0"/>
+            <wp:docPr id="1779120856" name="Picture 1"/>
+            <wp:cNvGraphicFramePr>
+              <a:graphicFrameLocks xmlns:a="http://schemas.openxmlformats.org/drawingml/2006/main" noChangeAspect="1"/>
+            </wp:cNvGraphicFramePr>
+            <a:graphic xmlns:a="http://schemas.openxmlformats.org/drawingml/2006/main">
+              <a:graphicData uri="http://schemas.openxmlformats.org/drawingml/2006/picture">
+                <pic:pic xmlns:pic="http://schemas.openxmlformats.org/drawingml/2006/picture">
+                  <pic:nvPicPr>
+                    <pic:cNvPr id="1779120856" name=""/>
+                    <pic:cNvPicPr/>
+                  </pic:nvPicPr>
+                  <pic:blipFill>
+                    <a:blip r:embed="rId31"/>
+                    <a:stretch>
+                      <a:fillRect/>
+                    </a:stretch>
+                  </pic:blipFill>
+                  <pic:spPr>
+                    <a:xfrm>
+                      <a:off x="0" y="0"/>
+                      <a:ext cx="3568664" cy="1669996"/>
+                    </a:xfrm>
+                    <a:prstGeom prst="rect">
+                      <a:avLst/>
+                    </a:prstGeom>
+                  </pic:spPr>
+                </pic:pic>
+              </a:graphicData>
+            </a:graphic>
+          </wp:inline>
+        </w:drawing>
+      </w:r>
+    </w:p>
+    <w:p>
+      <w:pPr>
+        <w:ind w:left="360"/>
+        <w:rPr>
+          <w:rFonts w:asciiTheme="majorBidi" w:hAnsiTheme="majorBidi" w:cstheme="majorBidi"/>
+          <w:color w:val="000000" w:themeColor="text1"/>
+          <w:lang w:val="en-IL"/>
+        </w:rPr>
+      </w:pPr>
+      <w:r>
+        <w:rPr>
+          <w:rFonts w:asciiTheme="majorBidi" w:hAnsiTheme="majorBidi" w:cstheme="majorBidi"/>
+          <w:color w:val="000000" w:themeColor="text1"/>
+          <w:lang w:val="en-IL"/>
+        </w:rPr>
+        <w:lastRenderedPageBreak/>
+        <w:drawing>
+          <wp:inline distT="0" distB="0" distL="0" distR="0" wp14:anchorId="26FB20BB" wp14:editId="64D1E64D">
+            <wp:extent cx="5731510" cy="5341620"/>
+            <wp:effectExtent l="0" t="0" r="2540" b="0"/>
+            <wp:docPr id="634648024" name="Picture 1"/>
+            <wp:cNvGraphicFramePr>
+              <a:graphicFrameLocks xmlns:a="http://schemas.openxmlformats.org/drawingml/2006/main" noChangeAspect="1"/>
+            </wp:cNvGraphicFramePr>
+            <a:graphic xmlns:a="http://schemas.openxmlformats.org/drawingml/2006/main">
+              <a:graphicData uri="http://schemas.openxmlformats.org/drawingml/2006/picture">
+                <pic:pic xmlns:pic="http://schemas.openxmlformats.org/drawingml/2006/picture">
+                  <pic:nvPicPr>
+                    <pic:cNvPr id="634648024" name=""/>
+                    <pic:cNvPicPr/>
+                  </pic:nvPicPr>
+                  <pic:blipFill>
+                    <a:blip r:embed="rId32"/>
+                    <a:stretch>
+                      <a:fillRect/>
+                    </a:stretch>
+                  </pic:blipFill>
+                  <pic:spPr>
+                    <a:xfrm>
+                      <a:off x="0" y="0"/>
+                      <a:ext cx="5731510" cy="5341620"/>
+                    </a:xfrm>
+                    <a:prstGeom prst="rect">
+                      <a:avLst/>
+                    </a:prstGeom>
+                  </pic:spPr>
+                </pic:pic>
+              </a:graphicData>
+            </a:graphic>
+          </wp:inline>
+        </w:drawing>
+      </w:r>
+    </w:p>
+    <w:p>
+      <w:pPr>
+        <w:ind w:left="360"/>
+        <w:rPr>
+          <w:rFonts w:ascii="Courier New" w:hAnsi="Courier New" w:cs="Courier New"/>
+          <w:color w:val="000000" w:themeColor="text1"/>
+          <w:sz w:val="16"/>
+          <w:szCs w:val="16"/>
+          <w:lang w:val="en-IL"/>
+        </w:rPr>
+      </w:pPr>
+      <w:r>
+        <w:rPr>
+          <w:rFonts w:ascii="Courier New" w:hAnsi="Courier New" w:cs="Courier New"/>
+          <w:color w:val="000000" w:themeColor="text1"/>
+          <w:sz w:val="16"/>
+          <w:szCs w:val="16"/>
+          <w:lang w:val="en-IL"/>
+        </w:rPr>
+        <w:lastRenderedPageBreak/>
+        <w:drawing>
+          <wp:inline distT="0" distB="0" distL="0" distR="0" wp14:anchorId="6B7C7A2D" wp14:editId="2168090F">
+            <wp:extent cx="4344006" cy="7125694"/>
+            <wp:effectExtent l="0" t="0" r="0" b="0"/>
+            <wp:docPr id="436725855" name="Picture 1"/>
+            <wp:cNvGraphicFramePr>
+              <a:graphicFrameLocks xmlns:a="http://schemas.openxmlformats.org/drawingml/2006/main" noChangeAspect="1"/>
+            </wp:cNvGraphicFramePr>
+            <a:graphic xmlns:a="http://schemas.openxmlformats.org/drawingml/2006/main">
+              <a:graphicData uri="http://schemas.openxmlformats.org/drawingml/2006/picture">
+                <pic:pic xmlns:pic="http://schemas.openxmlformats.org/drawingml/2006/picture">
+                  <pic:nvPicPr>
+                    <pic:cNvPr id="436725855" name=""/>
+                    <pic:cNvPicPr/>
+                  </pic:nvPicPr>
+                  <pic:blipFill>
+                    <a:blip r:embed="rId33"/>
+                    <a:stretch>
+                      <a:fillRect/>
+                    </a:stretch>
+                  </pic:blipFill>
+                  <pic:spPr>
+                    <a:xfrm>
+                      <a:off x="0" y="0"/>
+                      <a:ext cx="4344006" cy="7125694"/>
+                    </a:xfrm>
+                    <a:prstGeom prst="rect">
+                      <a:avLst/>
+                    </a:prstGeom>
+                  </pic:spPr>
+                </pic:pic>
+              </a:graphicData>
+            </a:graphic>
+          </wp:inline>
+        </w:drawing>
+      </w:r>
+    </w:p>
+    <w:p>
+      <w:pPr>
+        <w:rPr>
+          <w:color w:val="000000" w:themeColor="text1"/>
+        </w:rPr>
+      </w:pPr>
+      <w:r>
+        <w:rPr>
+          <w:color w:val="000000" w:themeColor="text1"/>
+        </w:rPr>
+        <w:lastRenderedPageBreak/>
+        <w:drawing>
+          <wp:inline distT="0" distB="0" distL="0" distR="0" wp14:anchorId="13376DE3" wp14:editId="507F5EF4">
+            <wp:extent cx="2695951" cy="2353003"/>
+            <wp:effectExtent l="0" t="0" r="9525" b="9525"/>
+            <wp:docPr id="1455724051" name="Picture 1"/>
+            <wp:cNvGraphicFramePr>
+              <a:graphicFrameLocks xmlns:a="http://schemas.openxmlformats.org/drawingml/2006/main" noChangeAspect="1"/>
+            </wp:cNvGraphicFramePr>
+            <a:graphic xmlns:a="http://schemas.openxmlformats.org/drawingml/2006/main">
+              <a:graphicData uri="http://schemas.openxmlformats.org/drawingml/2006/picture">
+                <pic:pic xmlns:pic="http://schemas.openxmlformats.org/drawingml/2006/picture">
+                  <pic:nvPicPr>
+                    <pic:cNvPr id="1455724051" name=""/>
+                    <pic:cNvPicPr/>
+                  </pic:nvPicPr>
+                  <pic:blipFill>
+                    <a:blip r:embed="rId34"/>
+                    <a:stretch>
+                      <a:fillRect/>
+                    </a:stretch>
+                  </pic:blipFill>
+                  <pic:spPr>
+                    <a:xfrm>
+                      <a:off x="0" y="0"/>
+                      <a:ext cx="2695951" cy="2353003"/>
+                    </a:xfrm>
+                    <a:prstGeom prst="rect">
+                      <a:avLst/>
+                    </a:prstGeom>
+                  </pic:spPr>
+                </pic:pic>
+              </a:graphicData>
+            </a:graphic>
+          </wp:inline>
+        </w:drawing>
+      </w:r>
+    </w:p>
+    <w:p>
+      <w:pPr>
+        <w:rPr>
+          <w:rFonts w:ascii="Courier New" w:hAnsi="Courier New" w:cs="Courier New"/>
+          <w:color w:val="000000" w:themeColor="text1"/>
+        </w:rPr>
+      </w:pPr>
+      <w:r>
+        <w:rPr>
+          <w:color w:val="000000" w:themeColor="text1"/>
+        </w:rPr>
+        <w:t xml:space="preserve">Run python module again: </w:t>
+      </w:r>
+      <w:r>
+        <w:rPr>
+          <w:color w:val="000000" w:themeColor="text1"/>
+        </w:rPr>
+        <w:br/>
+      </w:r>
+      <w:r>
+        <w:rPr>
+          <w:rFonts w:ascii="Courier New" w:hAnsi="Courier New" w:cs="Courier New"/>
+          <w:color w:val="000000" w:themeColor="text1"/>
+        </w:rPr>
+        <w:t xml:space="preserve">python -m </w:t>
+      </w:r>
+      <w:proofErr w:type="spellStart"/>
+      <w:r>
+        <w:rPr>
+          <w:rFonts w:ascii="Courier New" w:hAnsi="Courier New" w:cs="Courier New"/>
+          <w:color w:val="000000" w:themeColor="text1"/>
+        </w:rPr>
+        <w:t>src.calendar_checker</w:t>
+      </w:r>
+      <w:proofErr w:type="spellEnd"/>
+    </w:p>
+    <w:p>
+      <w:pPr>
+        <w:rPr>
+          <w:color w:val="000000" w:themeColor="text1"/>
+        </w:rPr>
+      </w:pPr>
+      <w:r>
+        <w:rPr>
+          <w:color w:val="000000" w:themeColor="text1"/>
+        </w:rPr>
+        <w:drawing>
+          <wp:inline distT="0" distB="0" distL="0" distR="0" wp14:anchorId="56C483EA" wp14:editId="70F73BA3">
+            <wp:extent cx="5731510" cy="1965325"/>
+            <wp:effectExtent l="0" t="0" r="2540" b="0"/>
+            <wp:docPr id="1164645592" name="Picture 1"/>
+            <wp:cNvGraphicFramePr>
+              <a:graphicFrameLocks xmlns:a="http://schemas.openxmlformats.org/drawingml/2006/main" noChangeAspect="1"/>
+            </wp:cNvGraphicFramePr>
+            <a:graphic xmlns:a="http://schemas.openxmlformats.org/drawingml/2006/main">
+              <a:graphicData uri="http://schemas.openxmlformats.org/drawingml/2006/picture">
+                <pic:pic xmlns:pic="http://schemas.openxmlformats.org/drawingml/2006/picture">
+                  <pic:nvPicPr>
+                    <pic:cNvPr id="1164645592" name=""/>
+                    <pic:cNvPicPr/>
+                  </pic:nvPicPr>
+                  <pic:blipFill>
+                    <a:blip r:embed="rId35"/>
+                    <a:stretch>
+                      <a:fillRect/>
+                    </a:stretch>
+                  </pic:blipFill>
+                  <pic:spPr>
+                    <a:xfrm>
+                      <a:off x="0" y="0"/>
+                      <a:ext cx="5731510" cy="1965325"/>
+                    </a:xfrm>
+                    <a:prstGeom prst="rect">
+                      <a:avLst/>
+                    </a:prstGeom>
+                  </pic:spPr>
+                </pic:pic>
+              </a:graphicData>
+            </a:graphic>
+          </wp:inline>
+        </w:drawing>
+      </w:r>
+    </w:p>
+    <w:p>
+      <w:pPr>
+        <w:rPr>
+          <w:color w:val="000000" w:themeColor="text1"/>
+        </w:rPr>
+      </w:pPr>
+      <w:r>
+        <w:rPr>
+          <w:color w:val="000000" w:themeColor="text1"/>
+        </w:rPr>
+        <w:drawing>
+          <wp:inline distT="0" distB="0" distL="0" distR="0" wp14:anchorId="0899A26C" wp14:editId="561CE252">
+            <wp:extent cx="5731510" cy="483870"/>
+            <wp:effectExtent l="0" t="0" r="2540" b="0"/>
+            <wp:docPr id="1049524725" name="Picture 1"/>
+            <wp:cNvGraphicFramePr>
+              <a:graphicFrameLocks xmlns:a="http://schemas.openxmlformats.org/drawingml/2006/main" noChangeAspect="1"/>
+            </wp:cNvGraphicFramePr>
+            <a:graphic xmlns:a="http://schemas.openxmlformats.org/drawingml/2006/main">
+              <a:graphicData uri="http://schemas.openxmlformats.org/drawingml/2006/picture">
+                <pic:pic xmlns:pic="http://schemas.openxmlformats.org/drawingml/2006/picture">
+                  <pic:nvPicPr>
+                    <pic:cNvPr id="1049524725" name=""/>
+                    <pic:cNvPicPr/>
+                  </pic:nvPicPr>
+                  <pic:blipFill>
+                    <a:blip r:embed="rId36"/>
+                    <a:stretch>
+                      <a:fillRect/>
+                    </a:stretch>
+                  </pic:blipFill>
+                  <pic:spPr>
+                    <a:xfrm>
+                      <a:off x="0" y="0"/>
+                      <a:ext cx="5731510" cy="483870"/>
+                    </a:xfrm>
+                    <a:prstGeom prst="rect">
+                      <a:avLst/>
+                    </a:prstGeom>
+                  </pic:spPr>
+                </pic:pic>
+              </a:graphicData>
+            </a:graphic>
+          </wp:inline>
+        </w:drawing>
+      </w:r>
+    </w:p>
+    <w:p>
+      <w:pPr>
+        <w:rPr>
+          <w:color w:val="000000" w:themeColor="text1"/>
+        </w:rPr>
+      </w:pPr>
+    </w:p>
+    <w:p>
+      <w:pPr>
+        <w:rPr>
+          <w:color w:val="000000" w:themeColor="text1"/>
+          <w:lang w:val="en-US"/>
+        </w:rPr>
+      </w:pPr>
+      <w:r>
+        <w:rPr>
+          <w:color w:val="000000" w:themeColor="text1"/>
+        </w:rPr>
+        <w:t>Click on “</w:t>
+      </w:r>
+      <w:r>
+        <w:rPr>
+          <w:rFonts w:hint="cs"/>
+          <w:color w:val="000000" w:themeColor="text1"/>
+          <w:rtl/>
+        </w:rPr>
+        <w:t>המשך</w:t>
+      </w:r>
+      <w:r>
+        <w:rPr>
+          <w:color w:val="000000" w:themeColor="text1"/>
+          <w:lang w:val="en-US"/>
+        </w:rPr>
+        <w:t>”</w:t>
+      </w:r>
+    </w:p>
+    <w:p>
+      <w:pPr>
+        <w:rPr>
+          <w:color w:val="000000" w:themeColor="text1"/>
+          <w:lang w:val="en-US"/>
+        </w:rPr>
+      </w:pPr>
+      <w:r>
+        <w:rPr>
+          <w:color w:val="000000" w:themeColor="text1"/>
+          <w:lang w:val="en-US"/>
+        </w:rPr>
+        <w:lastRenderedPageBreak/>
+        <w:drawing>
+          <wp:inline distT="0" distB="0" distL="0" distR="0" wp14:anchorId="7EA0A70D" wp14:editId="42AF10A1">
+            <wp:extent cx="5731510" cy="3351530"/>
+            <wp:effectExtent l="0" t="0" r="2540" b="1270"/>
+            <wp:docPr id="463574609" name="Picture 1"/>
+            <wp:cNvGraphicFramePr>
+              <a:graphicFrameLocks xmlns:a="http://schemas.openxmlformats.org/drawingml/2006/main" noChangeAspect="1"/>
+            </wp:cNvGraphicFramePr>
+            <a:graphic xmlns:a="http://schemas.openxmlformats.org/drawingml/2006/main">
+              <a:graphicData uri="http://schemas.openxmlformats.org/drawingml/2006/picture">
+                <pic:pic xmlns:pic="http://schemas.openxmlformats.org/drawingml/2006/picture">
+                  <pic:nvPicPr>
+                    <pic:cNvPr id="463574609" name=""/>
+                    <pic:cNvPicPr/>
+                  </pic:nvPicPr>
+                  <pic:blipFill>
+                    <a:blip r:embed="rId37"/>
+                    <a:stretch>
+                      <a:fillRect/>
+                    </a:stretch>
+                  </pic:blipFill>
+                  <pic:spPr>
+                    <a:xfrm>
+                      <a:off x="0" y="0"/>
+                      <a:ext cx="5731510" cy="3351530"/>
+                    </a:xfrm>
+                    <a:prstGeom prst="rect">
+                      <a:avLst/>
+                    </a:prstGeom>
+                  </pic:spPr>
+                </pic:pic>
+              </a:graphicData>
+            </a:graphic>
+          </wp:inline>
+        </w:drawing>
+      </w:r>
+    </w:p>
+    <w:p>
+      <w:pPr>
+        <w:rPr>
+          <w:color w:val="000000" w:themeColor="text1"/>
+          <w:lang w:val="en-US"/>
+        </w:rPr>
+      </w:pPr>
+      <w:r>
+        <w:rPr>
+          <w:color w:val="000000" w:themeColor="text1"/>
+        </w:rPr>
+        <w:t>Click on “</w:t>
+      </w:r>
+      <w:r>
+        <w:rPr>
+          <w:rFonts w:hint="cs"/>
+          <w:color w:val="000000" w:themeColor="text1"/>
+          <w:rtl/>
+        </w:rPr>
+        <w:t>המשך</w:t>
+      </w:r>
+      <w:r>
+        <w:rPr>
+          <w:color w:val="000000" w:themeColor="text1"/>
+          <w:lang w:val="en-US"/>
+        </w:rPr>
+        <w:t>”</w:t>
+      </w:r>
+    </w:p>
+    <w:p>
+      <w:pPr>
+        <w:rPr>
+          <w:color w:val="000000" w:themeColor="text1"/>
+          <w:lang w:val="en-US"/>
+        </w:rPr>
+      </w:pPr>
+      <w:r>
+        <w:rPr>
+          <w:color w:val="000000" w:themeColor="text1"/>
+          <w:lang w:val="en-US"/>
+        </w:rPr>
+        <w:drawing>
+          <wp:inline distT="0" distB="0" distL="0" distR="0" wp14:anchorId="33909406" wp14:editId="1424D8F8">
+            <wp:extent cx="5731510" cy="627380"/>
+            <wp:effectExtent l="0" t="0" r="2540" b="1270"/>
+            <wp:docPr id="471161724" name="Picture 1"/>
+            <wp:cNvGraphicFramePr>
+              <a:graphicFrameLocks xmlns:a="http://schemas.openxmlformats.org/drawingml/2006/main" noChangeAspect="1"/>
+            </wp:cNvGraphicFramePr>
+            <a:graphic xmlns:a="http://schemas.openxmlformats.org/drawingml/2006/main">
+              <a:graphicData uri="http://schemas.openxmlformats.org/drawingml/2006/picture">
+                <pic:pic xmlns:pic="http://schemas.openxmlformats.org/drawingml/2006/picture">
+                  <pic:nvPicPr>
+                    <pic:cNvPr id="471161724" name=""/>
+                    <pic:cNvPicPr/>
+                  </pic:nvPicPr>
+                  <pic:blipFill>
+                    <a:blip r:embed="rId38"/>
+                    <a:stretch>
+                      <a:fillRect/>
+                    </a:stretch>
+                  </pic:blipFill>
+                  <pic:spPr>
+                    <a:xfrm>
+                      <a:off x="0" y="0"/>
+                      <a:ext cx="5731510" cy="627380"/>
+                    </a:xfrm>
+                    <a:prstGeom prst="rect">
+                      <a:avLst/>
+                    </a:prstGeom>
+                  </pic:spPr>
+                </pic:pic>
+              </a:graphicData>
+            </a:graphic>
+          </wp:inline>
+        </w:drawing>
+      </w:r>
+    </w:p>
+    <w:p>
+      <w:pPr>
+        <w:rPr>
+          <w:color w:val="000000" w:themeColor="text1"/>
+          <w:lang w:val="en-US"/>
+        </w:rPr>
+      </w:pPr>
+      <w:r>
+        <w:rPr>
+          <w:color w:val="000000" w:themeColor="text1"/>
+          <w:lang w:val="en-US"/>
+        </w:rPr>
+        <w:t>This message me</w:t>
+      </w:r>
+      <w:r>
+        <w:rPr>
+          <w:color w:val="000000" w:themeColor="text1"/>
+          <w:lang w:val="en-US"/>
+        </w:rPr>
+        <w:t>ans</w:t>
+      </w:r>
+      <w:r>
+        <w:rPr>
+          <w:color w:val="000000" w:themeColor="text1"/>
+          <w:lang w:val="en-US"/>
+        </w:rPr>
+        <w:t xml:space="preserve">: </w:t>
+      </w:r>
+    </w:p>
+    <w:p>
+      <w:pPr>
+        <w:rPr>
+          <w:color w:val="000000" w:themeColor="text1"/>
+          <w:lang w:val="en-US"/>
+        </w:rPr>
+      </w:pPr>
+      <w:r>
+        <w:rPr>
+          <w:color w:val="000000" w:themeColor="text1"/>
+          <w:lang w:val="en-US"/>
+        </w:rPr>
+        <w:drawing>
+          <wp:inline distT="0" distB="0" distL="0" distR="0" wp14:anchorId="7892E451" wp14:editId="45EB4722">
+            <wp:extent cx="5731510" cy="2472690"/>
+            <wp:effectExtent l="0" t="0" r="2540" b="3810"/>
+            <wp:docPr id="466102943" name="Picture 1"/>
+            <wp:cNvGraphicFramePr>
+              <a:graphicFrameLocks xmlns:a="http://schemas.openxmlformats.org/drawingml/2006/main" noChangeAspect="1"/>
+            </wp:cNvGraphicFramePr>
+            <a:graphic xmlns:a="http://schemas.openxmlformats.org/drawingml/2006/main">
+              <a:graphicData uri="http://schemas.openxmlformats.org/drawingml/2006/picture">
+                <pic:pic xmlns:pic="http://schemas.openxmlformats.org/drawingml/2006/picture">
+                  <pic:nvPicPr>
+                    <pic:cNvPr id="466102943" name=""/>
+                    <pic:cNvPicPr/>
+                  </pic:nvPicPr>
+                  <pic:blipFill>
+                    <a:blip r:embed="rId39"/>
+                    <a:stretch>
+                      <a:fillRect/>
+                    </a:stretch>
+                  </pic:blipFill>
+                  <pic:spPr>
+                    <a:xfrm>
+                      <a:off x="0" y="0"/>
+                      <a:ext cx="5731510" cy="2472690"/>
+                    </a:xfrm>
+                    <a:prstGeom prst="rect">
+                      <a:avLst/>
+                    </a:prstGeom>
+                  </pic:spPr>
+                </pic:pic>
+              </a:graphicData>
+            </a:graphic>
+          </wp:inline>
+        </w:drawing>
+      </w:r>
+    </w:p>
+    <w:p>
+      <w:pPr>
+        <w:rPr>
+          <w:color w:val="000000" w:themeColor="text1"/>
+          <w:lang w:val="en-US"/>
+        </w:rPr>
+      </w:pPr>
+      <w:r>
+        <w:rPr>
+          <w:color w:val="000000" w:themeColor="text1"/>
+          <w:lang w:val="en-US"/>
+        </w:rPr>
+        <w:t xml:space="preserve">In PyCharm we get this: </w:t>
+      </w:r>
+    </w:p>
+    <w:p>
+      <w:pPr>
+        <w:rPr>
+          <w:color w:val="000000" w:themeColor="text1"/>
+          <w:lang w:val="en-US"/>
+        </w:rPr>
+      </w:pPr>
+      <w:r>
+        <w:rPr>
+          <w:color w:val="000000" w:themeColor="text1"/>
+          <w:lang w:val="en-US"/>
+        </w:rPr>
+        <w:drawing>
+          <wp:inline distT="0" distB="0" distL="0" distR="0" wp14:anchorId="7BF5282C" wp14:editId="6D74CF0B">
+            <wp:extent cx="5731510" cy="792480"/>
+            <wp:effectExtent l="0" t="0" r="2540" b="7620"/>
+            <wp:docPr id="1242104701" name="Picture 1"/>
+            <wp:cNvGraphicFramePr>
+              <a:graphicFrameLocks xmlns:a="http://schemas.openxmlformats.org/drawingml/2006/main" noChangeAspect="1"/>
+            </wp:cNvGraphicFramePr>
+            <a:graphic xmlns:a="http://schemas.openxmlformats.org/drawingml/2006/main">
+              <a:graphicData uri="http://schemas.openxmlformats.org/drawingml/2006/picture">
+                <pic:pic xmlns:pic="http://schemas.openxmlformats.org/drawingml/2006/picture">
+                  <pic:nvPicPr>
+                    <pic:cNvPr id="1242104701" name=""/>
+                    <pic:cNvPicPr/>
+                  </pic:nvPicPr>
+                  <pic:blipFill>
+                    <a:blip r:embed="rId40"/>
+                    <a:stretch>
+                      <a:fillRect/>
+                    </a:stretch>
+                  </pic:blipFill>
+                  <pic:spPr>
+                    <a:xfrm>
+                      <a:off x="0" y="0"/>
+                      <a:ext cx="5731510" cy="792480"/>
+                    </a:xfrm>
+                    <a:prstGeom prst="rect">
+                      <a:avLst/>
+                    </a:prstGeom>
+                  </pic:spPr>
+                </pic:pic>
+              </a:graphicData>
+            </a:graphic>
+          </wp:inline>
+        </w:drawing>
+      </w:r>
+    </w:p>
+    <w:p>
+      <w:pPr>
+        <w:rPr>
+          <w:color w:val="000000" w:themeColor="text1"/>
+          <w:lang w:val="en-US"/>
+        </w:rPr>
+      </w:pPr>
+      <w:r>
+        <w:rPr>
+          <w:color w:val="000000" w:themeColor="text1"/>
+          <w:lang w:val="en-US"/>
+        </w:rPr>
+        <w:lastRenderedPageBreak/>
+        <w:drawing>
+          <wp:inline distT="0" distB="0" distL="0" distR="0" wp14:anchorId="3E16AE52" wp14:editId="072A4E05">
+            <wp:extent cx="4467849" cy="1733792"/>
+            <wp:effectExtent l="0" t="0" r="9525" b="0"/>
+            <wp:docPr id="437785267" name="Picture 1"/>
+            <wp:cNvGraphicFramePr>
+              <a:graphicFrameLocks xmlns:a="http://schemas.openxmlformats.org/drawingml/2006/main" noChangeAspect="1"/>
+            </wp:cNvGraphicFramePr>
+            <a:graphic xmlns:a="http://schemas.openxmlformats.org/drawingml/2006/main">
+              <a:graphicData uri="http://schemas.openxmlformats.org/drawingml/2006/picture">
+                <pic:pic xmlns:pic="http://schemas.openxmlformats.org/drawingml/2006/picture">
+                  <pic:nvPicPr>
+                    <pic:cNvPr id="437785267" name=""/>
+                    <pic:cNvPicPr/>
+                  </pic:nvPicPr>
+                  <pic:blipFill>
+                    <a:blip r:embed="rId41"/>
+                    <a:stretch>
+                      <a:fillRect/>
+                    </a:stretch>
+                  </pic:blipFill>
+                  <pic:spPr>
+                    <a:xfrm>
+                      <a:off x="0" y="0"/>
+                      <a:ext cx="4467849" cy="1733792"/>
+                    </a:xfrm>
+                    <a:prstGeom prst="rect">
+                      <a:avLst/>
+                    </a:prstGeom>
+                  </pic:spPr>
+                </pic:pic>
+              </a:graphicData>
+            </a:graphic>
+          </wp:inline>
+        </w:drawing>
+      </w:r>
+    </w:p>
+    <w:p>
+      <w:pPr>
+        <w:rPr>
+          <w:color w:val="000000" w:themeColor="text1"/>
+          <w:lang w:val="en-US"/>
+        </w:rPr>
+      </w:pPr>
+    </w:p>
+    <w:p>
+      <w:pPr>
+        <w:rPr>
+          <w:color w:val="000000" w:themeColor="text1"/>
+          <w:lang w:val="en-US"/>
+        </w:rPr>
+      </w:pPr>
+      <w:r>
+        <w:rPr>
+          <w:color w:val="000000" w:themeColor="text1"/>
+          <w:lang w:val="en-US"/>
+        </w:rPr>
+        <w:t xml:space="preserve">As we can see – created </w:t>
+      </w:r>
+      <w:proofErr w:type="spellStart"/>
+      <w:proofErr w:type="gramStart"/>
+      <w:r>
+        <w:rPr>
+          <w:b/>
+          <w:bCs/>
+          <w:color w:val="000000" w:themeColor="text1"/>
+          <w:lang w:val="en-US"/>
+        </w:rPr>
+        <w:t>token.json</w:t>
+      </w:r>
+      <w:proofErr w:type="spellEnd"/>
+      <w:proofErr w:type="gramEnd"/>
+      <w:r>
+        <w:rPr>
+          <w:color w:val="000000" w:themeColor="text1"/>
+          <w:lang w:val="en-US"/>
+        </w:rPr>
+        <w:t xml:space="preserve"> in our project</w:t>
+      </w:r>
+    </w:p>
+    <w:p>
+      <w:pPr>
+        <w:rPr>
+          <w:color w:val="000000" w:themeColor="text1"/>
+          <w:lang w:val="en-US"/>
+        </w:rPr>
+      </w:pPr>
+      <w:r>
+        <w:rPr>
+          <w:color w:val="000000" w:themeColor="text1"/>
+          <w:lang w:val="en-US"/>
+        </w:rPr>
+        <w:drawing>
+          <wp:inline distT="0" distB="0" distL="0" distR="0" wp14:anchorId="07AED5B3" wp14:editId="2EB19EAE">
+            <wp:extent cx="1985499" cy="2078934"/>
+            <wp:effectExtent l="0" t="0" r="0" b="0"/>
+            <wp:docPr id="777021673" name="Picture 1"/>
+            <wp:cNvGraphicFramePr>
+              <a:graphicFrameLocks xmlns:a="http://schemas.openxmlformats.org/drawingml/2006/main" noChangeAspect="1"/>
+            </wp:cNvGraphicFramePr>
+            <a:graphic xmlns:a="http://schemas.openxmlformats.org/drawingml/2006/main">
+              <a:graphicData uri="http://schemas.openxmlformats.org/drawingml/2006/picture">
+                <pic:pic xmlns:pic="http://schemas.openxmlformats.org/drawingml/2006/picture">
+                  <pic:nvPicPr>
+                    <pic:cNvPr id="777021673" name=""/>
+                    <pic:cNvPicPr/>
+                  </pic:nvPicPr>
+                  <pic:blipFill>
+                    <a:blip r:embed="rId42"/>
+                    <a:stretch>
+                      <a:fillRect/>
+                    </a:stretch>
+                  </pic:blipFill>
+                  <pic:spPr>
+                    <a:xfrm>
+                      <a:off x="0" y="0"/>
+                      <a:ext cx="1992088" cy="2085833"/>
+                    </a:xfrm>
+                    <a:prstGeom prst="rect">
+                      <a:avLst/>
+                    </a:prstGeom>
+                  </pic:spPr>
+                </pic:pic>
+              </a:graphicData>
+            </a:graphic>
+          </wp:inline>
+        </w:drawing>
+      </w:r>
+    </w:p>
+    <w:p>
+      <w:pPr>
+        <w:rPr>
+          <w:color w:val="000000" w:themeColor="text1"/>
+          <w:lang w:val="en-US"/>
+        </w:rPr>
+      </w:pPr>
+      <w:r>
+        <w:rPr>
+          <w:color w:val="000000" w:themeColor="text1"/>
+          <w:lang w:val="en-US"/>
+        </w:rPr>
+        <w:t xml:space="preserve">If we </w:t>
+      </w:r>
+      <w:proofErr w:type="gramStart"/>
+      <w:r>
+        <w:rPr>
+          <w:color w:val="000000" w:themeColor="text1"/>
+          <w:lang w:val="en-US"/>
+        </w:rPr>
+        <w:t>re run</w:t>
+      </w:r>
+      <w:proofErr w:type="gramEnd"/>
+      <w:r>
+        <w:rPr>
+          <w:color w:val="000000" w:themeColor="text1"/>
+          <w:lang w:val="en-US"/>
+        </w:rPr>
+        <w:t xml:space="preserve"> the python app again, the authentication </w:t>
+      </w:r>
+      <w:r>
+        <w:rPr>
+          <w:b/>
+          <w:bCs/>
+          <w:color w:val="000000" w:themeColor="text1"/>
+          <w:lang w:val="en-US"/>
+        </w:rPr>
+        <w:t>will not be done</w:t>
+      </w:r>
+      <w:r>
+        <w:rPr>
+          <w:color w:val="000000" w:themeColor="text1"/>
+          <w:lang w:val="en-US"/>
+        </w:rPr>
+        <w:t xml:space="preserve">, will be used </w:t>
+      </w:r>
+      <w:proofErr w:type="spellStart"/>
+      <w:proofErr w:type="gramStart"/>
+      <w:r>
+        <w:rPr>
+          <w:b/>
+          <w:bCs/>
+          <w:color w:val="000000" w:themeColor="text1"/>
+          <w:lang w:val="en-US"/>
+        </w:rPr>
+        <w:t>token.json</w:t>
+      </w:r>
+      <w:proofErr w:type="spellEnd"/>
+      <w:proofErr w:type="gramEnd"/>
+      <w:r>
+        <w:rPr>
+          <w:color w:val="000000" w:themeColor="text1"/>
+          <w:lang w:val="en-US"/>
+        </w:rPr>
+        <w:t xml:space="preserve"> for login. </w:t>
+      </w:r>
+      <w:r>
+        <w:rPr>
+          <w:color w:val="000000" w:themeColor="text1"/>
+          <w:lang w:val="en-US"/>
+        </w:rPr>
+        <w:t xml:space="preserve">The </w:t>
+      </w:r>
+      <w:proofErr w:type="gramStart"/>
+      <w:r>
+        <w:rPr>
+          <w:color w:val="000000" w:themeColor="text1"/>
+          <w:lang w:val="en-US"/>
+        </w:rPr>
+        <w:t>starting</w:t>
+      </w:r>
+      <w:proofErr w:type="gramEnd"/>
+      <w:r>
+        <w:rPr>
+          <w:color w:val="000000" w:themeColor="text1"/>
+          <w:lang w:val="en-US"/>
+        </w:rPr>
+        <w:t xml:space="preserve"> of the app will be very fast.</w:t>
+      </w:r>
+    </w:p>
+    <w:p>
+      <w:pPr>
+        <w:rPr>
+          <w:color w:val="000000" w:themeColor="text1"/>
+          <w:lang w:val="en-US"/>
+        </w:rPr>
+      </w:pPr>
+      <w:r>
+        <w:rPr>
+          <w:color w:val="000000" w:themeColor="text1"/>
+          <w:lang w:val="en-US"/>
+        </w:rPr>
+        <w:t xml:space="preserve">Take a look: </w:t>
+      </w:r>
+    </w:p>
+    <w:p>
+      <w:pPr>
+        <w:rPr>
+          <w:color w:val="000000" w:themeColor="text1"/>
+          <w:lang w:val="en-US"/>
+        </w:rPr>
+      </w:pPr>
+      <w:r>
+        <w:rPr>
+          <w:color w:val="000000" w:themeColor="text1"/>
+          <w:lang w:val="en-US"/>
+        </w:rPr>
+        <w:drawing>
+          <wp:inline distT="0" distB="0" distL="0" distR="0" wp14:anchorId="065327C2" wp14:editId="04716341">
+            <wp:extent cx="5731510" cy="521335"/>
+            <wp:effectExtent l="0" t="0" r="2540" b="0"/>
+            <wp:docPr id="1600299580" name="Picture 1"/>
+            <wp:cNvGraphicFramePr>
+              <a:graphicFrameLocks xmlns:a="http://schemas.openxmlformats.org/drawingml/2006/main" noChangeAspect="1"/>
+            </wp:cNvGraphicFramePr>
+            <a:graphic xmlns:a="http://schemas.openxmlformats.org/drawingml/2006/main">
+              <a:graphicData uri="http://schemas.openxmlformats.org/drawingml/2006/picture">
+                <pic:pic xmlns:pic="http://schemas.openxmlformats.org/drawingml/2006/picture">
+                  <pic:nvPicPr>
+                    <pic:cNvPr id="1600299580" name=""/>
+                    <pic:cNvPicPr/>
+                  </pic:nvPicPr>
+                  <pic:blipFill>
+                    <a:blip r:embed="rId43"/>
+                    <a:stretch>
+                      <a:fillRect/>
+                    </a:stretch>
+                  </pic:blipFill>
+                  <pic:spPr>
+                    <a:xfrm>
+                      <a:off x="0" y="0"/>
+                      <a:ext cx="5731510" cy="521335"/>
+                    </a:xfrm>
+                    <a:prstGeom prst="rect">
+                      <a:avLst/>
+                    </a:prstGeom>
+                  </pic:spPr>
+                </pic:pic>
+              </a:graphicData>
+            </a:graphic>
+          </wp:inline>
+        </w:drawing>
+      </w:r>
+    </w:p>
+    <w:p>
+      <w:pPr>
+        <w:rPr>
+          <w:color w:val="000000" w:themeColor="text1"/>
+          <w:lang w:val="en-US"/>
+        </w:rPr>
+      </w:pPr>
+      <w:r>
+        <w:rPr>
+          <w:color w:val="000000" w:themeColor="text1"/>
+          <w:lang w:val="en-US"/>
+        </w:rPr>
+        <w:t xml:space="preserve">My next </w:t>
+      </w:r>
+      <w:r>
+        <w:rPr>
+          <w:color w:val="000000" w:themeColor="text1"/>
+          <w:lang w:val="en-US"/>
+        </w:rPr>
+        <w:t>steps are</w:t>
+      </w:r>
+      <w:r>
+        <w:rPr>
+          <w:color w:val="000000" w:themeColor="text1"/>
+          <w:lang w:val="en-US"/>
+        </w:rPr>
+        <w:t xml:space="preserve">: </w:t>
+      </w:r>
+    </w:p>
+    <w:p>
+      <w:pPr>
+        <w:rPr>
+          <w:color w:val="000000" w:themeColor="text1"/>
+          <w:lang w:val="en-US"/>
+        </w:rPr>
+      </w:pPr>
+      <w:r>
+        <w:rPr>
+          <w:color w:val="000000" w:themeColor="text1"/>
+          <w:lang w:val="en-US"/>
+        </w:rPr>
+        <w:drawing>
+          <wp:inline distT="0" distB="0" distL="0" distR="0" wp14:anchorId="28923E79" wp14:editId="0D736DA5">
+            <wp:extent cx="4648849" cy="743054"/>
+            <wp:effectExtent l="0" t="0" r="0" b="0"/>
+            <wp:docPr id="1610875197" name="Picture 1"/>
+            <wp:cNvGraphicFramePr>
+              <a:graphicFrameLocks xmlns:a="http://schemas.openxmlformats.org/drawingml/2006/main" noChangeAspect="1"/>
+            </wp:cNvGraphicFramePr>
+            <a:graphic xmlns:a="http://schemas.openxmlformats.org/drawingml/2006/main">
+              <a:graphicData uri="http://schemas.openxmlformats.org/drawingml/2006/picture">
+                <pic:pic xmlns:pic="http://schemas.openxmlformats.org/drawingml/2006/picture">
+                  <pic:nvPicPr>
+                    <pic:cNvPr id="1610875197" name=""/>
+                    <pic:cNvPicPr/>
+                  </pic:nvPicPr>
+                  <pic:blipFill>
+                    <a:blip r:embed="rId44"/>
+                    <a:stretch>
+                      <a:fillRect/>
+                    </a:stretch>
+                  </pic:blipFill>
+                  <pic:spPr>
+                    <a:xfrm>
+                      <a:off x="0" y="0"/>
+                      <a:ext cx="4648849" cy="743054"/>
+                    </a:xfrm>
+                    <a:prstGeom prst="rect">
+                      <a:avLst/>
+                    </a:prstGeom>
+                  </pic:spPr>
+                </pic:pic>
+              </a:graphicData>
+            </a:graphic>
+          </wp:inline>
+        </w:drawing>
+      </w:r>
+    </w:p>
+    <w:p>
+      <w:pPr>
+        <w:rPr>
+          <w:color w:val="000000" w:themeColor="text1"/>
+          <w:lang w:val="en-US"/>
+        </w:rPr>
+      </w:pPr>
+    </w:p>
+    <w:p>
+      <w:pPr>
+        <w:pStyle w:val="ListParagraph"/>
+        <w:numPr>
+          <w:ilvl w:val="0"/>
+          <w:numId w:val="5"/>
+        </w:numPr>
+        <w:rPr>
+          <w:b/>
+          <w:bCs/>
+          <w:color w:val="000000" w:themeColor="text1"/>
+        </w:rPr>
+      </w:pPr>
+      <w:r>
+        <w:rPr>
+          <w:b/>
+          <w:bCs/>
+          <w:color w:val="000000" w:themeColor="text1"/>
+        </w:rPr>
+        <w:t xml:space="preserve">Recording the voice: </w:t>
+      </w:r>
+    </w:p>
+    <w:p>
+      <w:pPr>
+        <w:ind w:left="360"/>
+        <w:rPr>
+          <w:b/>
+          <w:bCs/>
+          <w:color w:val="000000" w:themeColor="text1"/>
+        </w:rPr>
+      </w:pPr>
+      <w:r>
+        <w:rPr>
+          <w:b/>
+          <w:bCs/>
+          <w:color w:val="000000" w:themeColor="text1"/>
+        </w:rPr>
+        <w:lastRenderedPageBreak/>
+        <w:drawing>
+          <wp:inline distT="0" distB="0" distL="0" distR="0" wp14:anchorId="3E88F72F" wp14:editId="25DDE216">
+            <wp:extent cx="5731510" cy="4657725"/>
+            <wp:effectExtent l="0" t="0" r="2540" b="9525"/>
+            <wp:docPr id="451395763" name="Picture 1"/>
+            <wp:cNvGraphicFramePr>
+              <a:graphicFrameLocks xmlns:a="http://schemas.openxmlformats.org/drawingml/2006/main" noChangeAspect="1"/>
+            </wp:cNvGraphicFramePr>
+            <a:graphic xmlns:a="http://schemas.openxmlformats.org/drawingml/2006/main">
+              <a:graphicData uri="http://schemas.openxmlformats.org/drawingml/2006/picture">
+                <pic:pic xmlns:pic="http://schemas.openxmlformats.org/drawingml/2006/picture">
+                  <pic:nvPicPr>
+                    <pic:cNvPr id="451395763" name=""/>
+                    <pic:cNvPicPr/>
+                  </pic:nvPicPr>
+                  <pic:blipFill>
+                    <a:blip r:embed="rId45"/>
+                    <a:stretch>
+                      <a:fillRect/>
+                    </a:stretch>
+                  </pic:blipFill>
+                  <pic:spPr>
+                    <a:xfrm>
+                      <a:off x="0" y="0"/>
+                      <a:ext cx="5731510" cy="4657725"/>
+                    </a:xfrm>
+                    <a:prstGeom prst="rect">
+                      <a:avLst/>
+                    </a:prstGeom>
+                  </pic:spPr>
+                </pic:pic>
+              </a:graphicData>
+            </a:graphic>
+          </wp:inline>
+        </w:drawing>
+      </w:r>
+    </w:p>
+    <w:p>
+      <w:pPr>
+        <w:ind w:left="360"/>
+        <w:rPr>
+          <w:b/>
+          <w:bCs/>
+          <w:color w:val="000000" w:themeColor="text1"/>
+        </w:rPr>
+      </w:pPr>
+      <w:r>
+        <w:rPr>
+          <w:b/>
+          <w:bCs/>
+          <w:color w:val="000000" w:themeColor="text1"/>
+        </w:rPr>
+        <w:drawing>
+          <wp:inline distT="0" distB="0" distL="0" distR="0" wp14:anchorId="19B3CB87" wp14:editId="6CA65E9D">
+            <wp:extent cx="5731510" cy="2624455"/>
+            <wp:effectExtent l="0" t="0" r="2540" b="4445"/>
+            <wp:docPr id="2095335073" name="Picture 1"/>
+            <wp:cNvGraphicFramePr>
+              <a:graphicFrameLocks xmlns:a="http://schemas.openxmlformats.org/drawingml/2006/main" noChangeAspect="1"/>
+            </wp:cNvGraphicFramePr>
+            <a:graphic xmlns:a="http://schemas.openxmlformats.org/drawingml/2006/main">
+              <a:graphicData uri="http://schemas.openxmlformats.org/drawingml/2006/picture">
+                <pic:pic xmlns:pic="http://schemas.openxmlformats.org/drawingml/2006/picture">
+                  <pic:nvPicPr>
+                    <pic:cNvPr id="2095335073" name=""/>
+                    <pic:cNvPicPr/>
+                  </pic:nvPicPr>
+                  <pic:blipFill>
+                    <a:blip r:embed="rId46"/>
+                    <a:stretch>
+                      <a:fillRect/>
+                    </a:stretch>
+                  </pic:blipFill>
+                  <pic:spPr>
+                    <a:xfrm>
+                      <a:off x="0" y="0"/>
+                      <a:ext cx="5731510" cy="2624455"/>
+                    </a:xfrm>
+                    <a:prstGeom prst="rect">
+                      <a:avLst/>
+                    </a:prstGeom>
+                  </pic:spPr>
+                </pic:pic>
+              </a:graphicData>
+            </a:graphic>
+          </wp:inline>
+        </w:drawing>
+      </w:r>
+    </w:p>
+    <w:p>
+      <w:pPr>
+        <w:pStyle w:val="ListParagraph"/>
+        <w:rPr>
+          <w:b/>
+          <w:bCs/>
+          <w:color w:val="000000" w:themeColor="text1"/>
+        </w:rPr>
+      </w:pPr>
+    </w:p>
+    <w:p>
+      <w:pPr>
+        <w:pStyle w:val="ListParagraph"/>
+        <w:numPr>
+          <w:ilvl w:val="0"/>
+          <w:numId w:val="5"/>
+        </w:numPr>
+        <w:rPr>
+          <w:b/>
+          <w:bCs/>
+          <w:color w:val="000000" w:themeColor="text1"/>
+        </w:rPr>
+      </w:pPr>
+      <w:r>
+        <w:rPr>
+          <w:b/>
+          <w:bCs/>
+          <w:color w:val="000000" w:themeColor="text1"/>
+        </w:rPr>
+        <w:t>s</w:t>
+      </w:r>
+    </w:p>
+    <w:p>
+      <w:pPr>
+        <w:pStyle w:val="ListParagraph"/>
+        <w:numPr>
+          <w:ilvl w:val="1"/>
+          <w:numId w:val="5"/>
+        </w:numPr>
+        <w:rPr>
+          <w:color w:val="000000" w:themeColor="text1"/>
+        </w:rPr>
+      </w:pPr>
+      <w:r>
+        <w:rPr>
+          <w:b/>
+          <w:bCs/>
+          <w:color w:val="000000" w:themeColor="text1"/>
+        </w:rPr>
+        <w:t>F</w:t>
+      </w:r>
+    </w:p>
+    <w:p>
+      <w:pPr>
+        <w:pStyle w:val="ListParagraph"/>
+        <w:numPr>
+          <w:ilvl w:val="1"/>
+          <w:numId w:val="5"/>
+        </w:numPr>
+        <w:rPr>
+          <w:color w:val="000000" w:themeColor="text1"/>
+        </w:rPr>
+      </w:pPr>
+      <w:r>
+        <w:rPr>
+          <w:b/>
+          <w:bCs/>
+          <w:color w:val="000000" w:themeColor="text1"/>
+        </w:rPr>
+        <w:t>F</w:t>
+      </w:r>
+    </w:p>
+    <w:p>
+      <w:pPr>
+        <w:pStyle w:val="ListParagraph"/>
+        <w:numPr>
+          <w:ilvl w:val="1"/>
+          <w:numId w:val="5"/>
+        </w:numPr>
+        <w:rPr>
+          <w:color w:val="000000" w:themeColor="text1"/>
+        </w:rPr>
+      </w:pPr>
+      <w:r>
+        <w:rPr>
+          <w:b/>
+          <w:bCs/>
+          <w:color w:val="000000" w:themeColor="text1"/>
+        </w:rPr>
+        <w:t>f</w:t>
+      </w:r>
+    </w:p>
+    <w:p>
+      <w:pPr>
+        <w:ind w:left="360"/>
+        <w:rPr>
+          <w:b/>
+          <w:bCs/>
+          <w:color w:val="0066FF"/>
+        </w:rPr>
+      </w:pPr>
+    </w:p>
+    <w:p>
+      <w:pPr>
+        <w:pStyle w:val="ListParagraph"/>
+        <w:numPr>
+          <w:ilvl w:val="0"/>
+          <w:numId w:val="5"/>
+        </w:numPr>
+        <w:rPr>
+          <w:b/>
+          <w:bCs/>
+          <w:color w:val="0066FF"/>
+        </w:rPr>
+      </w:pPr>
+      <w:r>
+        <w:rPr>
+          <w:b/>
+          <w:bCs/>
+          <w:color w:val="0066FF"/>
+        </w:rPr>
+        <w:t>S</w:t>
+      </w:r>
+    </w:p>
+    <w:p>
+      <w:pPr>
+        <w:pStyle w:val="ListParagraph"/>
+        <w:numPr>
+          <w:ilvl w:val="0"/>
+          <w:numId w:val="5"/>
+        </w:numPr>
+        <w:rPr>
+          <w:b/>
+          <w:bCs/>
+          <w:color w:val="0066FF"/>
+        </w:rPr>
+      </w:pPr>
+      <w:r>
+        <w:rPr>
+          <w:b/>
+          <w:bCs/>
+          <w:color w:val="0066FF"/>
+        </w:rPr>
+        <w:t>S</w:t>
+      </w:r>
+    </w:p>
+    <w:p>
+      <w:pPr>
+        <w:pStyle w:val="ListParagraph"/>
+        <w:numPr>
+          <w:ilvl w:val="0"/>
+          <w:numId w:val="5"/>
+        </w:numPr>
+        <w:rPr>
+          <w:b/>
+          <w:bCs/>
+          <w:color w:val="0066FF"/>
+        </w:rPr>
+      </w:pPr>
+      <w:r>
+        <w:rPr>
+          <w:b/>
+          <w:bCs/>
+          <w:color w:val="0066FF"/>
+        </w:rPr>
+        <w:t>S</w:t>
+      </w:r>
+    </w:p>
+    <w:p>
+      <w:pPr>
+        <w:pStyle w:val="ListParagraph"/>
+        <w:numPr>
+          <w:ilvl w:val="0"/>
+          <w:numId w:val="5"/>
+        </w:numPr>
+        <w:rPr>
+          <w:b/>
+          <w:bCs/>
+          <w:color w:val="0066FF"/>
+        </w:rPr>
+      </w:pPr>
+      <w:r>
+        <w:rPr>
+          <w:b/>
+          <w:bCs/>
+          <w:color w:val="0066FF"/>
+        </w:rPr>
+        <w:t xml:space="preserve">s </w:t>
+      </w:r>
+    </w:p>
+    <w:p>
+      <w:pPr>
+        <w:pStyle w:val="ListParagraph"/>
+        <w:ind w:left="360"/>
+      </w:pPr>
+    </w:p>
+    <w:p>
+      <w:pPr>
+        <w:pStyle w:val="ListParagraph"/>
+      </w:pPr>
+    </w:p>
+    <w:p>
+      <w:pPr>
+        <w:pStyle w:val="ListParagraph"/>
+      </w:pPr>
+    </w:p>
+    <w:p>
+      <w:pPr>
+        <w:pStyle w:val="ListParagraph"/>
+      </w:pPr>
+    </w:p>
+    <w:p>
+      <w:pPr>
+        <w:pStyle w:val="ListParagraph"/>
+      </w:pPr>
+    </w:p>
     <w:sectPr>
       <w:pgSz w:w="11906" w:h="16838"/>
       <w:pgMar w:top="1440" w:right="1440" w:bottom="1440" w:left="1440" w:header="708" w:footer="708" w:gutter="0"/>
@@ -49,6 +4208,677 @@
     </w:sectPr>
   </w:body>
 </w:document>
+</file>
+
+<file path=word/numbering.xml><?xml version="1.0" encoding="utf-8"?>
+<w:numbering xmlns:wpc="http://schemas.microsoft.com/office/word/2010/wordprocessingCanvas" xmlns:cx="http://schemas.microsoft.com/office/drawing/2014/chartex" xmlns:cx1="http://schemas.microsoft.com/office/drawing/2015/9/8/chartex" xmlns:cx2="http://schemas.microsoft.com/office/drawing/2015/10/21/chartex" xmlns:cx3="http://schemas.microsoft.com/office/drawing/2016/5/9/chartex" xmlns:cx4="http://schemas.microsoft.com/office/drawing/2016/5/10/chartex" xmlns:cx5="http://schemas.microsoft.com/office/drawing/2016/5/11/chartex" xmlns:cx6="http://schemas.microsoft.com/office/drawing/2016/5/12/chartex" xmlns:cx7="http://schemas.microsoft.com/office/drawing/2016/5/13/chartex" xmlns:cx8="http://schemas.microsoft.com/office/drawing/2016/5/14/chartex" xmlns:mc="http://schemas.openxmlformats.org/markup-compatibility/2006" xmlns:aink="http://schemas.microsoft.com/office/drawing/2016/ink" xmlns:am3d="http://schemas.microsoft.com/office/drawing/2017/model3d" xmlns:o="urn:schemas-microsoft-com:office:office" xmlns:oel="http://schemas.microsoft.com/office/2019/extlst" xmlns:r="http://schemas.openxmlformats.org/officeDocument/2006/relationships" xmlns:m="http://schemas.openxmlformats.org/officeDocument/2006/math" xmlns:v="urn:schemas-microsoft-com:vml" xmlns:wp14="http://schemas.microsoft.com/office/word/2010/wordprocessingDrawing" xmlns:wp="http://schemas.openxmlformats.org/drawingml/2006/wordprocessingDrawing" xmlns:w10="urn:schemas-microsoft-com:office:word" xmlns:w="http://schemas.openxmlformats.org/wordprocessingml/2006/main" xmlns:w14="http://schemas.microsoft.com/office/word/2010/wordml" xmlns:w15="http://schemas.microsoft.com/office/word/2012/wordml" xmlns:w16cex="http://schemas.microsoft.com/office/word/2018/wordml/cex" xmlns:w16cid="http://schemas.microsoft.com/office/word/2016/wordml/cid" xmlns:w16="http://schemas.microsoft.com/office/word/2018/wordml" xmlns:w16du="http://schemas.microsoft.com/office/word/2023/wordml/word16du" xmlns:w16sdtdh="http://schemas.microsoft.com/office/word/2020/wordml/sdtdatahash" xmlns:w16sdtfl="http://schemas.microsoft.com/office/word/2024/wordml/sdtformatlock" xmlns:w16se="http://schemas.microsoft.com/office/word/2015/wordml/symex" xmlns:wpg="http://schemas.microsoft.com/office/word/2010/wordprocessingGroup" xmlns:wpi="http://schemas.microsoft.com/office/word/2010/wordprocessingInk" xmlns:wne="http://schemas.microsoft.com/office/word/2006/wordml" xmlns:wps="http://schemas.microsoft.com/office/word/2010/wordprocessingShape" mc:Ignorable="w14 w15 w16se w16cid w16 w16cex w16sdtdh w16sdtfl w16du wp14">
+  <w:abstractNum w:abstractNumId="0" w15:restartNumberingAfterBreak="0">
+    <w:nsid w:val="00585C9D"/>
+    <w:multiLevelType w:val="hybridMultilevel"/>
+    <w:tmpl w:val="1146F5C2"/>
+    <w:lvl w:ilvl="0" w:tplc="2000000F">
+      <w:start w:val="1"/>
+      <w:numFmt w:val="decimal"/>
+      <w:lvlText w:val="%1."/>
+      <w:lvlJc w:val="left"/>
+      <w:pPr>
+        <w:ind w:left="720" w:hanging="360"/>
+      </w:pPr>
+      <w:rPr>
+        <w:rFonts w:hint="default"/>
+      </w:rPr>
+    </w:lvl>
+    <w:lvl w:ilvl="1" w:tplc="20000019" w:tentative="1">
+      <w:start w:val="1"/>
+      <w:numFmt w:val="lowerLetter"/>
+      <w:lvlText w:val="%2."/>
+      <w:lvlJc w:val="left"/>
+      <w:pPr>
+        <w:ind w:left="1440" w:hanging="360"/>
+      </w:pPr>
+    </w:lvl>
+    <w:lvl w:ilvl="2" w:tplc="2000001B" w:tentative="1">
+      <w:start w:val="1"/>
+      <w:numFmt w:val="lowerRoman"/>
+      <w:lvlText w:val="%3."/>
+      <w:lvlJc w:val="right"/>
+      <w:pPr>
+        <w:ind w:left="2160" w:hanging="180"/>
+      </w:pPr>
+    </w:lvl>
+    <w:lvl w:ilvl="3" w:tplc="2000000F" w:tentative="1">
+      <w:start w:val="1"/>
+      <w:numFmt w:val="decimal"/>
+      <w:lvlText w:val="%4."/>
+      <w:lvlJc w:val="left"/>
+      <w:pPr>
+        <w:ind w:left="2880" w:hanging="360"/>
+      </w:pPr>
+    </w:lvl>
+    <w:lvl w:ilvl="4" w:tplc="20000019" w:tentative="1">
+      <w:start w:val="1"/>
+      <w:numFmt w:val="lowerLetter"/>
+      <w:lvlText w:val="%5."/>
+      <w:lvlJc w:val="left"/>
+      <w:pPr>
+        <w:ind w:left="3600" w:hanging="360"/>
+      </w:pPr>
+    </w:lvl>
+    <w:lvl w:ilvl="5" w:tplc="2000001B" w:tentative="1">
+      <w:start w:val="1"/>
+      <w:numFmt w:val="lowerRoman"/>
+      <w:lvlText w:val="%6."/>
+      <w:lvlJc w:val="right"/>
+      <w:pPr>
+        <w:ind w:left="4320" w:hanging="180"/>
+      </w:pPr>
+    </w:lvl>
+    <w:lvl w:ilvl="6" w:tplc="2000000F" w:tentative="1">
+      <w:start w:val="1"/>
+      <w:numFmt w:val="decimal"/>
+      <w:lvlText w:val="%7."/>
+      <w:lvlJc w:val="left"/>
+      <w:pPr>
+        <w:ind w:left="5040" w:hanging="360"/>
+      </w:pPr>
+    </w:lvl>
+    <w:lvl w:ilvl="7" w:tplc="20000019" w:tentative="1">
+      <w:start w:val="1"/>
+      <w:numFmt w:val="lowerLetter"/>
+      <w:lvlText w:val="%8."/>
+      <w:lvlJc w:val="left"/>
+      <w:pPr>
+        <w:ind w:left="5760" w:hanging="360"/>
+      </w:pPr>
+    </w:lvl>
+    <w:lvl w:ilvl="8" w:tplc="2000001B" w:tentative="1">
+      <w:start w:val="1"/>
+      <w:numFmt w:val="lowerRoman"/>
+      <w:lvlText w:val="%9."/>
+      <w:lvlJc w:val="right"/>
+      <w:pPr>
+        <w:ind w:left="6480" w:hanging="180"/>
+      </w:pPr>
+    </w:lvl>
+  </w:abstractNum>
+  <w:abstractNum w:abstractNumId="1" w15:restartNumberingAfterBreak="0">
+    <w:nsid w:val="2FAF7F0F"/>
+    <w:multiLevelType w:val="hybridMultilevel"/>
+    <w:tmpl w:val="5CAA4F40"/>
+    <w:lvl w:ilvl="0" w:tplc="20000019">
+      <w:start w:val="1"/>
+      <w:numFmt w:val="lowerLetter"/>
+      <w:lvlText w:val="%1."/>
+      <w:lvlJc w:val="left"/>
+      <w:pPr>
+        <w:ind w:left="360" w:hanging="360"/>
+      </w:pPr>
+    </w:lvl>
+    <w:lvl w:ilvl="1" w:tplc="20000019" w:tentative="1">
+      <w:start w:val="1"/>
+      <w:numFmt w:val="lowerLetter"/>
+      <w:lvlText w:val="%2."/>
+      <w:lvlJc w:val="left"/>
+      <w:pPr>
+        <w:ind w:left="1080" w:hanging="360"/>
+      </w:pPr>
+    </w:lvl>
+    <w:lvl w:ilvl="2" w:tplc="2000001B" w:tentative="1">
+      <w:start w:val="1"/>
+      <w:numFmt w:val="lowerRoman"/>
+      <w:lvlText w:val="%3."/>
+      <w:lvlJc w:val="right"/>
+      <w:pPr>
+        <w:ind w:left="1800" w:hanging="180"/>
+      </w:pPr>
+    </w:lvl>
+    <w:lvl w:ilvl="3" w:tplc="2000000F" w:tentative="1">
+      <w:start w:val="1"/>
+      <w:numFmt w:val="decimal"/>
+      <w:lvlText w:val="%4."/>
+      <w:lvlJc w:val="left"/>
+      <w:pPr>
+        <w:ind w:left="2520" w:hanging="360"/>
+      </w:pPr>
+    </w:lvl>
+    <w:lvl w:ilvl="4" w:tplc="20000019" w:tentative="1">
+      <w:start w:val="1"/>
+      <w:numFmt w:val="lowerLetter"/>
+      <w:lvlText w:val="%5."/>
+      <w:lvlJc w:val="left"/>
+      <w:pPr>
+        <w:ind w:left="3240" w:hanging="360"/>
+      </w:pPr>
+    </w:lvl>
+    <w:lvl w:ilvl="5" w:tplc="2000001B" w:tentative="1">
+      <w:start w:val="1"/>
+      <w:numFmt w:val="lowerRoman"/>
+      <w:lvlText w:val="%6."/>
+      <w:lvlJc w:val="right"/>
+      <w:pPr>
+        <w:ind w:left="3960" w:hanging="180"/>
+      </w:pPr>
+    </w:lvl>
+    <w:lvl w:ilvl="6" w:tplc="2000000F" w:tentative="1">
+      <w:start w:val="1"/>
+      <w:numFmt w:val="decimal"/>
+      <w:lvlText w:val="%7."/>
+      <w:lvlJc w:val="left"/>
+      <w:pPr>
+        <w:ind w:left="4680" w:hanging="360"/>
+      </w:pPr>
+    </w:lvl>
+    <w:lvl w:ilvl="7" w:tplc="20000019" w:tentative="1">
+      <w:start w:val="1"/>
+      <w:numFmt w:val="lowerLetter"/>
+      <w:lvlText w:val="%8."/>
+      <w:lvlJc w:val="left"/>
+      <w:pPr>
+        <w:ind w:left="5400" w:hanging="360"/>
+      </w:pPr>
+    </w:lvl>
+    <w:lvl w:ilvl="8" w:tplc="2000001B" w:tentative="1">
+      <w:start w:val="1"/>
+      <w:numFmt w:val="lowerRoman"/>
+      <w:lvlText w:val="%9."/>
+      <w:lvlJc w:val="right"/>
+      <w:pPr>
+        <w:ind w:left="6120" w:hanging="180"/>
+      </w:pPr>
+    </w:lvl>
+  </w:abstractNum>
+  <w:abstractNum w:abstractNumId="2" w15:restartNumberingAfterBreak="0">
+    <w:nsid w:val="31B93BFC"/>
+    <w:multiLevelType w:val="hybridMultilevel"/>
+    <w:tmpl w:val="F0DCCB66"/>
+    <w:lvl w:ilvl="0" w:tplc="2306DFFC">
+      <w:start w:val="2"/>
+      <w:numFmt w:val="lowerLetter"/>
+      <w:lvlText w:val="%1."/>
+      <w:lvlJc w:val="left"/>
+      <w:pPr>
+        <w:ind w:left="1440" w:hanging="360"/>
+      </w:pPr>
+      <w:rPr>
+        <w:rFonts w:hint="default"/>
+      </w:rPr>
+    </w:lvl>
+    <w:lvl w:ilvl="1" w:tplc="20000019" w:tentative="1">
+      <w:start w:val="1"/>
+      <w:numFmt w:val="lowerLetter"/>
+      <w:lvlText w:val="%2."/>
+      <w:lvlJc w:val="left"/>
+      <w:pPr>
+        <w:ind w:left="1440" w:hanging="360"/>
+      </w:pPr>
+    </w:lvl>
+    <w:lvl w:ilvl="2" w:tplc="2000001B" w:tentative="1">
+      <w:start w:val="1"/>
+      <w:numFmt w:val="lowerRoman"/>
+      <w:lvlText w:val="%3."/>
+      <w:lvlJc w:val="right"/>
+      <w:pPr>
+        <w:ind w:left="2160" w:hanging="180"/>
+      </w:pPr>
+    </w:lvl>
+    <w:lvl w:ilvl="3" w:tplc="2000000F" w:tentative="1">
+      <w:start w:val="1"/>
+      <w:numFmt w:val="decimal"/>
+      <w:lvlText w:val="%4."/>
+      <w:lvlJc w:val="left"/>
+      <w:pPr>
+        <w:ind w:left="2880" w:hanging="360"/>
+      </w:pPr>
+    </w:lvl>
+    <w:lvl w:ilvl="4" w:tplc="20000019" w:tentative="1">
+      <w:start w:val="1"/>
+      <w:numFmt w:val="lowerLetter"/>
+      <w:lvlText w:val="%5."/>
+      <w:lvlJc w:val="left"/>
+      <w:pPr>
+        <w:ind w:left="3600" w:hanging="360"/>
+      </w:pPr>
+    </w:lvl>
+    <w:lvl w:ilvl="5" w:tplc="2000001B" w:tentative="1">
+      <w:start w:val="1"/>
+      <w:numFmt w:val="lowerRoman"/>
+      <w:lvlText w:val="%6."/>
+      <w:lvlJc w:val="right"/>
+      <w:pPr>
+        <w:ind w:left="4320" w:hanging="180"/>
+      </w:pPr>
+    </w:lvl>
+    <w:lvl w:ilvl="6" w:tplc="2000000F" w:tentative="1">
+      <w:start w:val="1"/>
+      <w:numFmt w:val="decimal"/>
+      <w:lvlText w:val="%7."/>
+      <w:lvlJc w:val="left"/>
+      <w:pPr>
+        <w:ind w:left="5040" w:hanging="360"/>
+      </w:pPr>
+    </w:lvl>
+    <w:lvl w:ilvl="7" w:tplc="20000019" w:tentative="1">
+      <w:start w:val="1"/>
+      <w:numFmt w:val="lowerLetter"/>
+      <w:lvlText w:val="%8."/>
+      <w:lvlJc w:val="left"/>
+      <w:pPr>
+        <w:ind w:left="5760" w:hanging="360"/>
+      </w:pPr>
+    </w:lvl>
+    <w:lvl w:ilvl="8" w:tplc="2000001B" w:tentative="1">
+      <w:start w:val="1"/>
+      <w:numFmt w:val="lowerRoman"/>
+      <w:lvlText w:val="%9."/>
+      <w:lvlJc w:val="right"/>
+      <w:pPr>
+        <w:ind w:left="6480" w:hanging="180"/>
+      </w:pPr>
+    </w:lvl>
+  </w:abstractNum>
+  <w:abstractNum w:abstractNumId="3" w15:restartNumberingAfterBreak="0">
+    <w:nsid w:val="492007C8"/>
+    <w:multiLevelType w:val="hybridMultilevel"/>
+    <w:tmpl w:val="6D0493FA"/>
+    <w:lvl w:ilvl="0" w:tplc="2000000F">
+      <w:start w:val="1"/>
+      <w:numFmt w:val="decimal"/>
+      <w:lvlText w:val="%1."/>
+      <w:lvlJc w:val="left"/>
+      <w:pPr>
+        <w:ind w:left="720" w:hanging="360"/>
+      </w:pPr>
+      <w:rPr>
+        <w:rFonts w:hint="default"/>
+      </w:rPr>
+    </w:lvl>
+    <w:lvl w:ilvl="1" w:tplc="8BFEFB70">
+      <w:start w:val="1"/>
+      <w:numFmt w:val="lowerLetter"/>
+      <w:lvlText w:val="%2."/>
+      <w:lvlJc w:val="left"/>
+      <w:pPr>
+        <w:ind w:left="1440" w:hanging="360"/>
+      </w:pPr>
+      <w:rPr>
+        <w:b w:val="0"/>
+        <w:bCs w:val="0"/>
+        <w:color w:val="000000" w:themeColor="text1"/>
+      </w:rPr>
+    </w:lvl>
+    <w:lvl w:ilvl="2" w:tplc="2000001B" w:tentative="1">
+      <w:start w:val="1"/>
+      <w:numFmt w:val="lowerRoman"/>
+      <w:lvlText w:val="%3."/>
+      <w:lvlJc w:val="right"/>
+      <w:pPr>
+        <w:ind w:left="2160" w:hanging="180"/>
+      </w:pPr>
+    </w:lvl>
+    <w:lvl w:ilvl="3" w:tplc="2000000F" w:tentative="1">
+      <w:start w:val="1"/>
+      <w:numFmt w:val="decimal"/>
+      <w:lvlText w:val="%4."/>
+      <w:lvlJc w:val="left"/>
+      <w:pPr>
+        <w:ind w:left="2880" w:hanging="360"/>
+      </w:pPr>
+    </w:lvl>
+    <w:lvl w:ilvl="4" w:tplc="20000019" w:tentative="1">
+      <w:start w:val="1"/>
+      <w:numFmt w:val="lowerLetter"/>
+      <w:lvlText w:val="%5."/>
+      <w:lvlJc w:val="left"/>
+      <w:pPr>
+        <w:ind w:left="3600" w:hanging="360"/>
+      </w:pPr>
+    </w:lvl>
+    <w:lvl w:ilvl="5" w:tplc="2000001B" w:tentative="1">
+      <w:start w:val="1"/>
+      <w:numFmt w:val="lowerRoman"/>
+      <w:lvlText w:val="%6."/>
+      <w:lvlJc w:val="right"/>
+      <w:pPr>
+        <w:ind w:left="4320" w:hanging="180"/>
+      </w:pPr>
+    </w:lvl>
+    <w:lvl w:ilvl="6" w:tplc="2000000F" w:tentative="1">
+      <w:start w:val="1"/>
+      <w:numFmt w:val="decimal"/>
+      <w:lvlText w:val="%7."/>
+      <w:lvlJc w:val="left"/>
+      <w:pPr>
+        <w:ind w:left="5040" w:hanging="360"/>
+      </w:pPr>
+    </w:lvl>
+    <w:lvl w:ilvl="7" w:tplc="20000019" w:tentative="1">
+      <w:start w:val="1"/>
+      <w:numFmt w:val="lowerLetter"/>
+      <w:lvlText w:val="%8."/>
+      <w:lvlJc w:val="left"/>
+      <w:pPr>
+        <w:ind w:left="5760" w:hanging="360"/>
+      </w:pPr>
+    </w:lvl>
+    <w:lvl w:ilvl="8" w:tplc="2000001B" w:tentative="1">
+      <w:start w:val="1"/>
+      <w:numFmt w:val="lowerRoman"/>
+      <w:lvlText w:val="%9."/>
+      <w:lvlJc w:val="right"/>
+      <w:pPr>
+        <w:ind w:left="6480" w:hanging="180"/>
+      </w:pPr>
+    </w:lvl>
+  </w:abstractNum>
+  <w:abstractNum w:abstractNumId="4" w15:restartNumberingAfterBreak="0">
+    <w:nsid w:val="5A6C1A2A"/>
+    <w:multiLevelType w:val="hybridMultilevel"/>
+    <w:tmpl w:val="AC8E7078"/>
+    <w:lvl w:ilvl="0" w:tplc="EDEAEB7C">
+      <w:numFmt w:val="bullet"/>
+      <w:lvlText w:val=""/>
+      <w:lvlJc w:val="left"/>
+      <w:pPr>
+        <w:ind w:left="1080" w:hanging="360"/>
+      </w:pPr>
+      <w:rPr>
+        <w:rFonts w:ascii="Symbol" w:eastAsiaTheme="minorHAnsi" w:hAnsi="Symbol" w:cstheme="minorBidi" w:hint="default"/>
+      </w:rPr>
+    </w:lvl>
+    <w:lvl w:ilvl="1" w:tplc="20000003" w:tentative="1">
+      <w:start w:val="1"/>
+      <w:numFmt w:val="bullet"/>
+      <w:lvlText w:val="o"/>
+      <w:lvlJc w:val="left"/>
+      <w:pPr>
+        <w:ind w:left="1800" w:hanging="360"/>
+      </w:pPr>
+      <w:rPr>
+        <w:rFonts w:ascii="Courier New" w:hAnsi="Courier New" w:cs="Courier New" w:hint="default"/>
+      </w:rPr>
+    </w:lvl>
+    <w:lvl w:ilvl="2" w:tplc="20000005" w:tentative="1">
+      <w:start w:val="1"/>
+      <w:numFmt w:val="bullet"/>
+      <w:lvlText w:val=""/>
+      <w:lvlJc w:val="left"/>
+      <w:pPr>
+        <w:ind w:left="2520" w:hanging="360"/>
+      </w:pPr>
+      <w:rPr>
+        <w:rFonts w:ascii="Wingdings" w:hAnsi="Wingdings" w:hint="default"/>
+      </w:rPr>
+    </w:lvl>
+    <w:lvl w:ilvl="3" w:tplc="20000001" w:tentative="1">
+      <w:start w:val="1"/>
+      <w:numFmt w:val="bullet"/>
+      <w:lvlText w:val=""/>
+      <w:lvlJc w:val="left"/>
+      <w:pPr>
+        <w:ind w:left="3240" w:hanging="360"/>
+      </w:pPr>
+      <w:rPr>
+        <w:rFonts w:ascii="Symbol" w:hAnsi="Symbol" w:hint="default"/>
+      </w:rPr>
+    </w:lvl>
+    <w:lvl w:ilvl="4" w:tplc="20000003" w:tentative="1">
+      <w:start w:val="1"/>
+      <w:numFmt w:val="bullet"/>
+      <w:lvlText w:val="o"/>
+      <w:lvlJc w:val="left"/>
+      <w:pPr>
+        <w:ind w:left="3960" w:hanging="360"/>
+      </w:pPr>
+      <w:rPr>
+        <w:rFonts w:ascii="Courier New" w:hAnsi="Courier New" w:cs="Courier New" w:hint="default"/>
+      </w:rPr>
+    </w:lvl>
+    <w:lvl w:ilvl="5" w:tplc="20000005" w:tentative="1">
+      <w:start w:val="1"/>
+      <w:numFmt w:val="bullet"/>
+      <w:lvlText w:val=""/>
+      <w:lvlJc w:val="left"/>
+      <w:pPr>
+        <w:ind w:left="4680" w:hanging="360"/>
+      </w:pPr>
+      <w:rPr>
+        <w:rFonts w:ascii="Wingdings" w:hAnsi="Wingdings" w:hint="default"/>
+      </w:rPr>
+    </w:lvl>
+    <w:lvl w:ilvl="6" w:tplc="20000001" w:tentative="1">
+      <w:start w:val="1"/>
+      <w:numFmt w:val="bullet"/>
+      <w:lvlText w:val=""/>
+      <w:lvlJc w:val="left"/>
+      <w:pPr>
+        <w:ind w:left="5400" w:hanging="360"/>
+      </w:pPr>
+      <w:rPr>
+        <w:rFonts w:ascii="Symbol" w:hAnsi="Symbol" w:hint="default"/>
+      </w:rPr>
+    </w:lvl>
+    <w:lvl w:ilvl="7" w:tplc="20000003" w:tentative="1">
+      <w:start w:val="1"/>
+      <w:numFmt w:val="bullet"/>
+      <w:lvlText w:val="o"/>
+      <w:lvlJc w:val="left"/>
+      <w:pPr>
+        <w:ind w:left="6120" w:hanging="360"/>
+      </w:pPr>
+      <w:rPr>
+        <w:rFonts w:ascii="Courier New" w:hAnsi="Courier New" w:cs="Courier New" w:hint="default"/>
+      </w:rPr>
+    </w:lvl>
+    <w:lvl w:ilvl="8" w:tplc="20000005" w:tentative="1">
+      <w:start w:val="1"/>
+      <w:numFmt w:val="bullet"/>
+      <w:lvlText w:val=""/>
+      <w:lvlJc w:val="left"/>
+      <w:pPr>
+        <w:ind w:left="6840" w:hanging="360"/>
+      </w:pPr>
+      <w:rPr>
+        <w:rFonts w:ascii="Wingdings" w:hAnsi="Wingdings" w:hint="default"/>
+      </w:rPr>
+    </w:lvl>
+  </w:abstractNum>
+  <w:abstractNum w:abstractNumId="5" w15:restartNumberingAfterBreak="0">
+    <w:nsid w:val="65955C5C"/>
+    <w:multiLevelType w:val="hybridMultilevel"/>
+    <w:tmpl w:val="FEBAF0D2"/>
+    <w:lvl w:ilvl="0" w:tplc="20000019">
+      <w:start w:val="1"/>
+      <w:numFmt w:val="lowerLetter"/>
+      <w:lvlText w:val="%1."/>
+      <w:lvlJc w:val="left"/>
+      <w:pPr>
+        <w:ind w:left="1440" w:hanging="360"/>
+      </w:pPr>
+    </w:lvl>
+    <w:lvl w:ilvl="1" w:tplc="20000019" w:tentative="1">
+      <w:start w:val="1"/>
+      <w:numFmt w:val="lowerLetter"/>
+      <w:lvlText w:val="%2."/>
+      <w:lvlJc w:val="left"/>
+      <w:pPr>
+        <w:ind w:left="2160" w:hanging="360"/>
+      </w:pPr>
+    </w:lvl>
+    <w:lvl w:ilvl="2" w:tplc="2000001B" w:tentative="1">
+      <w:start w:val="1"/>
+      <w:numFmt w:val="lowerRoman"/>
+      <w:lvlText w:val="%3."/>
+      <w:lvlJc w:val="right"/>
+      <w:pPr>
+        <w:ind w:left="2880" w:hanging="180"/>
+      </w:pPr>
+    </w:lvl>
+    <w:lvl w:ilvl="3" w:tplc="2000000F" w:tentative="1">
+      <w:start w:val="1"/>
+      <w:numFmt w:val="decimal"/>
+      <w:lvlText w:val="%4."/>
+      <w:lvlJc w:val="left"/>
+      <w:pPr>
+        <w:ind w:left="3600" w:hanging="360"/>
+      </w:pPr>
+    </w:lvl>
+    <w:lvl w:ilvl="4" w:tplc="20000019" w:tentative="1">
+      <w:start w:val="1"/>
+      <w:numFmt w:val="lowerLetter"/>
+      <w:lvlText w:val="%5."/>
+      <w:lvlJc w:val="left"/>
+      <w:pPr>
+        <w:ind w:left="4320" w:hanging="360"/>
+      </w:pPr>
+    </w:lvl>
+    <w:lvl w:ilvl="5" w:tplc="2000001B" w:tentative="1">
+      <w:start w:val="1"/>
+      <w:numFmt w:val="lowerRoman"/>
+      <w:lvlText w:val="%6."/>
+      <w:lvlJc w:val="right"/>
+      <w:pPr>
+        <w:ind w:left="5040" w:hanging="180"/>
+      </w:pPr>
+    </w:lvl>
+    <w:lvl w:ilvl="6" w:tplc="2000000F" w:tentative="1">
+      <w:start w:val="1"/>
+      <w:numFmt w:val="decimal"/>
+      <w:lvlText w:val="%7."/>
+      <w:lvlJc w:val="left"/>
+      <w:pPr>
+        <w:ind w:left="5760" w:hanging="360"/>
+      </w:pPr>
+    </w:lvl>
+    <w:lvl w:ilvl="7" w:tplc="20000019" w:tentative="1">
+      <w:start w:val="1"/>
+      <w:numFmt w:val="lowerLetter"/>
+      <w:lvlText w:val="%8."/>
+      <w:lvlJc w:val="left"/>
+      <w:pPr>
+        <w:ind w:left="6480" w:hanging="360"/>
+      </w:pPr>
+    </w:lvl>
+    <w:lvl w:ilvl="8" w:tplc="2000001B" w:tentative="1">
+      <w:start w:val="1"/>
+      <w:numFmt w:val="lowerRoman"/>
+      <w:lvlText w:val="%9."/>
+      <w:lvlJc w:val="right"/>
+      <w:pPr>
+        <w:ind w:left="7200" w:hanging="180"/>
+      </w:pPr>
+    </w:lvl>
+  </w:abstractNum>
+  <w:abstractNum w:abstractNumId="6" w15:restartNumberingAfterBreak="0">
+    <w:nsid w:val="72335AD7"/>
+    <w:multiLevelType w:val="hybridMultilevel"/>
+    <w:tmpl w:val="15F8352A"/>
+    <w:lvl w:ilvl="0" w:tplc="2000000F">
+      <w:start w:val="1"/>
+      <w:numFmt w:val="decimal"/>
+      <w:lvlText w:val="%1."/>
+      <w:lvlJc w:val="left"/>
+      <w:pPr>
+        <w:ind w:left="720" w:hanging="360"/>
+      </w:pPr>
+      <w:rPr>
+        <w:rFonts w:hint="default"/>
+      </w:rPr>
+    </w:lvl>
+    <w:lvl w:ilvl="1" w:tplc="20000019">
+      <w:start w:val="1"/>
+      <w:numFmt w:val="lowerLetter"/>
+      <w:lvlText w:val="%2."/>
+      <w:lvlJc w:val="left"/>
+      <w:pPr>
+        <w:ind w:left="1440" w:hanging="360"/>
+      </w:pPr>
+    </w:lvl>
+    <w:lvl w:ilvl="2" w:tplc="2000001B" w:tentative="1">
+      <w:start w:val="1"/>
+      <w:numFmt w:val="lowerRoman"/>
+      <w:lvlText w:val="%3."/>
+      <w:lvlJc w:val="right"/>
+      <w:pPr>
+        <w:ind w:left="2160" w:hanging="180"/>
+      </w:pPr>
+    </w:lvl>
+    <w:lvl w:ilvl="3" w:tplc="2000000F" w:tentative="1">
+      <w:start w:val="1"/>
+      <w:numFmt w:val="decimal"/>
+      <w:lvlText w:val="%4."/>
+      <w:lvlJc w:val="left"/>
+      <w:pPr>
+        <w:ind w:left="2880" w:hanging="360"/>
+      </w:pPr>
+    </w:lvl>
+    <w:lvl w:ilvl="4" w:tplc="20000019" w:tentative="1">
+      <w:start w:val="1"/>
+      <w:numFmt w:val="lowerLetter"/>
+      <w:lvlText w:val="%5."/>
+      <w:lvlJc w:val="left"/>
+      <w:pPr>
+        <w:ind w:left="3600" w:hanging="360"/>
+      </w:pPr>
+    </w:lvl>
+    <w:lvl w:ilvl="5" w:tplc="2000001B" w:tentative="1">
+      <w:start w:val="1"/>
+      <w:numFmt w:val="lowerRoman"/>
+      <w:lvlText w:val="%6."/>
+      <w:lvlJc w:val="right"/>
+      <w:pPr>
+        <w:ind w:left="4320" w:hanging="180"/>
+      </w:pPr>
+    </w:lvl>
+    <w:lvl w:ilvl="6" w:tplc="2000000F" w:tentative="1">
+      <w:start w:val="1"/>
+      <w:numFmt w:val="decimal"/>
+      <w:lvlText w:val="%7."/>
+      <w:lvlJc w:val="left"/>
+      <w:pPr>
+        <w:ind w:left="5040" w:hanging="360"/>
+      </w:pPr>
+    </w:lvl>
+    <w:lvl w:ilvl="7" w:tplc="20000019" w:tentative="1">
+      <w:start w:val="1"/>
+      <w:numFmt w:val="lowerLetter"/>
+      <w:lvlText w:val="%8."/>
+      <w:lvlJc w:val="left"/>
+      <w:pPr>
+        <w:ind w:left="5760" w:hanging="360"/>
+      </w:pPr>
+    </w:lvl>
+    <w:lvl w:ilvl="8" w:tplc="2000001B" w:tentative="1">
+      <w:start w:val="1"/>
+      <w:numFmt w:val="lowerRoman"/>
+      <w:lvlText w:val="%9."/>
+      <w:lvlJc w:val="right"/>
+      <w:pPr>
+        <w:ind w:left="6480" w:hanging="180"/>
+      </w:pPr>
+    </w:lvl>
+  </w:abstractNum>
+  <w:num w:numId="1" w16cid:durableId="1996832371">
+    <w:abstractNumId w:val="0"/>
+  </w:num>
+  <w:num w:numId="2" w16cid:durableId="248464852">
+    <w:abstractNumId w:val="6"/>
+  </w:num>
+  <w:num w:numId="3" w16cid:durableId="1128086878">
+    <w:abstractNumId w:val="4"/>
+  </w:num>
+  <w:num w:numId="4" w16cid:durableId="910505838">
+    <w:abstractNumId w:val="1"/>
+  </w:num>
+  <w:num w:numId="5" w16cid:durableId="1431394923">
+    <w:abstractNumId w:val="3"/>
+  </w:num>
+  <w:num w:numId="6" w16cid:durableId="1092969607">
+    <w:abstractNumId w:val="5"/>
+  </w:num>
+  <w:num w:numId="7" w16cid:durableId="781611230">
+    <w:abstractNumId w:val="2"/>
+  </w:num>
+</w:numbering>
 </file>
 
 <file path=word/styles.xml><?xml version="1.0" encoding="utf-8"?>
@@ -654,7 +5484,6 @@
   <w:style w:type="character" w:default="1" w:styleId="DefaultParagraphFont">
     <w:name w:val="Default Paragraph Font"/>
     <w:uiPriority w:val="1"/>
-    <w:semiHidden/>
     <w:unhideWhenUsed/>
   </w:style>
   <w:style w:type="table" w:default="1" w:styleId="TableNormal">
@@ -966,6 +5795,29 @@
       <w:smallCaps/>
       <w:color w:val="0F4761" w:themeColor="accent1" w:themeShade="BF"/>
       <w:spacing w:val="5"/>
+    </w:rPr>
+  </w:style>
+  <w:style w:type="character" w:styleId="Hyperlink">
+    <w:name w:val="Hyperlink"/>
+    <w:basedOn w:val="DefaultParagraphFont"/>
+    <w:uiPriority w:val="99"/>
+    <w:unhideWhenUsed/>
+    <w:rsid w:val="00526B0C"/>
+    <w:rPr>
+      <w:color w:val="467886" w:themeColor="hyperlink"/>
+      <w:u w:val="single"/>
+    </w:rPr>
+  </w:style>
+  <w:style w:type="character" w:styleId="UnresolvedMention">
+    <w:name w:val="Unresolved Mention"/>
+    <w:basedOn w:val="DefaultParagraphFont"/>
+    <w:uiPriority w:val="99"/>
+    <w:semiHidden/>
+    <w:unhideWhenUsed/>
+    <w:rsid w:val="00526B0C"/>
+    <w:rPr>
+      <w:color w:val="605E5C"/>
+      <w:shd w:val="clear" w:color="auto" w:fill="E1DFDD"/>
     </w:rPr>
   </w:style>
 </w:styles>

</xml_diff>

<commit_message>
added new tests for mcp tools, modified mcp tools, added calendar updater tool
</commit_message>
<xml_diff>
--- a/README.md.docx
+++ b/README.md.docx
@@ -1769,7 +1769,7 @@
           <w:noProof/>
         </w:rPr>
         <w:drawing>
-          <wp:anchor distT="0" distB="0" distL="114300" distR="114300" simplePos="0" relativeHeight="251663360" behindDoc="0" locked="0" layoutInCell="1" allowOverlap="1" wp14:anchorId="0AF36B1F" wp14:editId="34E46EE2">
+          <wp:anchor distT="0" distB="0" distL="114300" distR="114300" simplePos="0" relativeHeight="251663360" behindDoc="0" locked="0" layoutInCell="1" allowOverlap="1" wp14:anchorId="0AF36B1F" wp14:editId="5423C19D">
             <wp:simplePos x="0" y="0"/>
             <wp:positionH relativeFrom="column">
               <wp:posOffset>387074</wp:posOffset>
@@ -4034,7 +4034,25 @@
           <w:bCs/>
           <w:color w:val="000000" w:themeColor="text1"/>
         </w:rPr>
-        <w:t>s</w:t>
+        <w:t xml:space="preserve">To run tests via </w:t>
+      </w:r>
+      <w:proofErr w:type="spellStart"/>
+      <w:r>
+        <w:rPr>
+          <w:b/>
+          <w:bCs/>
+          <w:color w:val="000000" w:themeColor="text1"/>
+        </w:rPr>
+        <w:t>pytest</w:t>
+      </w:r>
+      <w:proofErr w:type="spellEnd"/>
+      <w:r>
+        <w:rPr>
+          <w:b/>
+          <w:bCs/>
+          <w:color w:val="000000" w:themeColor="text1"/>
+        </w:rPr>
+        <w:t xml:space="preserve"> framework: </w:t>
       </w:r>
     </w:p>
     <w:p>
@@ -4046,16 +4064,32 @@
         </w:numPr>
         <w:rPr>
           <w:color w:val="000000" w:themeColor="text1"/>
-        </w:rPr>
-      </w:pPr>
-      <w:r>
-        <w:rPr>
-          <w:b/>
-          <w:bCs/>
-          <w:color w:val="000000" w:themeColor="text1"/>
-        </w:rPr>
-        <w:t>F</w:t>
-      </w:r>
+          <w:lang w:val="en-IL"/>
+        </w:rPr>
+      </w:pPr>
+      <w:r>
+        <w:rPr>
+          <w:color w:val="000000" w:themeColor="text1"/>
+        </w:rPr>
+        <w:t xml:space="preserve">Install </w:t>
+      </w:r>
+      <w:r>
+        <w:rPr>
+          <w:color w:val="000000" w:themeColor="text1"/>
+        </w:rPr>
+        <w:t xml:space="preserve">python package called: </w:t>
+      </w:r>
+      <w:proofErr w:type="spellStart"/>
+      <w:r>
+        <w:rPr>
+          <w:b/>
+          <w:bCs/>
+          <w:color w:val="000000" w:themeColor="text1"/>
+          <w:lang w:val="en-IL"/>
+        </w:rPr>
+        <w:t>pytest</w:t>
+      </w:r>
+      <w:proofErr w:type="spellEnd"/>
     </w:p>
     <w:p>
       <w:pPr>
@@ -4070,11 +4104,17 @@
       </w:pPr>
       <w:r>
         <w:rPr>
-          <w:b/>
-          <w:bCs/>
-          <w:color w:val="000000" w:themeColor="text1"/>
-        </w:rPr>
-        <w:t>F</w:t>
+          <w:color w:val="000000" w:themeColor="text1"/>
+        </w:rPr>
+        <w:t xml:space="preserve">Add a folder in the project called: </w:t>
+      </w:r>
+      <w:r>
+        <w:rPr>
+          <w:b/>
+          <w:bCs/>
+          <w:color w:val="000000" w:themeColor="text1"/>
+        </w:rPr>
+        <w:t>test</w:t>
       </w:r>
     </w:p>
     <w:p>
@@ -4090,11 +4130,1046 @@
       </w:pPr>
       <w:r>
         <w:rPr>
-          <w:b/>
-          <w:bCs/>
-          <w:color w:val="000000" w:themeColor="text1"/>
-        </w:rPr>
-        <w:t>f</w:t>
+          <w:color w:val="000000" w:themeColor="text1"/>
+        </w:rPr>
+        <w:t xml:space="preserve">Add a test file, in the </w:t>
+      </w:r>
+      <w:r>
+        <w:rPr>
+          <w:b/>
+          <w:bCs/>
+          <w:color w:val="000000" w:themeColor="text1"/>
+        </w:rPr>
+        <w:t>test</w:t>
+      </w:r>
+      <w:r>
+        <w:rPr>
+          <w:color w:val="000000" w:themeColor="text1"/>
+        </w:rPr>
+        <w:t xml:space="preserve"> folder:</w:t>
+      </w:r>
+      <w:r>
+        <w:rPr>
+          <w:b/>
+          <w:bCs/>
+          <w:color w:val="000000" w:themeColor="text1"/>
+        </w:rPr>
+        <w:t xml:space="preserve"> test_mcp_tools.py</w:t>
+      </w:r>
+      <w:r>
+        <w:rPr>
+          <w:color w:val="000000" w:themeColor="text1"/>
+        </w:rPr>
+        <w:t>, this file will con</w:t>
+      </w:r>
+      <w:r>
+        <w:rPr>
+          <w:color w:val="000000" w:themeColor="text1"/>
+        </w:rPr>
+        <w:t>t</w:t>
+      </w:r>
+      <w:r>
+        <w:rPr>
+          <w:color w:val="000000" w:themeColor="text1"/>
+        </w:rPr>
+        <w:t xml:space="preserve">ain tests for </w:t>
+      </w:r>
+      <w:proofErr w:type="spellStart"/>
+      <w:r>
+        <w:rPr>
+          <w:b/>
+          <w:bCs/>
+          <w:color w:val="000000" w:themeColor="text1"/>
+        </w:rPr>
+        <w:t>mcp</w:t>
+      </w:r>
+      <w:proofErr w:type="spellEnd"/>
+      <w:r>
+        <w:rPr>
+          <w:b/>
+          <w:bCs/>
+          <w:color w:val="000000" w:themeColor="text1"/>
+        </w:rPr>
+        <w:t xml:space="preserve"> tools</w:t>
+      </w:r>
+      <w:r>
+        <w:rPr>
+          <w:b/>
+          <w:bCs/>
+          <w:color w:val="000000" w:themeColor="text1"/>
+        </w:rPr>
+        <w:t xml:space="preserve"> </w:t>
+      </w:r>
+      <w:r>
+        <w:rPr>
+          <w:color w:val="000000" w:themeColor="text1"/>
+        </w:rPr>
+        <w:t>(</w:t>
+      </w:r>
+      <w:proofErr w:type="spellStart"/>
+      <w:r>
+        <w:rPr>
+          <w:color w:val="000000" w:themeColor="text1"/>
+        </w:rPr>
+        <w:t>apis</w:t>
+      </w:r>
+      <w:proofErr w:type="spellEnd"/>
+      <w:r>
+        <w:rPr>
+          <w:color w:val="000000" w:themeColor="text1"/>
+        </w:rPr>
+        <w:t xml:space="preserve"> of the project that were turned to be </w:t>
+      </w:r>
+      <w:r>
+        <w:rPr>
+          <w:b/>
+          <w:bCs/>
+          <w:color w:val="000000" w:themeColor="text1"/>
+        </w:rPr>
+        <w:t>MCP tools</w:t>
+      </w:r>
+      <w:r>
+        <w:rPr>
+          <w:color w:val="000000" w:themeColor="text1"/>
+        </w:rPr>
+        <w:t xml:space="preserve">). </w:t>
+      </w:r>
+    </w:p>
+    <w:p>
+      <w:pPr>
+        <w:pStyle w:val="ListParagraph"/>
+        <w:numPr>
+          <w:ilvl w:val="1"/>
+          <w:numId w:val="5"/>
+        </w:numPr>
+        <w:rPr>
+          <w:color w:val="000000" w:themeColor="text1"/>
+        </w:rPr>
+      </w:pPr>
+      <w:r>
+        <w:rPr>
+          <w:color w:val="000000" w:themeColor="text1"/>
+        </w:rPr>
+        <w:lastRenderedPageBreak/>
+        <w:t xml:space="preserve">In the file </w:t>
+      </w:r>
+      <w:r>
+        <w:rPr>
+          <w:b/>
+          <w:bCs/>
+          <w:color w:val="000000" w:themeColor="text1"/>
+        </w:rPr>
+        <w:t>test_mcp_tools.py</w:t>
+      </w:r>
+      <w:r>
+        <w:rPr>
+          <w:b/>
+          <w:bCs/>
+          <w:color w:val="000000" w:themeColor="text1"/>
+        </w:rPr>
+        <w:t>,</w:t>
+      </w:r>
+      <w:r>
+        <w:rPr>
+          <w:color w:val="000000" w:themeColor="text1"/>
+        </w:rPr>
+        <w:t xml:space="preserve"> import python package: </w:t>
+      </w:r>
+      <w:proofErr w:type="spellStart"/>
+      <w:r>
+        <w:rPr>
+          <w:b/>
+          <w:bCs/>
+          <w:color w:val="000000" w:themeColor="text1"/>
+        </w:rPr>
+        <w:t>pytest</w:t>
+      </w:r>
+      <w:proofErr w:type="spellEnd"/>
+      <w:r>
+        <w:rPr>
+          <w:color w:val="000000" w:themeColor="text1"/>
+        </w:rPr>
+        <w:t xml:space="preserve"> </w:t>
+      </w:r>
+    </w:p>
+    <w:p>
+      <w:pPr>
+        <w:pStyle w:val="ListParagraph"/>
+        <w:numPr>
+          <w:ilvl w:val="1"/>
+          <w:numId w:val="5"/>
+        </w:numPr>
+        <w:rPr>
+          <w:color w:val="000000" w:themeColor="text1"/>
+        </w:rPr>
+      </w:pPr>
+      <w:r>
+        <w:rPr>
+          <w:color w:val="000000" w:themeColor="text1"/>
+        </w:rPr>
+        <w:t xml:space="preserve">Each test must be defined as </w:t>
+      </w:r>
+      <w:r>
+        <w:rPr>
+          <w:b/>
+          <w:bCs/>
+          <w:color w:val="000000" w:themeColor="text1"/>
+        </w:rPr>
+        <w:t>async</w:t>
+      </w:r>
+      <w:r>
+        <w:rPr>
+          <w:color w:val="000000" w:themeColor="text1"/>
+        </w:rPr>
+        <w:t xml:space="preserve"> as it calls </w:t>
+      </w:r>
+      <w:r>
+        <w:rPr>
+          <w:b/>
+          <w:bCs/>
+          <w:color w:val="000000" w:themeColor="text1"/>
+        </w:rPr>
+        <w:t xml:space="preserve">async </w:t>
+      </w:r>
+      <w:proofErr w:type="spellStart"/>
+      <w:r>
+        <w:rPr>
+          <w:b/>
+          <w:bCs/>
+          <w:color w:val="000000" w:themeColor="text1"/>
+        </w:rPr>
+        <w:t>mcp</w:t>
+      </w:r>
+      <w:proofErr w:type="spellEnd"/>
+      <w:r>
+        <w:rPr>
+          <w:b/>
+          <w:bCs/>
+          <w:color w:val="000000" w:themeColor="text1"/>
+        </w:rPr>
+        <w:t xml:space="preserve"> tools</w:t>
+      </w:r>
+    </w:p>
+    <w:p>
+      <w:pPr>
+        <w:pStyle w:val="ListParagraph"/>
+        <w:rPr>
+          <w:b/>
+          <w:bCs/>
+          <w:color w:val="000000" w:themeColor="text1"/>
+        </w:rPr>
+      </w:pPr>
+    </w:p>
+    <w:p>
+      <w:pPr>
+        <w:pStyle w:val="ListParagraph"/>
+        <w:rPr>
+          <w:b/>
+          <w:bCs/>
+          <w:color w:val="000000" w:themeColor="text1"/>
+        </w:rPr>
+      </w:pPr>
+      <w:r>
+        <w:rPr>
+          <w:noProof/>
+        </w:rPr>
+        <w:drawing>
+          <wp:inline distT="0" distB="0" distL="0" distR="0" wp14:anchorId="74915D04" wp14:editId="76A5120B">
+            <wp:extent cx="5731510" cy="5454650"/>
+            <wp:effectExtent l="0" t="0" r="2540" b="0"/>
+            <wp:docPr id="1881960147" name="Picture 5"/>
+            <wp:cNvGraphicFramePr>
+              <a:graphicFrameLocks xmlns:a="http://schemas.openxmlformats.org/drawingml/2006/main" noChangeAspect="1"/>
+            </wp:cNvGraphicFramePr>
+            <a:graphic xmlns:a="http://schemas.openxmlformats.org/drawingml/2006/main">
+              <a:graphicData uri="http://schemas.openxmlformats.org/drawingml/2006/picture">
+                <pic:pic xmlns:pic="http://schemas.openxmlformats.org/drawingml/2006/picture">
+                  <pic:nvPicPr>
+                    <pic:cNvPr id="0" name="Picture 12"/>
+                    <pic:cNvPicPr>
+                      <a:picLocks noChangeAspect="1" noChangeArrowheads="1"/>
+                    </pic:cNvPicPr>
+                  </pic:nvPicPr>
+                  <pic:blipFill>
+                    <a:blip r:embed="rId47" cstate="print">
+                      <a:extLst>
+                        <a:ext uri="{28A0092B-C50C-407E-A947-70E740481C1C}">
+                          <a14:useLocalDpi xmlns:a14="http://schemas.microsoft.com/office/drawing/2010/main" val="0"/>
+                        </a:ext>
+                      </a:extLst>
+                    </a:blip>
+                    <a:srcRect/>
+                    <a:stretch>
+                      <a:fillRect/>
+                    </a:stretch>
+                  </pic:blipFill>
+                  <pic:spPr bwMode="auto">
+                    <a:xfrm>
+                      <a:off x="0" y="0"/>
+                      <a:ext cx="5731510" cy="5454650"/>
+                    </a:xfrm>
+                    <a:prstGeom prst="rect">
+                      <a:avLst/>
+                    </a:prstGeom>
+                    <a:noFill/>
+                    <a:ln>
+                      <a:noFill/>
+                    </a:ln>
+                  </pic:spPr>
+                </pic:pic>
+              </a:graphicData>
+            </a:graphic>
+          </wp:inline>
+        </w:drawing>
+      </w:r>
+    </w:p>
+    <w:p>
+      <w:pPr>
+        <w:rPr>
+          <w:b/>
+          <w:bCs/>
+          <w:color w:val="000000" w:themeColor="text1"/>
+        </w:rPr>
+      </w:pPr>
+      <w:r>
+        <w:rPr>
+          <w:b/>
+          <w:bCs/>
+          <w:color w:val="000000" w:themeColor="text1"/>
+        </w:rPr>
+        <w:br w:type="page"/>
+      </w:r>
+    </w:p>
+    <w:p>
+      <w:pPr>
+        <w:pStyle w:val="ListParagraph"/>
+        <w:rPr>
+          <w:b/>
+          <w:bCs/>
+          <w:color w:val="000000" w:themeColor="text1"/>
+        </w:rPr>
+      </w:pPr>
+      <w:r>
+        <w:rPr>
+          <w:noProof/>
+        </w:rPr>
+        <w:lastRenderedPageBreak/>
+        <w:drawing>
+          <wp:inline distT="0" distB="0" distL="0" distR="0" wp14:anchorId="747F7E14" wp14:editId="53CCE61F">
+            <wp:extent cx="5382895" cy="8863330"/>
+            <wp:effectExtent l="0" t="0" r="8255" b="0"/>
+            <wp:docPr id="906278526" name="Picture 6"/>
+            <wp:cNvGraphicFramePr>
+              <a:graphicFrameLocks xmlns:a="http://schemas.openxmlformats.org/drawingml/2006/main" noChangeAspect="1"/>
+            </wp:cNvGraphicFramePr>
+            <a:graphic xmlns:a="http://schemas.openxmlformats.org/drawingml/2006/main">
+              <a:graphicData uri="http://schemas.openxmlformats.org/drawingml/2006/picture">
+                <pic:pic xmlns:pic="http://schemas.openxmlformats.org/drawingml/2006/picture">
+                  <pic:nvPicPr>
+                    <pic:cNvPr id="0" name="Picture 14"/>
+                    <pic:cNvPicPr>
+                      <a:picLocks noChangeAspect="1" noChangeArrowheads="1"/>
+                    </pic:cNvPicPr>
+                  </pic:nvPicPr>
+                  <pic:blipFill>
+                    <a:blip r:embed="rId48" cstate="print">
+                      <a:extLst>
+                        <a:ext uri="{28A0092B-C50C-407E-A947-70E740481C1C}">
+                          <a14:useLocalDpi xmlns:a14="http://schemas.microsoft.com/office/drawing/2010/main" val="0"/>
+                        </a:ext>
+                      </a:extLst>
+                    </a:blip>
+                    <a:srcRect/>
+                    <a:stretch>
+                      <a:fillRect/>
+                    </a:stretch>
+                  </pic:blipFill>
+                  <pic:spPr bwMode="auto">
+                    <a:xfrm>
+                      <a:off x="0" y="0"/>
+                      <a:ext cx="5382895" cy="8863330"/>
+                    </a:xfrm>
+                    <a:prstGeom prst="rect">
+                      <a:avLst/>
+                    </a:prstGeom>
+                    <a:noFill/>
+                    <a:ln>
+                      <a:noFill/>
+                    </a:ln>
+                  </pic:spPr>
+                </pic:pic>
+              </a:graphicData>
+            </a:graphic>
+          </wp:inline>
+        </w:drawing>
+      </w:r>
+    </w:p>
+    <w:p>
+      <w:pPr>
+        <w:pStyle w:val="ListParagraph"/>
+        <w:rPr>
+          <w:b/>
+          <w:bCs/>
+          <w:color w:val="000000" w:themeColor="text1"/>
+        </w:rPr>
+      </w:pPr>
+      <w:r>
+        <w:rPr>
+          <w:noProof/>
+        </w:rPr>
+        <w:lastRenderedPageBreak/>
+        <w:drawing>
+          <wp:inline distT="0" distB="0" distL="0" distR="0" wp14:anchorId="0338500D" wp14:editId="43489D72">
+            <wp:extent cx="5731510" cy="2586990"/>
+            <wp:effectExtent l="0" t="0" r="2540" b="3810"/>
+            <wp:docPr id="511158746" name="Picture 7"/>
+            <wp:cNvGraphicFramePr>
+              <a:graphicFrameLocks xmlns:a="http://schemas.openxmlformats.org/drawingml/2006/main" noChangeAspect="1"/>
+            </wp:cNvGraphicFramePr>
+            <a:graphic xmlns:a="http://schemas.openxmlformats.org/drawingml/2006/main">
+              <a:graphicData uri="http://schemas.openxmlformats.org/drawingml/2006/picture">
+                <pic:pic xmlns:pic="http://schemas.openxmlformats.org/drawingml/2006/picture">
+                  <pic:nvPicPr>
+                    <pic:cNvPr id="0" name="Picture 16"/>
+                    <pic:cNvPicPr>
+                      <a:picLocks noChangeAspect="1" noChangeArrowheads="1"/>
+                    </pic:cNvPicPr>
+                  </pic:nvPicPr>
+                  <pic:blipFill>
+                    <a:blip r:embed="rId49" cstate="print">
+                      <a:extLst>
+                        <a:ext uri="{28A0092B-C50C-407E-A947-70E740481C1C}">
+                          <a14:useLocalDpi xmlns:a14="http://schemas.microsoft.com/office/drawing/2010/main" val="0"/>
+                        </a:ext>
+                      </a:extLst>
+                    </a:blip>
+                    <a:srcRect/>
+                    <a:stretch>
+                      <a:fillRect/>
+                    </a:stretch>
+                  </pic:blipFill>
+                  <pic:spPr bwMode="auto">
+                    <a:xfrm>
+                      <a:off x="0" y="0"/>
+                      <a:ext cx="5731510" cy="2586990"/>
+                    </a:xfrm>
+                    <a:prstGeom prst="rect">
+                      <a:avLst/>
+                    </a:prstGeom>
+                    <a:noFill/>
+                    <a:ln>
+                      <a:noFill/>
+                    </a:ln>
+                  </pic:spPr>
+                </pic:pic>
+              </a:graphicData>
+            </a:graphic>
+          </wp:inline>
+        </w:drawing>
+      </w:r>
+    </w:p>
+    <w:p>
+      <w:pPr>
+        <w:pStyle w:val="ListParagraph"/>
+        <w:rPr>
+          <w:b/>
+          <w:bCs/>
+          <w:color w:val="000000" w:themeColor="text1"/>
+        </w:rPr>
+      </w:pPr>
+    </w:p>
+    <w:p>
+      <w:pPr>
+        <w:pStyle w:val="ListParagraph"/>
+        <w:numPr>
+          <w:ilvl w:val="0"/>
+          <w:numId w:val="5"/>
+        </w:numPr>
+        <w:rPr>
+          <w:b/>
+          <w:bCs/>
+          <w:color w:val="000000" w:themeColor="text1"/>
+        </w:rPr>
+      </w:pPr>
+      <w:r>
+        <w:rPr>
+          <w:b/>
+          <w:bCs/>
+          <w:color w:val="000000" w:themeColor="text1"/>
+        </w:rPr>
+        <w:t xml:space="preserve">To run </w:t>
+      </w:r>
+      <w:proofErr w:type="spellStart"/>
+      <w:r>
+        <w:rPr>
+          <w:b/>
+          <w:bCs/>
+          <w:color w:val="000000" w:themeColor="text1"/>
+        </w:rPr>
+        <w:t>pytest</w:t>
+      </w:r>
+      <w:proofErr w:type="spellEnd"/>
+      <w:r>
+        <w:rPr>
+          <w:b/>
+          <w:bCs/>
+          <w:color w:val="000000" w:themeColor="text1"/>
+        </w:rPr>
+        <w:t xml:space="preserve"> tests for Google calendar updater app from command line: </w:t>
+      </w:r>
+    </w:p>
+    <w:p>
+      <w:pPr>
+        <w:pStyle w:val="ListParagraph"/>
+        <w:numPr>
+          <w:ilvl w:val="1"/>
+          <w:numId w:val="5"/>
+        </w:numPr>
+        <w:rPr>
+          <w:b/>
+          <w:bCs/>
+          <w:color w:val="000000" w:themeColor="text1"/>
+        </w:rPr>
+      </w:pPr>
+      <w:r>
+        <w:rPr>
+          <w:b/>
+          <w:bCs/>
+          <w:color w:val="000000" w:themeColor="text1"/>
+        </w:rPr>
+        <w:t xml:space="preserve">Run all tests: </w:t>
+      </w:r>
+    </w:p>
+    <w:p>
+      <w:pPr>
+        <w:rPr>
+          <w:b/>
+          <w:bCs/>
+          <w:color w:val="000000" w:themeColor="text1"/>
+        </w:rPr>
+      </w:pPr>
+      <w:proofErr w:type="spellStart"/>
+      <w:r>
+        <w:rPr>
+          <w:b/>
+          <w:bCs/>
+          <w:color w:val="000000" w:themeColor="text1"/>
+        </w:rPr>
+        <w:t>pytest</w:t>
+      </w:r>
+      <w:proofErr w:type="spellEnd"/>
+      <w:r>
+        <w:rPr>
+          <w:b/>
+          <w:bCs/>
+          <w:color w:val="000000" w:themeColor="text1"/>
+        </w:rPr>
+        <w:t xml:space="preserve"> </w:t>
+      </w:r>
+      <w:r>
+        <w:rPr>
+          <w:color w:val="000000" w:themeColor="text1"/>
+        </w:rPr>
+        <w:t>test/test_mcp_tools.py</w:t>
+      </w:r>
+      <w:r>
+        <w:rPr>
+          <w:color w:val="000000" w:themeColor="text1"/>
+        </w:rPr>
+        <w:t xml:space="preserve"> </w:t>
+      </w:r>
+      <w:r>
+        <w:rPr>
+          <w:color w:val="000000" w:themeColor="text1"/>
+        </w:rPr>
+        <w:t>-</w:t>
+      </w:r>
+      <w:r>
+        <w:rPr>
+          <w:b/>
+          <w:bCs/>
+          <w:color w:val="000000" w:themeColor="text1"/>
+        </w:rPr>
+        <w:t>v</w:t>
+      </w:r>
+      <w:r>
+        <w:rPr>
+          <w:color w:val="000000" w:themeColor="text1"/>
+        </w:rPr>
+        <w:t xml:space="preserve"> --</w:t>
+      </w:r>
+      <w:proofErr w:type="spellStart"/>
+      <w:r>
+        <w:rPr>
+          <w:b/>
+          <w:bCs/>
+          <w:color w:val="000000" w:themeColor="text1"/>
+        </w:rPr>
+        <w:t>asyncio</w:t>
+      </w:r>
+      <w:proofErr w:type="spellEnd"/>
+      <w:r>
+        <w:rPr>
+          <w:b/>
+          <w:bCs/>
+          <w:color w:val="000000" w:themeColor="text1"/>
+        </w:rPr>
+        <w:t>-mode=auto</w:t>
+      </w:r>
+    </w:p>
+    <w:p>
+      <w:pPr>
+        <w:pStyle w:val="ListParagraph"/>
+        <w:numPr>
+          <w:ilvl w:val="1"/>
+          <w:numId w:val="5"/>
+        </w:numPr>
+        <w:rPr>
+          <w:color w:val="000000" w:themeColor="text1"/>
+        </w:rPr>
+      </w:pPr>
+      <w:r>
+        <w:rPr>
+          <w:color w:val="000000" w:themeColor="text1"/>
+        </w:rPr>
+        <w:t>Run last FAILED tests only</w:t>
+      </w:r>
+    </w:p>
+    <w:p>
+      <w:pPr>
+        <w:rPr>
+          <w:color w:val="000000" w:themeColor="text1"/>
+        </w:rPr>
+      </w:pPr>
+      <w:proofErr w:type="spellStart"/>
+      <w:r>
+        <w:rPr>
+          <w:b/>
+          <w:bCs/>
+          <w:color w:val="000000" w:themeColor="text1"/>
+        </w:rPr>
+        <w:t>pytest</w:t>
+      </w:r>
+      <w:proofErr w:type="spellEnd"/>
+      <w:r>
+        <w:rPr>
+          <w:color w:val="000000" w:themeColor="text1"/>
+        </w:rPr>
+        <w:t xml:space="preserve"> test/test_mcp_tools.py</w:t>
+      </w:r>
+      <w:r>
+        <w:rPr>
+          <w:color w:val="000000" w:themeColor="text1"/>
+        </w:rPr>
+        <w:t xml:space="preserve"> </w:t>
+      </w:r>
+      <w:r>
+        <w:rPr>
+          <w:b/>
+          <w:bCs/>
+          <w:color w:val="000000" w:themeColor="text1"/>
+          <w:highlight w:val="yellow"/>
+        </w:rPr>
+        <w:t>- -</w:t>
+      </w:r>
+      <w:proofErr w:type="spellStart"/>
+      <w:r>
+        <w:rPr>
+          <w:b/>
+          <w:bCs/>
+          <w:color w:val="000000" w:themeColor="text1"/>
+          <w:highlight w:val="yellow"/>
+        </w:rPr>
+        <w:t>lf</w:t>
+      </w:r>
+      <w:proofErr w:type="spellEnd"/>
+      <w:r>
+        <w:rPr>
+          <w:color w:val="000000" w:themeColor="text1"/>
+        </w:rPr>
+        <w:t xml:space="preserve"> </w:t>
+      </w:r>
+      <w:r>
+        <w:rPr>
+          <w:color w:val="000000" w:themeColor="text1"/>
+        </w:rPr>
+        <w:t>-v --</w:t>
+      </w:r>
+      <w:proofErr w:type="spellStart"/>
+      <w:r>
+        <w:rPr>
+          <w:color w:val="000000" w:themeColor="text1"/>
+        </w:rPr>
+        <w:t>asyncio</w:t>
+      </w:r>
+      <w:proofErr w:type="spellEnd"/>
+      <w:r>
+        <w:rPr>
+          <w:color w:val="000000" w:themeColor="text1"/>
+        </w:rPr>
+        <w:t>-mode=auto</w:t>
+      </w:r>
+    </w:p>
+    <w:p>
+      <w:pPr>
+        <w:pStyle w:val="ListParagraph"/>
+        <w:numPr>
+          <w:ilvl w:val="1"/>
+          <w:numId w:val="5"/>
+        </w:numPr>
+        <w:rPr>
+          <w:color w:val="000000" w:themeColor="text1"/>
+        </w:rPr>
+      </w:pPr>
+      <w:r>
+        <w:rPr>
+          <w:color w:val="000000" w:themeColor="text1"/>
+        </w:rPr>
+        <w:t xml:space="preserve">Run specific test by indicating test </w:t>
+      </w:r>
+      <w:proofErr w:type="spellStart"/>
+      <w:r>
+        <w:rPr>
+          <w:color w:val="000000" w:themeColor="text1"/>
+        </w:rPr>
+        <w:t>nam</w:t>
+      </w:r>
+      <w:proofErr w:type="spellEnd"/>
+      <w:r>
+        <w:rPr>
+          <w:color w:val="000000" w:themeColor="text1"/>
+        </w:rPr>
+        <w:t xml:space="preserve">: </w:t>
+      </w:r>
+    </w:p>
+    <w:p>
+      <w:pPr>
+        <w:rPr>
+          <w:color w:val="000000" w:themeColor="text1"/>
+        </w:rPr>
+      </w:pPr>
+      <w:proofErr w:type="spellStart"/>
+      <w:r>
+        <w:rPr>
+          <w:b/>
+          <w:bCs/>
+          <w:color w:val="000000" w:themeColor="text1"/>
+        </w:rPr>
+        <w:t>pytest</w:t>
+      </w:r>
+      <w:proofErr w:type="spellEnd"/>
+      <w:r>
+        <w:rPr>
+          <w:color w:val="000000" w:themeColor="text1"/>
+        </w:rPr>
+        <w:t xml:space="preserve"> </w:t>
+      </w:r>
+      <w:proofErr w:type="gramStart"/>
+      <w:r>
+        <w:rPr>
+          <w:color w:val="000000" w:themeColor="text1"/>
+        </w:rPr>
+        <w:t>test/test_mcp_tools.py</w:t>
+      </w:r>
+      <w:r>
+        <w:rPr>
+          <w:b/>
+          <w:bCs/>
+          <w:color w:val="000000" w:themeColor="text1"/>
+          <w:highlight w:val="yellow"/>
+        </w:rPr>
+        <w:t>::</w:t>
+      </w:r>
+      <w:proofErr w:type="gramEnd"/>
+      <w:r>
+        <w:rPr>
+          <w:b/>
+          <w:bCs/>
+          <w:color w:val="000000" w:themeColor="text1"/>
+        </w:rPr>
+        <w:t>test_create_google_calendar_event_tool_</w:t>
+      </w:r>
+      <w:proofErr w:type="gramStart"/>
+      <w:r>
+        <w:rPr>
+          <w:b/>
+          <w:bCs/>
+          <w:color w:val="000000" w:themeColor="text1"/>
+        </w:rPr>
+        <w:t>parameterized</w:t>
+      </w:r>
+      <w:r>
+        <w:rPr>
+          <w:color w:val="000000" w:themeColor="text1"/>
+        </w:rPr>
+        <w:t xml:space="preserve">  -</w:t>
+      </w:r>
+      <w:proofErr w:type="gramEnd"/>
+      <w:r>
+        <w:rPr>
+          <w:color w:val="000000" w:themeColor="text1"/>
+        </w:rPr>
+        <w:t>v --</w:t>
+      </w:r>
+      <w:proofErr w:type="spellStart"/>
+      <w:r>
+        <w:rPr>
+          <w:b/>
+          <w:bCs/>
+          <w:color w:val="000000" w:themeColor="text1"/>
+        </w:rPr>
+        <w:t>asyncio</w:t>
+      </w:r>
+      <w:proofErr w:type="spellEnd"/>
+      <w:r>
+        <w:rPr>
+          <w:b/>
+          <w:bCs/>
+          <w:color w:val="000000" w:themeColor="text1"/>
+        </w:rPr>
+        <w:t>-mode=auto</w:t>
+      </w:r>
+    </w:p>
+    <w:p>
+      <w:pPr>
+        <w:pStyle w:val="ListParagraph"/>
+        <w:numPr>
+          <w:ilvl w:val="1"/>
+          <w:numId w:val="5"/>
+        </w:numPr>
+        <w:rPr>
+          <w:color w:val="000000" w:themeColor="text1"/>
+        </w:rPr>
+      </w:pPr>
+      <w:r>
+        <w:rPr>
+          <w:color w:val="000000" w:themeColor="text1"/>
+        </w:rPr>
+        <w:t xml:space="preserve">Run tests that have in the name </w:t>
+      </w:r>
+      <w:r>
+        <w:rPr>
+          <w:b/>
+          <w:bCs/>
+          <w:color w:val="000000" w:themeColor="text1"/>
+        </w:rPr>
+        <w:t>specific pattern</w:t>
+      </w:r>
+      <w:r>
+        <w:rPr>
+          <w:color w:val="000000" w:themeColor="text1"/>
+        </w:rPr>
+        <w:t xml:space="preserve"> – </w:t>
+      </w:r>
+      <w:proofErr w:type="gramStart"/>
+      <w:r>
+        <w:rPr>
+          <w:color w:val="000000" w:themeColor="text1"/>
+        </w:rPr>
+        <w:t>lets</w:t>
+      </w:r>
+      <w:proofErr w:type="gramEnd"/>
+      <w:r>
+        <w:rPr>
+          <w:color w:val="000000" w:themeColor="text1"/>
+        </w:rPr>
+        <w:t xml:space="preserve"> say: test name contains word: </w:t>
+      </w:r>
+      <w:proofErr w:type="gramStart"/>
+      <w:r>
+        <w:rPr>
+          <w:b/>
+          <w:bCs/>
+          <w:color w:val="000000" w:themeColor="text1"/>
+        </w:rPr>
+        <w:t>Missing</w:t>
+      </w:r>
+      <w:r>
+        <w:rPr>
+          <w:color w:val="000000" w:themeColor="text1"/>
+        </w:rPr>
+        <w:t xml:space="preserve"> </w:t>
+      </w:r>
+      <w:r>
+        <w:rPr>
+          <w:color w:val="000000" w:themeColor="text1"/>
+        </w:rPr>
+        <w:t xml:space="preserve"> and</w:t>
+      </w:r>
+      <w:proofErr w:type="gramEnd"/>
+      <w:r>
+        <w:rPr>
+          <w:color w:val="000000" w:themeColor="text1"/>
+        </w:rPr>
+        <w:t xml:space="preserve"> the word: </w:t>
+      </w:r>
+      <w:r>
+        <w:rPr>
+          <w:b/>
+          <w:bCs/>
+          <w:color w:val="000000" w:themeColor="text1"/>
+        </w:rPr>
+        <w:t>tittle</w:t>
+      </w:r>
+    </w:p>
+    <w:p>
+      <w:pPr>
+        <w:rPr>
+          <w:color w:val="000000" w:themeColor="text1"/>
+        </w:rPr>
+      </w:pPr>
+      <w:proofErr w:type="spellStart"/>
+      <w:r>
+        <w:rPr>
+          <w:b/>
+          <w:bCs/>
+          <w:color w:val="000000" w:themeColor="text1"/>
+        </w:rPr>
+        <w:t>pytest</w:t>
+      </w:r>
+      <w:proofErr w:type="spellEnd"/>
+      <w:r>
+        <w:rPr>
+          <w:color w:val="000000" w:themeColor="text1"/>
+        </w:rPr>
+        <w:t xml:space="preserve"> </w:t>
+      </w:r>
+      <w:proofErr w:type="gramStart"/>
+      <w:r>
+        <w:rPr>
+          <w:color w:val="000000" w:themeColor="text1"/>
+        </w:rPr>
+        <w:t>test/test_mcp_tools.py::</w:t>
+      </w:r>
+      <w:proofErr w:type="gramEnd"/>
+      <w:r>
+        <w:rPr>
+          <w:color w:val="000000" w:themeColor="text1"/>
+        </w:rPr>
+        <w:t xml:space="preserve">test_create_google_calendar_event_tool_parameterized </w:t>
+      </w:r>
+      <w:r>
+        <w:rPr>
+          <w:b/>
+          <w:bCs/>
+          <w:color w:val="000000" w:themeColor="text1"/>
+          <w:highlight w:val="yellow"/>
+        </w:rPr>
+        <w:t>-k</w:t>
+      </w:r>
+      <w:r>
+        <w:rPr>
+          <w:color w:val="000000" w:themeColor="text1"/>
+        </w:rPr>
+        <w:t xml:space="preserve"> </w:t>
+      </w:r>
+      <w:r>
+        <w:rPr>
+          <w:b/>
+          <w:bCs/>
+          <w:color w:val="000000" w:themeColor="text1"/>
+        </w:rPr>
+        <w:t>"Missing and title</w:t>
+      </w:r>
+      <w:proofErr w:type="gramStart"/>
+      <w:r>
+        <w:rPr>
+          <w:b/>
+          <w:bCs/>
+          <w:color w:val="000000" w:themeColor="text1"/>
+        </w:rPr>
+        <w:t>"</w:t>
+      </w:r>
+      <w:r>
+        <w:rPr>
+          <w:color w:val="000000" w:themeColor="text1"/>
+        </w:rPr>
+        <w:t xml:space="preserve">  -</w:t>
+      </w:r>
+      <w:proofErr w:type="gramEnd"/>
+      <w:r>
+        <w:rPr>
+          <w:color w:val="000000" w:themeColor="text1"/>
+        </w:rPr>
+        <w:t>v --</w:t>
+      </w:r>
+      <w:proofErr w:type="spellStart"/>
+      <w:r>
+        <w:rPr>
+          <w:b/>
+          <w:bCs/>
+          <w:color w:val="000000" w:themeColor="text1"/>
+        </w:rPr>
+        <w:t>asyncio</w:t>
+      </w:r>
+      <w:proofErr w:type="spellEnd"/>
+      <w:r>
+        <w:rPr>
+          <w:b/>
+          <w:bCs/>
+          <w:color w:val="000000" w:themeColor="text1"/>
+        </w:rPr>
+        <w:t>-mode=auto</w:t>
+      </w:r>
+      <w:r>
+        <w:rPr>
+          <w:color w:val="000000" w:themeColor="text1"/>
+        </w:rPr>
+        <w:t xml:space="preserve"> </w:t>
+      </w:r>
+    </w:p>
+    <w:p>
+      <w:pPr>
+        <w:pStyle w:val="ListParagraph"/>
+        <w:numPr>
+          <w:ilvl w:val="1"/>
+          <w:numId w:val="5"/>
+        </w:numPr>
+        <w:rPr>
+          <w:color w:val="000000" w:themeColor="text1"/>
+        </w:rPr>
+      </w:pPr>
+      <w:r>
+        <w:rPr>
+          <w:b/>
+          <w:bCs/>
+          <w:color w:val="EE0000"/>
+        </w:rPr>
+        <w:t xml:space="preserve">ADD </w:t>
+      </w:r>
+      <w:r>
+        <w:rPr>
+          <w:b/>
+          <w:bCs/>
+          <w:color w:val="000000" w:themeColor="text1"/>
+        </w:rPr>
+        <w:t xml:space="preserve">Explanation about </w:t>
+      </w:r>
+      <w:r>
+        <w:rPr>
+          <w:color w:val="000000" w:themeColor="text1"/>
+        </w:rPr>
+        <w:t>parameterized</w:t>
+      </w:r>
+      <w:r>
+        <w:rPr>
+          <w:color w:val="000000" w:themeColor="text1"/>
+        </w:rPr>
+        <w:t xml:space="preserve"> way to generate test data for the test, in simple words it </w:t>
+      </w:r>
+      <w:proofErr w:type="gramStart"/>
+      <w:r>
+        <w:rPr>
+          <w:color w:val="000000" w:themeColor="text1"/>
+        </w:rPr>
+        <w:t>means:</w:t>
+      </w:r>
+      <w:proofErr w:type="gramEnd"/>
+      <w:r>
+        <w:rPr>
+          <w:color w:val="000000" w:themeColor="text1"/>
+        </w:rPr>
+        <w:t xml:space="preserve"> same code runs each time different test data. </w:t>
       </w:r>
     </w:p>
     <w:p>
@@ -5505,7 +6580,6 @@
   <w:style w:type="character" w:default="1" w:styleId="DefaultParagraphFont">
     <w:name w:val="Default Paragraph Font"/>
     <w:uiPriority w:val="1"/>
-    <w:semiHidden/>
     <w:unhideWhenUsed/>
   </w:style>
   <w:style w:type="table" w:default="1" w:styleId="TableNormal">
@@ -5842,6 +6916,36 @@
       <w:shd w:val="clear" w:color="auto" w:fill="E1DFDD"/>
     </w:rPr>
   </w:style>
+  <w:style w:type="paragraph" w:styleId="HTMLPreformatted">
+    <w:name w:val="HTML Preformatted"/>
+    <w:basedOn w:val="Normal"/>
+    <w:link w:val="HTMLPreformattedChar"/>
+    <w:uiPriority w:val="99"/>
+    <w:semiHidden/>
+    <w:unhideWhenUsed/>
+    <w:rsid w:val="00D81BC0"/>
+    <w:pPr>
+      <w:spacing w:after="0" w:line="240" w:lineRule="auto"/>
+    </w:pPr>
+    <w:rPr>
+      <w:rFonts w:ascii="Consolas" w:hAnsi="Consolas"/>
+      <w:sz w:val="20"/>
+      <w:szCs w:val="20"/>
+    </w:rPr>
+  </w:style>
+  <w:style w:type="character" w:customStyle="1" w:styleId="HTMLPreformattedChar">
+    <w:name w:val="HTML Preformatted Char"/>
+    <w:basedOn w:val="DefaultParagraphFont"/>
+    <w:link w:val="HTMLPreformatted"/>
+    <w:uiPriority w:val="99"/>
+    <w:semiHidden/>
+    <w:rsid w:val="00D81BC0"/>
+    <w:rPr>
+      <w:rFonts w:ascii="Consolas" w:hAnsi="Consolas"/>
+      <w:sz w:val="20"/>
+      <w:szCs w:val="20"/>
+    </w:rPr>
+  </w:style>
 </w:styles>
 </file>
 

</xml_diff>